<commit_message>
analyzing the first data set, yay
</commit_message>
<xml_diff>
--- a/data/random_no_regrow/analysis/median_survival/report_median_survival.docx
+++ b/data/random_no_regrow/analysis/median_survival/report_median_survival.docx
@@ -64,7 +64,7 @@
     </w:p>
     <w:p>
       <w:r>
-        <w:t>Summary of how long random wiring variants survive in the experimental environment. We measure survival time in simulation ticks and compare the mean and median lifetimes across all 1000 variants to identify which wiring patterns lead to longer survival. The percentile analysis identifies the successful variants with median survival in the top 10% and the least successful variants with median survival in the bottom 10%, which are used for detailed comparisons in subsequent sections.</w:t>
+        <w:t>Summary of how long random wiring variants survive in the experimental environment. We measure survival time in simulation ticks across all 1000 variants to identify which wiring patterns lead to longer survival. We identify successful and unsuccessful variants using range-based thresholds: success is defined as achieving in the top 10% of the achievable performance range. This approach captures true performance excellence even if achieved only by a small number of variants and is used for detailed comparisons in subsequent sections.</w:t>
       </w:r>
     </w:p>
     <w:p>
@@ -73,6 +73,11 @@
       </w:pPr>
       <w:r>
         <w:t>Overall Descriptive Statistics (Across All Variants):</w:t>
+      </w:r>
+    </w:p>
+    <w:p>
+      <w:r>
+        <w:t xml:space="preserve">Summary statistics computed across individual lifetime measurements from all 1000 variants and 100 runs per variant. </w:t>
       </w:r>
     </w:p>
     <w:tbl>
@@ -92,7 +97,7 @@
           </w:tcPr>
           <w:p>
             <w:r>
-              <w:t>Metric</w:t>
+              <w:t>Statistic</w:t>
             </w:r>
           </w:p>
         </w:tc>
@@ -114,7 +119,7 @@
           </w:tcPr>
           <w:p>
             <w:r>
-              <w:t>Mean survival across variants (ticks)</w:t>
+              <w:t>Mean</w:t>
             </w:r>
           </w:p>
         </w:tc>
@@ -124,7 +129,7 @@
           </w:tcPr>
           <w:p>
             <w:r>
-              <w:t>33.9</w:t>
+              <w:t>33.93 ticks</w:t>
             </w:r>
           </w:p>
         </w:tc>
@@ -136,7 +141,7 @@
           </w:tcPr>
           <w:p>
             <w:r>
-              <w:t>Std Dev across variants</w:t>
+              <w:t>Median</w:t>
             </w:r>
           </w:p>
         </w:tc>
@@ -146,7 +151,7 @@
           </w:tcPr>
           <w:p>
             <w:r>
-              <w:t>14.9</w:t>
+              <w:t>28.00 ticks</w:t>
             </w:r>
           </w:p>
         </w:tc>
@@ -158,7 +163,7 @@
           </w:tcPr>
           <w:p>
             <w:r>
-              <w:t>Min variant mean</w:t>
+              <w:t>Std Dev</w:t>
             </w:r>
           </w:p>
         </w:tc>
@@ -168,7 +173,7 @@
           </w:tcPr>
           <w:p>
             <w:r>
-              <w:t>16.0</w:t>
+              <w:t>26.85 ticks</w:t>
             </w:r>
           </w:p>
         </w:tc>
@@ -180,7 +185,7 @@
           </w:tcPr>
           <w:p>
             <w:r>
-              <w:t>Max variant mean</w:t>
+              <w:t>Min</w:t>
             </w:r>
           </w:p>
         </w:tc>
@@ -190,7 +195,227 @@
           </w:tcPr>
           <w:p>
             <w:r>
-              <w:t>135.7</w:t>
+              <w:t>16.00 ticks</w:t>
+            </w:r>
+          </w:p>
+        </w:tc>
+      </w:tr>
+      <w:tr>
+        <w:tc>
+          <w:tcPr>
+            <w:tcW w:type="dxa" w:w="4320"/>
+          </w:tcPr>
+          <w:p>
+            <w:r>
+              <w:t>Max</w:t>
+            </w:r>
+          </w:p>
+        </w:tc>
+        <w:tc>
+          <w:tcPr>
+            <w:tcW w:type="dxa" w:w="4320"/>
+          </w:tcPr>
+          <w:p>
+            <w:r>
+              <w:t>795.00 ticks</w:t>
+            </w:r>
+          </w:p>
+        </w:tc>
+      </w:tr>
+      <w:tr>
+        <w:tc>
+          <w:tcPr>
+            <w:tcW w:type="dxa" w:w="4320"/>
+          </w:tcPr>
+          <w:p>
+            <w:r>
+              <w:t>Range</w:t>
+            </w:r>
+          </w:p>
+        </w:tc>
+        <w:tc>
+          <w:tcPr>
+            <w:tcW w:type="dxa" w:w="4320"/>
+          </w:tcPr>
+          <w:p>
+            <w:r>
+              <w:t>779.00 ticks</w:t>
+            </w:r>
+          </w:p>
+        </w:tc>
+      </w:tr>
+      <w:tr>
+        <w:tc>
+          <w:tcPr>
+            <w:tcW w:type="dxa" w:w="4320"/>
+          </w:tcPr>
+          <w:p>
+            <w:r>
+              <w:t>IQR (25th-75th percentile)</w:t>
+            </w:r>
+          </w:p>
+        </w:tc>
+        <w:tc>
+          <w:tcPr>
+            <w:tcW w:type="dxa" w:w="4320"/>
+          </w:tcPr>
+          <w:p>
+            <w:r>
+              <w:t>19.00 ticks</w:t>
+            </w:r>
+          </w:p>
+        </w:tc>
+      </w:tr>
+      <w:tr>
+        <w:tc>
+          <w:tcPr>
+            <w:tcW w:type="dxa" w:w="4320"/>
+          </w:tcPr>
+          <w:p>
+            <w:r>
+              <w:t>5th Percentile</w:t>
+            </w:r>
+          </w:p>
+        </w:tc>
+        <w:tc>
+          <w:tcPr>
+            <w:tcW w:type="dxa" w:w="4320"/>
+          </w:tcPr>
+          <w:p>
+            <w:r>
+              <w:t>16.00 ticks</w:t>
+            </w:r>
+          </w:p>
+        </w:tc>
+      </w:tr>
+      <w:tr>
+        <w:tc>
+          <w:tcPr>
+            <w:tcW w:type="dxa" w:w="4320"/>
+          </w:tcPr>
+          <w:p>
+            <w:r>
+              <w:t>25th Percentile</w:t>
+            </w:r>
+          </w:p>
+        </w:tc>
+        <w:tc>
+          <w:tcPr>
+            <w:tcW w:type="dxa" w:w="4320"/>
+          </w:tcPr>
+          <w:p>
+            <w:r>
+              <w:t>18.00 ticks</w:t>
+            </w:r>
+          </w:p>
+        </w:tc>
+      </w:tr>
+      <w:tr>
+        <w:tc>
+          <w:tcPr>
+            <w:tcW w:type="dxa" w:w="4320"/>
+          </w:tcPr>
+          <w:p>
+            <w:r>
+              <w:t>75th Percentile</w:t>
+            </w:r>
+          </w:p>
+        </w:tc>
+        <w:tc>
+          <w:tcPr>
+            <w:tcW w:type="dxa" w:w="4320"/>
+          </w:tcPr>
+          <w:p>
+            <w:r>
+              <w:t>37.00 ticks</w:t>
+            </w:r>
+          </w:p>
+        </w:tc>
+      </w:tr>
+      <w:tr>
+        <w:tc>
+          <w:tcPr>
+            <w:tcW w:type="dxa" w:w="4320"/>
+          </w:tcPr>
+          <w:p>
+            <w:r>
+              <w:t>95th Percentile</w:t>
+            </w:r>
+          </w:p>
+        </w:tc>
+        <w:tc>
+          <w:tcPr>
+            <w:tcW w:type="dxa" w:w="4320"/>
+          </w:tcPr>
+          <w:p>
+            <w:r>
+              <w:t>80.00 ticks</w:t>
+            </w:r>
+          </w:p>
+        </w:tc>
+      </w:tr>
+      <w:tr>
+        <w:tc>
+          <w:tcPr>
+            <w:tcW w:type="dxa" w:w="4320"/>
+          </w:tcPr>
+          <w:p>
+            <w:r>
+              <w:t>Skewness</w:t>
+            </w:r>
+          </w:p>
+        </w:tc>
+        <w:tc>
+          <w:tcPr>
+            <w:tcW w:type="dxa" w:w="4320"/>
+          </w:tcPr>
+          <w:p>
+            <w:r>
+              <w:t>5.085</w:t>
+            </w:r>
+          </w:p>
+        </w:tc>
+      </w:tr>
+      <w:tr>
+        <w:tc>
+          <w:tcPr>
+            <w:tcW w:type="dxa" w:w="4320"/>
+          </w:tcPr>
+          <w:p>
+            <w:r>
+              <w:t>Kurtosis (excess)</w:t>
+            </w:r>
+          </w:p>
+        </w:tc>
+        <w:tc>
+          <w:tcPr>
+            <w:tcW w:type="dxa" w:w="4320"/>
+          </w:tcPr>
+          <w:p>
+            <w:r>
+              <w:t>54.580</w:t>
+            </w:r>
+          </w:p>
+        </w:tc>
+      </w:tr>
+      <w:tr>
+        <w:tc>
+          <w:tcPr>
+            <w:tcW w:type="dxa" w:w="4320"/>
+          </w:tcPr>
+          <w:p>
+            <w:r>
+              <w:t>Coefficient of Variation</w:t>
+            </w:r>
+          </w:p>
+        </w:tc>
+        <w:tc>
+          <w:tcPr>
+            <w:tcW w:type="dxa" w:w="4320"/>
+          </w:tcPr>
+          <w:p>
+            <w:r>
+              <w:t>79.14 %</w:t>
             </w:r>
           </w:p>
         </w:tc>
@@ -201,7 +426,12 @@
         <w:pStyle w:val="Heading3"/>
       </w:pPr>
       <w:r>
-        <w:t>Percentile Analysis:</w:t>
+        <w:t>Range-Based Performance Grouping:</w:t>
+      </w:r>
+    </w:p>
+    <w:p>
+      <w:r>
+        <w:t>Success is measured based on median survival across 100 runs with different randomizer seeds. The 1000 different wiring variants are split into successful and unsuccessful groups based on their performance. The achievable range of median liefetimes is split into percentiles. Variants in the 'successful' group had median lifetimes in the top 10% of that range, while variants in the 'unsuccessful' group had median lifetimes in the bottom 10% of that range. This approach respects natural performance gaps and identifies only the variants that truly solve the task well regardless of the number of variants that achieve this.</w:t>
       </w:r>
     </w:p>
     <w:tbl>
@@ -243,7 +473,7 @@
           </w:tcPr>
           <w:p>
             <w:r>
-              <w:t>90th percentile threshold (Successful)</w:t>
+              <w:t>Successful threshold (top 10% of range)</w:t>
             </w:r>
           </w:p>
         </w:tc>
@@ -253,7 +483,7 @@
           </w:tcPr>
           <w:p>
             <w:r>
-              <w:t>40.6</w:t>
+              <w:t>&gt;= 100.6</w:t>
             </w:r>
           </w:p>
         </w:tc>
@@ -265,7 +495,7 @@
           </w:tcPr>
           <w:p>
             <w:r>
-              <w:t>10th percentile threshold (Unsuccessful)</w:t>
+              <w:t>Unsuccessful threshold (bottom 10% of range)</w:t>
             </w:r>
           </w:p>
         </w:tc>
@@ -275,7 +505,7 @@
           </w:tcPr>
           <w:p>
             <w:r>
-              <w:t>16.0</w:t>
+              <w:t>&lt;= 25.4</w:t>
             </w:r>
           </w:p>
         </w:tc>
@@ -297,7 +527,965 @@
           </w:tcPr>
           <w:p>
             <w:r>
-              <w:t>Successful: 100, Unsuccessful: 153</w:t>
+              <w:t>Successful: 3, Unsuccessful: 394</w:t>
+            </w:r>
+          </w:p>
+        </w:tc>
+      </w:tr>
+    </w:tbl>
+    <w:p>
+      <w:pPr>
+        <w:pStyle w:val="Heading3"/>
+      </w:pPr>
+      <w:r>
+        <w:t>Overall Descriptive Statistics per Variant:</w:t>
+      </w:r>
+    </w:p>
+    <w:p>
+      <w:r>
+        <w:t>Detailed breakdown of descriptive statistics computed across all variants. This table aggregates statistics per variant and then shows the highest, lowest, and average values of the 1000 variants. Heavy-tailed distributions are characterized by skewness and kurtosis; variants with high skewness or kurtosis have more extreme or rare events.</w:t>
+      </w:r>
+    </w:p>
+    <w:tbl>
+      <w:tblPr>
+        <w:tblStyle w:val="LightGrid-Accent1"/>
+        <w:tblW w:type="auto" w:w="0"/>
+        <w:tblLook w:firstColumn="1" w:firstRow="1" w:lastColumn="0" w:lastRow="0" w:noHBand="0" w:noVBand="1" w:val="04A0"/>
+      </w:tblPr>
+      <w:tblGrid>
+        <w:gridCol w:w="1440"/>
+        <w:gridCol w:w="1440"/>
+        <w:gridCol w:w="1440"/>
+        <w:gridCol w:w="1440"/>
+        <w:gridCol w:w="1440"/>
+        <w:gridCol w:w="1440"/>
+      </w:tblGrid>
+      <w:tr>
+        <w:tc>
+          <w:tcPr>
+            <w:tcW w:type="dxa" w:w="1440"/>
+          </w:tcPr>
+          <w:p>
+            <w:r>
+              <w:t>Statistic</w:t>
+            </w:r>
+          </w:p>
+        </w:tc>
+        <w:tc>
+          <w:tcPr>
+            <w:tcW w:type="dxa" w:w="1440"/>
+          </w:tcPr>
+          <w:p>
+            <w:r>
+              <w:t>Highest Value</w:t>
+            </w:r>
+          </w:p>
+        </w:tc>
+        <w:tc>
+          <w:tcPr>
+            <w:tcW w:type="dxa" w:w="1440"/>
+          </w:tcPr>
+          <w:p>
+            <w:r>
+              <w:t>Variant (Highest)</w:t>
+            </w:r>
+          </w:p>
+        </w:tc>
+        <w:tc>
+          <w:tcPr>
+            <w:tcW w:type="dxa" w:w="1440"/>
+          </w:tcPr>
+          <w:p>
+            <w:r>
+              <w:t>Lowest Value</w:t>
+            </w:r>
+          </w:p>
+        </w:tc>
+        <w:tc>
+          <w:tcPr>
+            <w:tcW w:type="dxa" w:w="1440"/>
+          </w:tcPr>
+          <w:p>
+            <w:r>
+              <w:t>Variant (Lowest)</w:t>
+            </w:r>
+          </w:p>
+        </w:tc>
+        <w:tc>
+          <w:tcPr>
+            <w:tcW w:type="dxa" w:w="1440"/>
+          </w:tcPr>
+          <w:p>
+            <w:r>
+              <w:t>Average</w:t>
+            </w:r>
+          </w:p>
+        </w:tc>
+      </w:tr>
+      <w:tr>
+        <w:tc>
+          <w:tcPr>
+            <w:tcW w:type="dxa" w:w="1440"/>
+          </w:tcPr>
+          <w:p>
+            <w:r>
+              <w:t>MEAN</w:t>
+            </w:r>
+          </w:p>
+        </w:tc>
+        <w:tc>
+          <w:tcPr>
+            <w:tcW w:type="dxa" w:w="1440"/>
+          </w:tcPr>
+          <w:p>
+            <w:r>
+              <w:t>135.72</w:t>
+            </w:r>
+          </w:p>
+        </w:tc>
+        <w:tc>
+          <w:tcPr>
+            <w:tcW w:type="dxa" w:w="1440"/>
+          </w:tcPr>
+          <w:p>
+            <w:r>
+              <w:t>variant_819</w:t>
+            </w:r>
+          </w:p>
+        </w:tc>
+        <w:tc>
+          <w:tcPr>
+            <w:tcW w:type="dxa" w:w="1440"/>
+          </w:tcPr>
+          <w:p>
+            <w:r>
+              <w:t>16.00</w:t>
+            </w:r>
+          </w:p>
+        </w:tc>
+        <w:tc>
+          <w:tcPr>
+            <w:tcW w:type="dxa" w:w="1440"/>
+          </w:tcPr>
+          <w:p>
+            <w:r>
+              <w:t>variant_269</w:t>
+            </w:r>
+          </w:p>
+        </w:tc>
+        <w:tc>
+          <w:tcPr>
+            <w:tcW w:type="dxa" w:w="1440"/>
+          </w:tcPr>
+          <w:p>
+            <w:r>
+              <w:t>33.93</w:t>
+            </w:r>
+          </w:p>
+        </w:tc>
+      </w:tr>
+      <w:tr>
+        <w:tc>
+          <w:tcPr>
+            <w:tcW w:type="dxa" w:w="1440"/>
+          </w:tcPr>
+          <w:p>
+            <w:r>
+              <w:t>MEDIAN</w:t>
+            </w:r>
+          </w:p>
+        </w:tc>
+        <w:tc>
+          <w:tcPr>
+            <w:tcW w:type="dxa" w:w="1440"/>
+          </w:tcPr>
+          <w:p>
+            <w:r>
+              <w:t>110.00</w:t>
+            </w:r>
+          </w:p>
+        </w:tc>
+        <w:tc>
+          <w:tcPr>
+            <w:tcW w:type="dxa" w:w="1440"/>
+          </w:tcPr>
+          <w:p>
+            <w:r>
+              <w:t>variant_639</w:t>
+            </w:r>
+          </w:p>
+        </w:tc>
+        <w:tc>
+          <w:tcPr>
+            <w:tcW w:type="dxa" w:w="1440"/>
+          </w:tcPr>
+          <w:p>
+            <w:r>
+              <w:t>16.00</w:t>
+            </w:r>
+          </w:p>
+        </w:tc>
+        <w:tc>
+          <w:tcPr>
+            <w:tcW w:type="dxa" w:w="1440"/>
+          </w:tcPr>
+          <w:p>
+            <w:r>
+              <w:t>variant_105</w:t>
+            </w:r>
+          </w:p>
+        </w:tc>
+        <w:tc>
+          <w:tcPr>
+            <w:tcW w:type="dxa" w:w="1440"/>
+          </w:tcPr>
+          <w:p>
+            <w:r>
+              <w:t>28.56</w:t>
+            </w:r>
+          </w:p>
+        </w:tc>
+      </w:tr>
+      <w:tr>
+        <w:tc>
+          <w:tcPr>
+            <w:tcW w:type="dxa" w:w="1440"/>
+          </w:tcPr>
+          <w:p>
+            <w:r>
+              <w:t>STD</w:t>
+            </w:r>
+          </w:p>
+        </w:tc>
+        <w:tc>
+          <w:tcPr>
+            <w:tcW w:type="dxa" w:w="1440"/>
+          </w:tcPr>
+          <w:p>
+            <w:r>
+              <w:t>127.58</w:t>
+            </w:r>
+          </w:p>
+        </w:tc>
+        <w:tc>
+          <w:tcPr>
+            <w:tcW w:type="dxa" w:w="1440"/>
+          </w:tcPr>
+          <w:p>
+            <w:r>
+              <w:t>variant_195</w:t>
+            </w:r>
+          </w:p>
+        </w:tc>
+        <w:tc>
+          <w:tcPr>
+            <w:tcW w:type="dxa" w:w="1440"/>
+          </w:tcPr>
+          <w:p>
+            <w:r>
+              <w:t>0.00</w:t>
+            </w:r>
+          </w:p>
+        </w:tc>
+        <w:tc>
+          <w:tcPr>
+            <w:tcW w:type="dxa" w:w="1440"/>
+          </w:tcPr>
+          <w:p>
+            <w:r>
+              <w:t>variant_269</w:t>
+            </w:r>
+          </w:p>
+        </w:tc>
+        <w:tc>
+          <w:tcPr>
+            <w:tcW w:type="dxa" w:w="1440"/>
+          </w:tcPr>
+          <w:p>
+            <w:r>
+              <w:t>16.58</w:t>
+            </w:r>
+          </w:p>
+        </w:tc>
+      </w:tr>
+      <w:tr>
+        <w:tc>
+          <w:tcPr>
+            <w:tcW w:type="dxa" w:w="1440"/>
+          </w:tcPr>
+          <w:p>
+            <w:r>
+              <w:t>MIN</w:t>
+            </w:r>
+          </w:p>
+        </w:tc>
+        <w:tc>
+          <w:tcPr>
+            <w:tcW w:type="dxa" w:w="1440"/>
+          </w:tcPr>
+          <w:p>
+            <w:r>
+              <w:t>30.00</w:t>
+            </w:r>
+          </w:p>
+        </w:tc>
+        <w:tc>
+          <w:tcPr>
+            <w:tcW w:type="dxa" w:w="1440"/>
+          </w:tcPr>
+          <w:p>
+            <w:r>
+              <w:t>variant_461</w:t>
+            </w:r>
+          </w:p>
+        </w:tc>
+        <w:tc>
+          <w:tcPr>
+            <w:tcW w:type="dxa" w:w="1440"/>
+          </w:tcPr>
+          <w:p>
+            <w:r>
+              <w:t>16.00</w:t>
+            </w:r>
+          </w:p>
+        </w:tc>
+        <w:tc>
+          <w:tcPr>
+            <w:tcW w:type="dxa" w:w="1440"/>
+          </w:tcPr>
+          <w:p>
+            <w:r>
+              <w:t>variant_02</w:t>
+            </w:r>
+          </w:p>
+        </w:tc>
+        <w:tc>
+          <w:tcPr>
+            <w:tcW w:type="dxa" w:w="1440"/>
+          </w:tcPr>
+          <w:p>
+            <w:r>
+              <w:t>17.89</w:t>
+            </w:r>
+          </w:p>
+        </w:tc>
+      </w:tr>
+      <w:tr>
+        <w:tc>
+          <w:tcPr>
+            <w:tcW w:type="dxa" w:w="1440"/>
+          </w:tcPr>
+          <w:p>
+            <w:r>
+              <w:t>MAX</w:t>
+            </w:r>
+          </w:p>
+        </w:tc>
+        <w:tc>
+          <w:tcPr>
+            <w:tcW w:type="dxa" w:w="1440"/>
+          </w:tcPr>
+          <w:p>
+            <w:r>
+              <w:t>795.00</w:t>
+            </w:r>
+          </w:p>
+        </w:tc>
+        <w:tc>
+          <w:tcPr>
+            <w:tcW w:type="dxa" w:w="1440"/>
+          </w:tcPr>
+          <w:p>
+            <w:r>
+              <w:t>variant_195</w:t>
+            </w:r>
+          </w:p>
+        </w:tc>
+        <w:tc>
+          <w:tcPr>
+            <w:tcW w:type="dxa" w:w="1440"/>
+          </w:tcPr>
+          <w:p>
+            <w:r>
+              <w:t>16.00</w:t>
+            </w:r>
+          </w:p>
+        </w:tc>
+        <w:tc>
+          <w:tcPr>
+            <w:tcW w:type="dxa" w:w="1440"/>
+          </w:tcPr>
+          <w:p>
+            <w:r>
+              <w:t>variant_269</w:t>
+            </w:r>
+          </w:p>
+        </w:tc>
+        <w:tc>
+          <w:tcPr>
+            <w:tcW w:type="dxa" w:w="1440"/>
+          </w:tcPr>
+          <w:p>
+            <w:r>
+              <w:t>103.67</w:t>
+            </w:r>
+          </w:p>
+        </w:tc>
+      </w:tr>
+      <w:tr>
+        <w:tc>
+          <w:tcPr>
+            <w:tcW w:type="dxa" w:w="1440"/>
+          </w:tcPr>
+          <w:p>
+            <w:r>
+              <w:t>RANGE</w:t>
+            </w:r>
+          </w:p>
+        </w:tc>
+        <w:tc>
+          <w:tcPr>
+            <w:tcW w:type="dxa" w:w="1440"/>
+          </w:tcPr>
+          <w:p>
+            <w:r>
+              <w:t>774.00</w:t>
+            </w:r>
+          </w:p>
+        </w:tc>
+        <w:tc>
+          <w:tcPr>
+            <w:tcW w:type="dxa" w:w="1440"/>
+          </w:tcPr>
+          <w:p>
+            <w:r>
+              <w:t>variant_195</w:t>
+            </w:r>
+          </w:p>
+        </w:tc>
+        <w:tc>
+          <w:tcPr>
+            <w:tcW w:type="dxa" w:w="1440"/>
+          </w:tcPr>
+          <w:p>
+            <w:r>
+              <w:t>0.00</w:t>
+            </w:r>
+          </w:p>
+        </w:tc>
+        <w:tc>
+          <w:tcPr>
+            <w:tcW w:type="dxa" w:w="1440"/>
+          </w:tcPr>
+          <w:p>
+            <w:r>
+              <w:t>variant_269</w:t>
+            </w:r>
+          </w:p>
+        </w:tc>
+        <w:tc>
+          <w:tcPr>
+            <w:tcW w:type="dxa" w:w="1440"/>
+          </w:tcPr>
+          <w:p>
+            <w:r>
+              <w:t>85.78</w:t>
+            </w:r>
+          </w:p>
+        </w:tc>
+      </w:tr>
+      <w:tr>
+        <w:tc>
+          <w:tcPr>
+            <w:tcW w:type="dxa" w:w="1440"/>
+          </w:tcPr>
+          <w:p>
+            <w:r>
+              <w:t>IQR</w:t>
+            </w:r>
+          </w:p>
+        </w:tc>
+        <w:tc>
+          <w:tcPr>
+            <w:tcW w:type="dxa" w:w="1440"/>
+          </w:tcPr>
+          <w:p>
+            <w:r>
+              <w:t>140.00</w:t>
+            </w:r>
+          </w:p>
+        </w:tc>
+        <w:tc>
+          <w:tcPr>
+            <w:tcW w:type="dxa" w:w="1440"/>
+          </w:tcPr>
+          <w:p>
+            <w:r>
+              <w:t>variant_177</w:t>
+            </w:r>
+          </w:p>
+        </w:tc>
+        <w:tc>
+          <w:tcPr>
+            <w:tcW w:type="dxa" w:w="1440"/>
+          </w:tcPr>
+          <w:p>
+            <w:r>
+              <w:t>0.00</w:t>
+            </w:r>
+          </w:p>
+        </w:tc>
+        <w:tc>
+          <w:tcPr>
+            <w:tcW w:type="dxa" w:w="1440"/>
+          </w:tcPr>
+          <w:p>
+            <w:r>
+              <w:t>variant_107</w:t>
+            </w:r>
+          </w:p>
+        </w:tc>
+        <w:tc>
+          <w:tcPr>
+            <w:tcW w:type="dxa" w:w="1440"/>
+          </w:tcPr>
+          <w:p>
+            <w:r>
+              <w:t>17.76</w:t>
+            </w:r>
+          </w:p>
+        </w:tc>
+      </w:tr>
+      <w:tr>
+        <w:tc>
+          <w:tcPr>
+            <w:tcW w:type="dxa" w:w="1440"/>
+          </w:tcPr>
+          <w:p>
+            <w:r>
+              <w:t>P5</w:t>
+            </w:r>
+          </w:p>
+        </w:tc>
+        <w:tc>
+          <w:tcPr>
+            <w:tcW w:type="dxa" w:w="1440"/>
+          </w:tcPr>
+          <w:p>
+            <w:r>
+              <w:t>33.95</w:t>
+            </w:r>
+          </w:p>
+        </w:tc>
+        <w:tc>
+          <w:tcPr>
+            <w:tcW w:type="dxa" w:w="1440"/>
+          </w:tcPr>
+          <w:p>
+            <w:r>
+              <w:t>variant_843</w:t>
+            </w:r>
+          </w:p>
+        </w:tc>
+        <w:tc>
+          <w:tcPr>
+            <w:tcW w:type="dxa" w:w="1440"/>
+          </w:tcPr>
+          <w:p>
+            <w:r>
+              <w:t>16.00</w:t>
+            </w:r>
+          </w:p>
+        </w:tc>
+        <w:tc>
+          <w:tcPr>
+            <w:tcW w:type="dxa" w:w="1440"/>
+          </w:tcPr>
+          <w:p>
+            <w:r>
+              <w:t>variant_02</w:t>
+            </w:r>
+          </w:p>
+        </w:tc>
+        <w:tc>
+          <w:tcPr>
+            <w:tcW w:type="dxa" w:w="1440"/>
+          </w:tcPr>
+          <w:p>
+            <w:r>
+              <w:t>19.10</w:t>
+            </w:r>
+          </w:p>
+        </w:tc>
+      </w:tr>
+      <w:tr>
+        <w:tc>
+          <w:tcPr>
+            <w:tcW w:type="dxa" w:w="1440"/>
+          </w:tcPr>
+          <w:p>
+            <w:r>
+              <w:t>P25</w:t>
+            </w:r>
+          </w:p>
+        </w:tc>
+        <w:tc>
+          <w:tcPr>
+            <w:tcW w:type="dxa" w:w="1440"/>
+          </w:tcPr>
+          <w:p>
+            <w:r>
+              <w:t>67.00</w:t>
+            </w:r>
+          </w:p>
+        </w:tc>
+        <w:tc>
+          <w:tcPr>
+            <w:tcW w:type="dxa" w:w="1440"/>
+          </w:tcPr>
+          <w:p>
+            <w:r>
+              <w:t>variant_52</w:t>
+            </w:r>
+          </w:p>
+        </w:tc>
+        <w:tc>
+          <w:tcPr>
+            <w:tcW w:type="dxa" w:w="1440"/>
+          </w:tcPr>
+          <w:p>
+            <w:r>
+              <w:t>16.00</w:t>
+            </w:r>
+          </w:p>
+        </w:tc>
+        <w:tc>
+          <w:tcPr>
+            <w:tcW w:type="dxa" w:w="1440"/>
+          </w:tcPr>
+          <w:p>
+            <w:r>
+              <w:t>variant_09</w:t>
+            </w:r>
+          </w:p>
+        </w:tc>
+        <w:tc>
+          <w:tcPr>
+            <w:tcW w:type="dxa" w:w="1440"/>
+          </w:tcPr>
+          <w:p>
+            <w:r>
+              <w:t>22.32</w:t>
+            </w:r>
+          </w:p>
+        </w:tc>
+      </w:tr>
+      <w:tr>
+        <w:tc>
+          <w:tcPr>
+            <w:tcW w:type="dxa" w:w="1440"/>
+          </w:tcPr>
+          <w:p>
+            <w:r>
+              <w:t>P75</w:t>
+            </w:r>
+          </w:p>
+        </w:tc>
+        <w:tc>
+          <w:tcPr>
+            <w:tcW w:type="dxa" w:w="1440"/>
+          </w:tcPr>
+          <w:p>
+            <w:r>
+              <w:t>175.75</w:t>
+            </w:r>
+          </w:p>
+        </w:tc>
+        <w:tc>
+          <w:tcPr>
+            <w:tcW w:type="dxa" w:w="1440"/>
+          </w:tcPr>
+          <w:p>
+            <w:r>
+              <w:t>variant_819</w:t>
+            </w:r>
+          </w:p>
+        </w:tc>
+        <w:tc>
+          <w:tcPr>
+            <w:tcW w:type="dxa" w:w="1440"/>
+          </w:tcPr>
+          <w:p>
+            <w:r>
+              <w:t>16.00</w:t>
+            </w:r>
+          </w:p>
+        </w:tc>
+        <w:tc>
+          <w:tcPr>
+            <w:tcW w:type="dxa" w:w="1440"/>
+          </w:tcPr>
+          <w:p>
+            <w:r>
+              <w:t>variant_107</w:t>
+            </w:r>
+          </w:p>
+        </w:tc>
+        <w:tc>
+          <w:tcPr>
+            <w:tcW w:type="dxa" w:w="1440"/>
+          </w:tcPr>
+          <w:p>
+            <w:r>
+              <w:t>40.08</w:t>
+            </w:r>
+          </w:p>
+        </w:tc>
+      </w:tr>
+      <w:tr>
+        <w:tc>
+          <w:tcPr>
+            <w:tcW w:type="dxa" w:w="1440"/>
+          </w:tcPr>
+          <w:p>
+            <w:r>
+              <w:t>P95</w:t>
+            </w:r>
+          </w:p>
+        </w:tc>
+        <w:tc>
+          <w:tcPr>
+            <w:tcW w:type="dxa" w:w="1440"/>
+          </w:tcPr>
+          <w:p>
+            <w:r>
+              <w:t>407.85</w:t>
+            </w:r>
+          </w:p>
+        </w:tc>
+        <w:tc>
+          <w:tcPr>
+            <w:tcW w:type="dxa" w:w="1440"/>
+          </w:tcPr>
+          <w:p>
+            <w:r>
+              <w:t>variant_177</w:t>
+            </w:r>
+          </w:p>
+        </w:tc>
+        <w:tc>
+          <w:tcPr>
+            <w:tcW w:type="dxa" w:w="1440"/>
+          </w:tcPr>
+          <w:p>
+            <w:r>
+              <w:t>16.00</w:t>
+            </w:r>
+          </w:p>
+        </w:tc>
+        <w:tc>
+          <w:tcPr>
+            <w:tcW w:type="dxa" w:w="1440"/>
+          </w:tcPr>
+          <w:p>
+            <w:r>
+              <w:t>variant_18</w:t>
+            </w:r>
+          </w:p>
+        </w:tc>
+        <w:tc>
+          <w:tcPr>
+            <w:tcW w:type="dxa" w:w="1440"/>
+          </w:tcPr>
+          <w:p>
+            <w:r>
+              <w:t>65.82</w:t>
+            </w:r>
+          </w:p>
+        </w:tc>
+      </w:tr>
+      <w:tr>
+        <w:tc>
+          <w:tcPr>
+            <w:tcW w:type="dxa" w:w="1440"/>
+          </w:tcPr>
+          <w:p>
+            <w:r>
+              <w:t>SKEWNESS</w:t>
+            </w:r>
+          </w:p>
+        </w:tc>
+        <w:tc>
+          <w:tcPr>
+            <w:tcW w:type="dxa" w:w="1440"/>
+          </w:tcPr>
+          <w:p>
+            <w:r>
+              <w:t>9.85</w:t>
+            </w:r>
+          </w:p>
+        </w:tc>
+        <w:tc>
+          <w:tcPr>
+            <w:tcW w:type="dxa" w:w="1440"/>
+          </w:tcPr>
+          <w:p>
+            <w:r>
+              <w:t>variant_597</w:t>
+            </w:r>
+          </w:p>
+        </w:tc>
+        <w:tc>
+          <w:tcPr>
+            <w:tcW w:type="dxa" w:w="1440"/>
+          </w:tcPr>
+          <w:p>
+            <w:r>
+              <w:t>-1.56</w:t>
+            </w:r>
+          </w:p>
+        </w:tc>
+        <w:tc>
+          <w:tcPr>
+            <w:tcW w:type="dxa" w:w="1440"/>
+          </w:tcPr>
+          <w:p>
+            <w:r>
+              <w:t>variant_903</w:t>
+            </w:r>
+          </w:p>
+        </w:tc>
+        <w:tc>
+          <w:tcPr>
+            <w:tcW w:type="dxa" w:w="1440"/>
+          </w:tcPr>
+          <w:p>
+            <w:r>
+              <w:t>2.18</w:t>
+            </w:r>
+          </w:p>
+        </w:tc>
+      </w:tr>
+      <w:tr>
+        <w:tc>
+          <w:tcPr>
+            <w:tcW w:type="dxa" w:w="1440"/>
+          </w:tcPr>
+          <w:p>
+            <w:r>
+              <w:t>KURTOSIS</w:t>
+            </w:r>
+          </w:p>
+        </w:tc>
+        <w:tc>
+          <w:tcPr>
+            <w:tcW w:type="dxa" w:w="1440"/>
+          </w:tcPr>
+          <w:p>
+            <w:r>
+              <w:t>95.01</w:t>
+            </w:r>
+          </w:p>
+        </w:tc>
+        <w:tc>
+          <w:tcPr>
+            <w:tcW w:type="dxa" w:w="1440"/>
+          </w:tcPr>
+          <w:p>
+            <w:r>
+              <w:t>variant_567</w:t>
+            </w:r>
+          </w:p>
+        </w:tc>
+        <w:tc>
+          <w:tcPr>
+            <w:tcW w:type="dxa" w:w="1440"/>
+          </w:tcPr>
+          <w:p>
+            <w:r>
+              <w:t>-1.50</w:t>
+            </w:r>
+          </w:p>
+        </w:tc>
+        <w:tc>
+          <w:tcPr>
+            <w:tcW w:type="dxa" w:w="1440"/>
+          </w:tcPr>
+          <w:p>
+            <w:r>
+              <w:t>variant_884</w:t>
+            </w:r>
+          </w:p>
+        </w:tc>
+        <w:tc>
+          <w:tcPr>
+            <w:tcW w:type="dxa" w:w="1440"/>
+          </w:tcPr>
+          <w:p>
+            <w:r>
+              <w:t>7.53</w:t>
+            </w:r>
+          </w:p>
+        </w:tc>
+      </w:tr>
+      <w:tr>
+        <w:tc>
+          <w:tcPr>
+            <w:tcW w:type="dxa" w:w="1440"/>
+          </w:tcPr>
+          <w:p>
+            <w:r>
+              <w:t>CV</w:t>
+            </w:r>
+          </w:p>
+        </w:tc>
+        <w:tc>
+          <w:tcPr>
+            <w:tcW w:type="dxa" w:w="1440"/>
+          </w:tcPr>
+          <w:p>
+            <w:r>
+              <w:t>128.73</w:t>
+            </w:r>
+          </w:p>
+        </w:tc>
+        <w:tc>
+          <w:tcPr>
+            <w:tcW w:type="dxa" w:w="1440"/>
+          </w:tcPr>
+          <w:p>
+            <w:r>
+              <w:t>variant_195</w:t>
+            </w:r>
+          </w:p>
+        </w:tc>
+        <w:tc>
+          <w:tcPr>
+            <w:tcW w:type="dxa" w:w="1440"/>
+          </w:tcPr>
+          <w:p>
+            <w:r>
+              <w:t>0.00</w:t>
+            </w:r>
+          </w:p>
+        </w:tc>
+        <w:tc>
+          <w:tcPr>
+            <w:tcW w:type="dxa" w:w="1440"/>
+          </w:tcPr>
+          <w:p>
+            <w:r>
+              <w:t>variant_269</w:t>
+            </w:r>
+          </w:p>
+        </w:tc>
+        <w:tc>
+          <w:tcPr>
+            <w:tcW w:type="dxa" w:w="1440"/>
+          </w:tcPr>
+          <w:p>
+            <w:r>
+              <w:t>43.49</w:t>
             </w:r>
           </w:p>
         </w:tc>
@@ -331,22 +1519,22 @@
     </w:p>
     <w:p>
       <w:r>
-        <w:t>This plot shows the survival curves for all 1000 wiring variants. Variants are color-coded by their performance percentile:</w:t>
+        <w:t>This plot shows the survival curves for all 1000 wiring variants. Variants are color-coded by their performance achievement (range-based thresholds):</w:t>
       </w:r>
     </w:p>
     <w:p>
       <w:r>
-        <w:t xml:space="preserve">  • Green: Top 10% (median survival ≥ 40.6 ticks) — 100 variants</w:t>
+        <w:t xml:space="preserve">  • Green: Top 10% of variants (median survival ≥ 100.6 ticks) — 3 variants</w:t>
       </w:r>
     </w:p>
     <w:p>
       <w:r>
-        <w:t xml:space="preserve">  • Red: Bottom 10% (median survival ≤ 16.0 ticks) — 153 variants</w:t>
+        <w:t xml:space="preserve">  • Red: Bottom 10% of variants (median survival ≤ 25.4 ticks) — 394 variants</w:t>
       </w:r>
     </w:p>
     <w:p>
       <w:r>
-        <w:t xml:space="preserve">  • Gray: Middle 80% (other variants)</w:t>
+        <w:t xml:space="preserve">  • Gray: Middle range (other variants)</w:t>
       </w:r>
     </w:p>
     <w:p>
@@ -419,7 +1607,7 @@
           </w:tcPr>
           <w:p>
             <w:r>
-              <w:t>Successful (Top 10%)</w:t>
+              <w:t>Successful (Top 10% of Variants)</w:t>
             </w:r>
           </w:p>
         </w:tc>
@@ -429,7 +1617,7 @@
           </w:tcPr>
           <w:p>
             <w:r>
-              <w:t>Unsuccessful (Bottom 10%)</w:t>
+              <w:t>Unsuccessful (Bottom 10% of Variants)</w:t>
             </w:r>
           </w:p>
         </w:tc>
@@ -451,7 +1639,7 @@
           </w:tcPr>
           <w:p>
             <w:r>
-              <w:t>10000</w:t>
+              <w:t>300</w:t>
             </w:r>
           </w:p>
         </w:tc>
@@ -461,7 +1649,7 @@
           </w:tcPr>
           <w:p>
             <w:r>
-              <w:t>15300</w:t>
+              <w:t>39400</w:t>
             </w:r>
           </w:p>
         </w:tc>
@@ -483,7 +1671,7 @@
           </w:tcPr>
           <w:p>
             <w:r>
-              <w:t>66.0</w:t>
+              <w:t>123.8</w:t>
             </w:r>
           </w:p>
         </w:tc>
@@ -493,7 +1681,7 @@
           </w:tcPr>
           <w:p>
             <w:r>
-              <w:t>18.4</w:t>
+              <w:t>22.8</w:t>
             </w:r>
           </w:p>
         </w:tc>
@@ -515,7 +1703,7 @@
           </w:tcPr>
           <w:p>
             <w:r>
-              <w:t>52.0</w:t>
+              <w:t>108.0</w:t>
             </w:r>
           </w:p>
         </w:tc>
@@ -525,7 +1713,7 @@
           </w:tcPr>
           <w:p>
             <w:r>
-              <w:t>16.0</w:t>
+              <w:t>17.0</w:t>
             </w:r>
           </w:p>
         </w:tc>
@@ -547,7 +1735,7 @@
           </w:tcPr>
           <w:p>
             <w:r>
-              <w:t>52.7</w:t>
+              <w:t>96.5</w:t>
             </w:r>
           </w:p>
         </w:tc>
@@ -557,7 +1745,7 @@
           </w:tcPr>
           <w:p>
             <w:r>
-              <w:t>6.5</w:t>
+              <w:t>13.2</w:t>
             </w:r>
           </w:p>
         </w:tc>
@@ -611,7 +1799,7 @@
           </w:tcPr>
           <w:p>
             <w:r>
-              <w:t>795.0</w:t>
+              <w:t>645.0</w:t>
             </w:r>
           </w:p>
         </w:tc>
@@ -621,7 +1809,7 @@
           </w:tcPr>
           <w:p>
             <w:r>
-              <w:t>163.0</w:t>
+              <w:t>342.0</w:t>
             </w:r>
           </w:p>
         </w:tc>
@@ -669,7 +1857,42 @@
         <w:pStyle w:val="Heading3"/>
       </w:pPr>
       <w:r>
-        <w:t>Mann-Whitney U Test Results (Random Variants Only):</w:t>
+        <w:t>Variant Group Membership (for debugging/tracking):</w:t>
+      </w:r>
+    </w:p>
+    <w:p>
+      <w:pPr>
+        <w:pStyle w:val="Heading4"/>
+      </w:pPr>
+      <w:r>
+        <w:t>Successful Variants (3 total):</w:t>
+      </w:r>
+    </w:p>
+    <w:p>
+      <w:r>
+        <w:t>variant_468, variant_639, variant_819</w:t>
+      </w:r>
+    </w:p>
+    <w:p>
+      <w:pPr>
+        <w:pStyle w:val="Heading4"/>
+      </w:pPr>
+      <w:r>
+        <w:t>Unsuccessful Variants (394 total):</w:t>
+      </w:r>
+    </w:p>
+    <w:p>
+      <w:r>
+        <w:t>variant_09, variant_100, variant_101, variant_102, variant_103, variant_104, variant_105, variant_107, variant_108, variant_11, variant_111, variant_113, variant_116, variant_119, variant_121, variant_123, variant_124, variant_126, variant_127, variant_129, variant_131, variant_136, variant_138, variant_140, variant_142, variant_146, variant_149, variant_15, variant_154, variant_158, variant_162, variant_163, variant_169, variant_171, variant_178, variant_179, variant_18, variant_180, variant_181, variant_186, variant_187, variant_188, variant_189, variant_19, variant_190, variant_191, variant_196, variant_197, variant_199, variant_20, variant_200, variant_201, variant_209, variant_21, variant_212, variant_218, variant_220, variant_223, variant_225, variant_227, variant_228, variant_233, variant_236, variant_239, variant_241, variant_245, variant_250, variant_254, variant_255, variant_259, variant_262, variant_263, variant_264, variant_267, variant_269, variant_276, variant_278, variant_281, variant_282, variant_288, variant_295, variant_296, variant_297, variant_298, variant_30, variant_300, variant_305, variant_307, variant_311, variant_312, variant_317, variant_318, variant_319, variant_32, variant_323, variant_325, variant_337, variant_34, variant_340, variant_341, variant_342, variant_344, variant_347, variant_349, variant_35, variant_352, variant_353, variant_360, variant_362, variant_363, variant_366, variant_37, variant_371, variant_374, variant_375, variant_376, variant_377, variant_378, variant_38, variant_382, variant_385, variant_387, variant_388, variant_39, variant_391, variant_395, variant_396, variant_403, variant_404, variant_405, variant_406, variant_408, variant_410, variant_412, variant_413, variant_416, variant_417, variant_418, variant_420, variant_426, variant_428, variant_429, variant_430, variant_432, variant_434, variant_436, variant_439, variant_44, variant_441, variant_446, variant_449, variant_452, variant_454, variant_459, variant_46, variant_460, variant_463, variant_465, variant_467, variant_469, variant_471, variant_474, variant_477, variant_480, variant_481, variant_483, variant_487, variant_489, variant_49, variant_496, variant_497, variant_499, variant_50, variant_502, variant_505, variant_507, variant_510, variant_511, variant_513, variant_515, variant_518, variant_519, variant_521, variant_522, variant_525, variant_529, variant_536, variant_538, variant_542, variant_545, variant_546, variant_547, variant_549, variant_55, variant_550, variant_552, variant_554, variant_56, variant_561, variant_563, variant_564, variant_566, variant_567, variant_571, variant_574, variant_575, variant_576, variant_579, variant_58, variant_581, variant_582, variant_583, variant_585, variant_588, variant_590, variant_591, variant_593, variant_594, variant_595, variant_596, variant_597, variant_600, variant_601, variant_605, variant_61, variant_614, variant_617, variant_618, variant_619, variant_621, variant_622, variant_624, variant_626, variant_627, variant_628, variant_63, variant_632, variant_638, variant_641, variant_643, variant_644, variant_648, variant_649, variant_653, variant_654, variant_659, variant_66, variant_661, variant_663, variant_67, variant_673, variant_674, variant_675, variant_676, variant_678, variant_682, variant_684, variant_686, variant_689, variant_69, variant_691, variant_692, variant_696, variant_70, variant_700, variant_704, variant_709, variant_712, variant_714, variant_718, variant_72, variant_720, variant_722, variant_724, variant_726, variant_727, variant_729, variant_732, variant_734, variant_739, variant_74, variant_740, variant_741, variant_742, variant_744, variant_745, variant_746, variant_749, variant_75, variant_751, variant_753, variant_754, variant_755, variant_757, variant_758, variant_759, variant_76, variant_761, variant_762, variant_763, variant_77, variant_771, variant_772, variant_777, variant_778, variant_779, variant_780, variant_782, variant_786, variant_791, variant_793, variant_794, variant_798, variant_80, variant_802, variant_805, variant_806, variant_810, variant_812, variant_813, variant_815, variant_817, variant_818, variant_82, variant_820, variant_823, variant_824, variant_825, variant_826, variant_831, variant_833, variant_837, variant_846, variant_847, variant_848, variant_852, variant_853, variant_856, variant_858, variant_861, variant_865, variant_87, variant_874, variant_877, variant_879, variant_881, variant_883, variant_885, variant_886, variant_887, variant_888, variant_889, variant_89, variant_893, variant_895, variant_898, variant_899, variant_901, variant_906, variant_908, variant_909, variant_912, variant_918, variant_924, variant_929, variant_932, variant_937, variant_94, variant_941, variant_942, variant_947, variant_949, variant_953, variant_954, variant_956, variant_958, variant_965, variant_966, variant_967, variant_971, variant_972, variant_973, variant_974, variant_978, variant_979, variant_982, variant_984, variant_986, variant_987, variant_988, variant_99, variant_992, variant_993, variant_999</w:t>
+      </w:r>
+    </w:p>
+    <w:p/>
+    <w:p>
+      <w:pPr>
+        <w:pStyle w:val="Heading3"/>
+      </w:pPr>
+      <w:r>
+        <w:t>Differences between successful and unsuccessful random variants (Mann-Whitney U):</w:t>
       </w:r>
     </w:p>
     <w:p>
@@ -726,7 +1949,7 @@
           </w:tcPr>
           <w:p>
             <w:r>
-              <w:t>7521299.0000</w:t>
+              <w:t>896630.5000</w:t>
             </w:r>
           </w:p>
         </w:tc>
@@ -748,7 +1971,7 @@
           </w:tcPr>
           <w:p>
             <w:r>
-              <w:t>0.0000e+00</w:t>
+              <w:t>9.7296e-155</w:t>
             </w:r>
           </w:p>
         </w:tc>
@@ -778,7 +2001,7 @@
     </w:p>
     <w:p>
       <w:r>
-        <w:t>For each cardinal direction (North, East, South, West), we calculate the ratio of movement commands to sensory detections. A ratio close to 1.0 indicates tight coupling between sensing and movement (reflexory behavior: the worm moves in response to each sensory detection). Ratios far from 1.0 (either much higher or much lower) indicate decoupling: the worm either moves more without sensing, or senses food but moves selectively. This metric reveals fundamental differences in movement strategy between successful and unsuccessful variants—whether they rely on reflexory sensorimotor coupling or employ a different navigation strategy.</w:t>
+        <w:t>For each cardinal direction (North, East, South, West), we calculate the ratio of movement commands to sensory detections. These are total numbers per run and only give a first overview indication of decision accuracy. A ratio close to 1.0 indicates tight coupling between sensing and movement. Ratios far from 1.0 (either higher or lower) indicate decoupling: movement without sensing, or moving more selectively despite sensing. This metric indicates fundamental differences in movement strategy between successful and unsuccessful variants but differences must be investigated on a tick-by-tick basis.</w:t>
       </w:r>
     </w:p>
     <w:p>
@@ -846,7 +2069,7 @@
           </w:tcPr>
           <w:p>
             <w:r>
-              <w:t>0.997 ± 1.799</w:t>
+              <w:t>1.125 ± 1.792</w:t>
             </w:r>
           </w:p>
         </w:tc>
@@ -856,7 +2079,7 @@
           </w:tcPr>
           <w:p>
             <w:r>
-              <w:t>0.924 ± 1.439</w:t>
+              <w:t>2.221 ± 2.099</w:t>
             </w:r>
           </w:p>
         </w:tc>
@@ -878,7 +2101,7 @@
           </w:tcPr>
           <w:p>
             <w:r>
-              <w:t>1.247 ± 2.014</w:t>
+              <w:t>1.130 ± 1.801</w:t>
             </w:r>
           </w:p>
         </w:tc>
@@ -888,7 +2111,7 @@
           </w:tcPr>
           <w:p>
             <w:r>
-              <w:t>1.050 ± 1.707</w:t>
+              <w:t>0.357 ± 0.386</w:t>
             </w:r>
           </w:p>
         </w:tc>
@@ -910,7 +2133,7 @@
           </w:tcPr>
           <w:p>
             <w:r>
-              <w:t>1.161 ± 1.984</w:t>
+              <w:t>1.100 ± 1.781</w:t>
             </w:r>
           </w:p>
         </w:tc>
@@ -920,7 +2143,7 @@
           </w:tcPr>
           <w:p>
             <w:r>
-              <w:t>1.105 ± 1.654</w:t>
+              <w:t>1.478 ± 1.448</w:t>
             </w:r>
           </w:p>
         </w:tc>
@@ -942,7 +2165,7 @@
           </w:tcPr>
           <w:p>
             <w:r>
-              <w:t>1.326 ± 2.122</w:t>
+              <w:t>1.245 ± 1.943</w:t>
             </w:r>
           </w:p>
         </w:tc>
@@ -952,7 +2175,7 @@
           </w:tcPr>
           <w:p>
             <w:r>
-              <w:t>0.924 ± 1.380</w:t>
+              <w:t>0.876 ± 1.112</w:t>
             </w:r>
           </w:p>
         </w:tc>
@@ -962,7 +2185,7 @@
       <w:r>
         <w:drawing>
           <wp:inline xmlns:a="http://schemas.openxmlformats.org/drawingml/2006/main" xmlns:pic="http://schemas.openxmlformats.org/drawingml/2006/picture">
-            <wp:extent cx="5486400" cy="2707671"/>
+            <wp:extent cx="5486400" cy="2743200"/>
             <wp:docPr id="3" name="Picture 3"/>
             <wp:cNvGraphicFramePr>
               <a:graphicFrameLocks noChangeAspect="1"/>
@@ -983,7 +2206,7 @@
                   <pic:spPr>
                     <a:xfrm>
                       <a:off x="0" y="0"/>
-                      <a:ext cx="5486400" cy="2707671"/>
+                      <a:ext cx="5486400" cy="2743200"/>
                     </a:xfrm>
                     <a:prstGeom prst="rect"/>
                   </pic:spPr>
@@ -1005,7 +2228,7 @@
     </w:p>
     <w:p>
       <w:r>
-        <w:t>Decision accuracy quantifies how often choices are aligned with food source locations. This measures the quality of neural computation, whether the wiring interprets sensory input to direct movement toward food. Higher accuracy indicates more reliable neural circuits. We compare the distribution of accuracy values between successful and unsuccessful variants to determine whether fitness correlates with decision-making precision, or if other factors like movement efficiency play a larger role. Note that moving onto sensed food is a very shortsighted strategy that might not lead to an optimal solution in more complex tasks e.g. with food regrow in previous positions.</w:t>
+        <w:t>Decision accuracy quantifies how often choices are aligned with food source locations. This measures, whether the wiring interprets sensory input to direct movement toward food. Higher accuracy indicates more direct coupling of decisions. We compare the distribution of accuracy values between successful and unsuccessful variants to determine whether fitness correlates with decision-making precision, or if other factors like movement efficiency play a larger role. Note that moving onto sensed food is a very shortsighted strategy that might not lead to an optimal solution in more complex tasks e.g. with food regrow in previous positions.</w:t>
       </w:r>
     </w:p>
     <w:p>
@@ -1073,7 +2296,7 @@
           </w:tcPr>
           <w:p>
             <w:r>
-              <w:t>10000</w:t>
+              <w:t>300</w:t>
             </w:r>
           </w:p>
         </w:tc>
@@ -1083,7 +2306,7 @@
           </w:tcPr>
           <w:p>
             <w:r>
-              <w:t>15300</w:t>
+              <w:t>39400</w:t>
             </w:r>
           </w:p>
         </w:tc>
@@ -1105,7 +2328,7 @@
           </w:tcPr>
           <w:p>
             <w:r>
-              <w:t>0.209</w:t>
+              <w:t>0.250</w:t>
             </w:r>
           </w:p>
         </w:tc>
@@ -1115,7 +2338,7 @@
           </w:tcPr>
           <w:p>
             <w:r>
-              <w:t>0.328</w:t>
+              <w:t>0.296</w:t>
             </w:r>
           </w:p>
         </w:tc>
@@ -1137,7 +2360,7 @@
           </w:tcPr>
           <w:p>
             <w:r>
-              <w:t>0.205</w:t>
+              <w:t>0.251</w:t>
             </w:r>
           </w:p>
         </w:tc>
@@ -1147,7 +2370,7 @@
           </w:tcPr>
           <w:p>
             <w:r>
-              <w:t>0.333</w:t>
+              <w:t>0.286</w:t>
             </w:r>
           </w:p>
         </w:tc>
@@ -1169,7 +2392,7 @@
           </w:tcPr>
           <w:p>
             <w:r>
-              <w:t>0.123</w:t>
+              <w:t>0.092</w:t>
             </w:r>
           </w:p>
         </w:tc>
@@ -1179,7 +2402,7 @@
           </w:tcPr>
           <w:p>
             <w:r>
-              <w:t>0.169</w:t>
+              <w:t>0.168</w:t>
             </w:r>
           </w:p>
         </w:tc>
@@ -1233,7 +2456,7 @@
           </w:tcPr>
           <w:p>
             <w:r>
-              <w:t>1.000</w:t>
+              <w:t>0.750</w:t>
             </w:r>
           </w:p>
         </w:tc>
@@ -1251,7 +2474,7 @@
     </w:tbl>
     <w:p>
       <w:r>
-        <w:t>Mann-Whitney U Test Results:</w:t>
+        <w:t>Differences between successful and unsuccessful random variants (Mann-Whitney U):</w:t>
       </w:r>
     </w:p>
     <w:tbl>
@@ -1303,7 +2526,7 @@
           </w:tcPr>
           <w:p>
             <w:r>
-              <w:t>109603547.5000</w:t>
+              <w:t>6913970.5000</w:t>
             </w:r>
           </w:p>
         </w:tc>
@@ -1325,7 +2548,7 @@
           </w:tcPr>
           <w:p>
             <w:r>
-              <w:t>0.0000e+00</w:t>
+              <w:t>3.7645e-07</w:t>
             </w:r>
           </w:p>
         </w:tc>
@@ -1374,12 +2597,20 @@
         <w:pStyle w:val="Heading2"/>
       </w:pPr>
       <w:r>
-        <w:t>3.3. Decision Details</w:t>
+        <w:t>3.3. Distance travelled</w:t>
       </w:r>
     </w:p>
     <w:p>
       <w:r>
-        <w:t>Decision-making behavior at the level of individual simulation ticks. We track how frequently decisions are made and how this relates to survival. This reveals whether success comes from making more decisions, fewer decisions, or from the quality rather than quantity of decisions.</w:t>
+        <w:t>Distance travelled total and normalized per tick for lifespan differences. We compare movement patterns between successful and unsuccessful variants to understand how spatial exploration versus local exploitation correlates with fitness.</w:t>
+      </w:r>
+    </w:p>
+    <w:p>
+      <w:pPr>
+        <w:pStyle w:val="Heading3"/>
+      </w:pPr>
+      <w:r>
+        <w:t>3.3.1. Distance travelled absolute</w:t>
       </w:r>
     </w:p>
     <w:tbl>
@@ -1410,7 +2641,7 @@
           </w:tcPr>
           <w:p>
             <w:r>
-              <w:t>Successful</w:t>
+              <w:t>Successful (Top 10%)</w:t>
             </w:r>
           </w:p>
         </w:tc>
@@ -1420,7 +2651,7 @@
           </w:tcPr>
           <w:p>
             <w:r>
-              <w:t>Unsuccessful</w:t>
+              <w:t>Unsuccessful (Bottom 10%)</w:t>
             </w:r>
           </w:p>
         </w:tc>
@@ -1432,7 +2663,7 @@
           </w:tcPr>
           <w:p>
             <w:r>
-              <w:t>Mean decisions/tick</w:t>
+              <w:t>Number of runs</w:t>
             </w:r>
           </w:p>
         </w:tc>
@@ -1442,7 +2673,7 @@
           </w:tcPr>
           <w:p>
             <w:r>
-              <w:t>0.506</w:t>
+              <w:t>300</w:t>
             </w:r>
           </w:p>
         </w:tc>
@@ -1452,7 +2683,7 @@
           </w:tcPr>
           <w:p>
             <w:r>
-              <w:t>0.530</w:t>
+              <w:t>39400</w:t>
             </w:r>
           </w:p>
         </w:tc>
@@ -1464,7 +2695,7 @@
           </w:tcPr>
           <w:p>
             <w:r>
-              <w:t>Median decisions/tick</w:t>
+              <w:t>Mean</w:t>
             </w:r>
           </w:p>
         </w:tc>
@@ -1474,7 +2705,7 @@
           </w:tcPr>
           <w:p>
             <w:r>
-              <w:t>0.494</w:t>
+              <w:t>92.823</w:t>
             </w:r>
           </w:p>
         </w:tc>
@@ -1484,7 +2715,7 @@
           </w:tcPr>
           <w:p>
             <w:r>
-              <w:t>0.522</w:t>
+              <w:t>18.183</w:t>
             </w:r>
           </w:p>
         </w:tc>
@@ -1496,7 +2727,7 @@
           </w:tcPr>
           <w:p>
             <w:r>
-              <w:t>Mean total decisions/run</w:t>
+              <w:t>Median</w:t>
             </w:r>
           </w:p>
         </w:tc>
@@ -1506,7 +2737,7 @@
           </w:tcPr>
           <w:p>
             <w:r>
-              <w:t>33.0</w:t>
+              <w:t>80.000</w:t>
             </w:r>
           </w:p>
         </w:tc>
@@ -1516,7 +2747,103 @@
           </w:tcPr>
           <w:p>
             <w:r>
-              <w:t>9.7</w:t>
+              <w:t>15.000</w:t>
+            </w:r>
+          </w:p>
+        </w:tc>
+      </w:tr>
+      <w:tr>
+        <w:tc>
+          <w:tcPr>
+            <w:tcW w:type="dxa" w:w="2880"/>
+          </w:tcPr>
+          <w:p>
+            <w:r>
+              <w:t>Std Dev</w:t>
+            </w:r>
+          </w:p>
+        </w:tc>
+        <w:tc>
+          <w:tcPr>
+            <w:tcW w:type="dxa" w:w="2880"/>
+          </w:tcPr>
+          <w:p>
+            <w:r>
+              <w:t>74.460</w:t>
+            </w:r>
+          </w:p>
+        </w:tc>
+        <w:tc>
+          <w:tcPr>
+            <w:tcW w:type="dxa" w:w="2880"/>
+          </w:tcPr>
+          <w:p>
+            <w:r>
+              <w:t>9.525</w:t>
+            </w:r>
+          </w:p>
+        </w:tc>
+      </w:tr>
+      <w:tr>
+        <w:tc>
+          <w:tcPr>
+            <w:tcW w:type="dxa" w:w="2880"/>
+          </w:tcPr>
+          <w:p>
+            <w:r>
+              <w:t>Min</w:t>
+            </w:r>
+          </w:p>
+        </w:tc>
+        <w:tc>
+          <w:tcPr>
+            <w:tcW w:type="dxa" w:w="2880"/>
+          </w:tcPr>
+          <w:p>
+            <w:r>
+              <w:t>8.000</w:t>
+            </w:r>
+          </w:p>
+        </w:tc>
+        <w:tc>
+          <w:tcPr>
+            <w:tcW w:type="dxa" w:w="2880"/>
+          </w:tcPr>
+          <w:p>
+            <w:r>
+              <w:t>0.000</w:t>
+            </w:r>
+          </w:p>
+        </w:tc>
+      </w:tr>
+      <w:tr>
+        <w:tc>
+          <w:tcPr>
+            <w:tcW w:type="dxa" w:w="2880"/>
+          </w:tcPr>
+          <w:p>
+            <w:r>
+              <w:t>Max</w:t>
+            </w:r>
+          </w:p>
+        </w:tc>
+        <w:tc>
+          <w:tcPr>
+            <w:tcW w:type="dxa" w:w="2880"/>
+          </w:tcPr>
+          <w:p>
+            <w:r>
+              <w:t>525.000</w:t>
+            </w:r>
+          </w:p>
+        </w:tc>
+        <w:tc>
+          <w:tcPr>
+            <w:tcW w:type="dxa" w:w="2880"/>
+          </w:tcPr>
+          <w:p>
+            <w:r>
+              <w:t>194.000</w:t>
             </w:r>
           </w:p>
         </w:tc>
@@ -1524,9 +2851,92 @@
     </w:tbl>
     <w:p>
       <w:r>
+        <w:t>Differences between successful and unsuccessful random variants (Mann-Whitney U):</w:t>
+      </w:r>
+    </w:p>
+    <w:tbl>
+      <w:tblPr>
+        <w:tblStyle w:val="LightGrid-Accent1"/>
+        <w:tblW w:type="auto" w:w="0"/>
+        <w:tblLook w:firstColumn="1" w:firstRow="1" w:lastColumn="0" w:lastRow="0" w:noHBand="0" w:noVBand="1" w:val="04A0"/>
+      </w:tblPr>
+      <w:tblGrid>
+        <w:gridCol w:w="4320"/>
+        <w:gridCol w:w="4320"/>
+      </w:tblGrid>
+      <w:tr>
+        <w:tc>
+          <w:tcPr>
+            <w:tcW w:type="dxa" w:w="4320"/>
+          </w:tcPr>
+          <w:p>
+            <w:r>
+              <w:t>Test Statistic</w:t>
+            </w:r>
+          </w:p>
+        </w:tc>
+        <w:tc>
+          <w:tcPr>
+            <w:tcW w:type="dxa" w:w="4320"/>
+          </w:tcPr>
+          <w:p>
+            <w:r>
+              <w:t>Value</w:t>
+            </w:r>
+          </w:p>
+        </w:tc>
+      </w:tr>
+      <w:tr>
+        <w:tc>
+          <w:tcPr>
+            <w:tcW w:type="dxa" w:w="4320"/>
+          </w:tcPr>
+          <w:p>
+            <w:r>
+              <w:t>U-statistic</w:t>
+            </w:r>
+          </w:p>
+        </w:tc>
+        <w:tc>
+          <w:tcPr>
+            <w:tcW w:type="dxa" w:w="4320"/>
+          </w:tcPr>
+          <w:p>
+            <w:r>
+              <w:t>1062892.0</w:t>
+            </w:r>
+          </w:p>
+        </w:tc>
+      </w:tr>
+      <w:tr>
+        <w:tc>
+          <w:tcPr>
+            <w:tcW w:type="dxa" w:w="4320"/>
+          </w:tcPr>
+          <w:p>
+            <w:r>
+              <w:t>p-value</w:t>
+            </w:r>
+          </w:p>
+        </w:tc>
+        <w:tc>
+          <w:tcPr>
+            <w:tcW w:type="dxa" w:w="4320"/>
+          </w:tcPr>
+          <w:p>
+            <w:r>
+              <w:t>3.7925e-139</w:t>
+            </w:r>
+          </w:p>
+        </w:tc>
+      </w:tr>
+    </w:tbl>
+    <w:p/>
+    <w:p>
+      <w:r>
         <w:drawing>
           <wp:inline xmlns:a="http://schemas.openxmlformats.org/drawingml/2006/main" xmlns:pic="http://schemas.openxmlformats.org/drawingml/2006/picture">
-            <wp:extent cx="5486400" cy="1523424"/>
+            <wp:extent cx="5486400" cy="3610547"/>
             <wp:docPr id="5" name="Picture 5"/>
             <wp:cNvGraphicFramePr>
               <a:graphicFrameLocks noChangeAspect="1"/>
@@ -1535,7 +2945,7 @@
               <a:graphicData uri="http://schemas.openxmlformats.org/drawingml/2006/picture">
                 <pic:pic>
                   <pic:nvPicPr>
-                    <pic:cNvPr id="0" name="decision_diagnostic_median_survival.png"/>
+                    <pic:cNvPr id="0" name="distance_median_survival.png"/>
                     <pic:cNvPicPr/>
                   </pic:nvPicPr>
                   <pic:blipFill>
@@ -1547,7 +2957,7 @@
                   <pic:spPr>
                     <a:xfrm>
                       <a:off x="0" y="0"/>
-                      <a:ext cx="5486400" cy="1523424"/>
+                      <a:ext cx="5486400" cy="3610547"/>
                     </a:xfrm>
                     <a:prstGeom prst="rect"/>
                   </pic:spPr>
@@ -1561,23 +2971,10 @@
     <w:p/>
     <w:p>
       <w:pPr>
-        <w:pStyle w:val="Heading2"/>
-      </w:pPr>
-      <w:r>
-        <w:t>3.4. Distance travelled</w:t>
-      </w:r>
-    </w:p>
-    <w:p>
-      <w:r>
-        <w:t>Distance travelled total and normalized per tick for lifespan differences. This reveals movement intensity. We compare movement patterns between successful and unsuccessful variants to understand how spatial exploration versus local exploitation correlates with fitness.</w:t>
-      </w:r>
-    </w:p>
-    <w:p>
-      <w:pPr>
         <w:pStyle w:val="Heading3"/>
       </w:pPr>
       <w:r>
-        <w:t>3.4.1. Distance travelled absolute</w:t>
+        <w:t>3.3.2. Distance travelled per tick</w:t>
       </w:r>
     </w:p>
     <w:tbl>
@@ -1640,7 +3037,7 @@
           </w:tcPr>
           <w:p>
             <w:r>
-              <w:t>10000</w:t>
+              <w:t>300</w:t>
             </w:r>
           </w:p>
         </w:tc>
@@ -1650,7 +3047,7 @@
           </w:tcPr>
           <w:p>
             <w:r>
-              <w:t>15300</w:t>
+              <w:t>39400</w:t>
             </w:r>
           </w:p>
         </w:tc>
@@ -1672,7 +3069,7 @@
           </w:tcPr>
           <w:p>
             <w:r>
-              <w:t>41.186</w:t>
+              <w:t>0.752</w:t>
             </w:r>
           </w:p>
         </w:tc>
@@ -1682,7 +3079,7 @@
           </w:tcPr>
           <w:p>
             <w:r>
-              <w:t>16.632</w:t>
+              <w:t>0.824</w:t>
             </w:r>
           </w:p>
         </w:tc>
@@ -1704,7 +3101,7 @@
           </w:tcPr>
           <w:p>
             <w:r>
-              <w:t>30.000</w:t>
+              <w:t>0.776</w:t>
             </w:r>
           </w:p>
         </w:tc>
@@ -1714,7 +3111,7 @@
           </w:tcPr>
           <w:p>
             <w:r>
-              <w:t>15.000</w:t>
+              <w:t>0.875</w:t>
             </w:r>
           </w:p>
         </w:tc>
@@ -1736,7 +3133,7 @@
           </w:tcPr>
           <w:p>
             <w:r>
-              <w:t>38.866</w:t>
+              <w:t>0.103</w:t>
             </w:r>
           </w:p>
         </w:tc>
@@ -1746,7 +3143,7 @@
           </w:tcPr>
           <w:p>
             <w:r>
-              <w:t>5.540</w:t>
+              <w:t>0.153</w:t>
             </w:r>
           </w:p>
         </w:tc>
@@ -1768,17 +3165,17 @@
           </w:tcPr>
           <w:p>
             <w:r>
+              <w:t>0.357</w:t>
+            </w:r>
+          </w:p>
+        </w:tc>
+        <w:tc>
+          <w:tcPr>
+            <w:tcW w:type="dxa" w:w="2880"/>
+          </w:tcPr>
+          <w:p>
+            <w:r>
               <w:t>0.000</w:t>
-            </w:r>
-          </w:p>
-        </w:tc>
-        <w:tc>
-          <w:tcPr>
-            <w:tcW w:type="dxa" w:w="2880"/>
-          </w:tcPr>
-          <w:p>
-            <w:r>
-              <w:t>7.000</w:t>
             </w:r>
           </w:p>
         </w:tc>
@@ -1800,7 +3197,7 @@
           </w:tcPr>
           <w:p>
             <w:r>
-              <w:t>550.000</w:t>
+              <w:t>0.938</w:t>
             </w:r>
           </w:p>
         </w:tc>
@@ -1810,7 +3207,7 @@
           </w:tcPr>
           <w:p>
             <w:r>
-              <w:t>132.000</w:t>
+              <w:t>0.938</w:t>
             </w:r>
           </w:p>
         </w:tc>
@@ -1818,7 +3215,7 @@
     </w:tbl>
     <w:p>
       <w:r>
-        <w:t>Mann-Whitney U Test Results:</w:t>
+        <w:t>Differences between successful and unsuccessful random variants (Mann-Whitney U):</w:t>
       </w:r>
     </w:p>
     <w:tbl>
@@ -1870,7 +3267,7 @@
           </w:tcPr>
           <w:p>
             <w:r>
-              <w:t>39057260.5</w:t>
+              <w:t>8745068.5</w:t>
             </w:r>
           </w:p>
         </w:tc>
@@ -1892,7 +3289,7 @@
           </w:tcPr>
           <w:p>
             <w:r>
-              <w:t>0.0000e+00</w:t>
+              <w:t>3.1366e-48</w:t>
             </w:r>
           </w:p>
         </w:tc>
@@ -1912,7 +3309,7 @@
               <a:graphicData uri="http://schemas.openxmlformats.org/drawingml/2006/picture">
                 <pic:pic>
                   <pic:nvPicPr>
-                    <pic:cNvPr id="0" name="distance_median_survival.png"/>
+                    <pic:cNvPr id="0" name="distance_per_tick_median_survival.png"/>
                     <pic:cNvPicPr/>
                   </pic:nvPicPr>
                   <pic:blipFill>
@@ -1938,10 +3335,23 @@
     <w:p/>
     <w:p>
       <w:pPr>
+        <w:pStyle w:val="Heading2"/>
+      </w:pPr>
+      <w:r>
+        <w:t>3.4. Food eaten</w:t>
+      </w:r>
+    </w:p>
+    <w:p>
+      <w:r>
+        <w:t>Food consumption is the ultimate solution of the task. The more food consumed, the longer the survival. Normalized per tick food consumption may be the metric most directly linked to survival fitness.</w:t>
+      </w:r>
+    </w:p>
+    <w:p>
+      <w:pPr>
         <w:pStyle w:val="Heading3"/>
       </w:pPr>
       <w:r>
-        <w:t>3.4.2. Distance travelled per tick</w:t>
+        <w:t>3.4.1. Food consumption absolute</w:t>
       </w:r>
     </w:p>
     <w:tbl>
@@ -2004,7 +3414,7 @@
           </w:tcPr>
           <w:p>
             <w:r>
-              <w:t>10000</w:t>
+              <w:t>300</w:t>
             </w:r>
           </w:p>
         </w:tc>
@@ -2014,7 +3424,7 @@
           </w:tcPr>
           <w:p>
             <w:r>
-              <w:t>15300</w:t>
+              <w:t>39400</w:t>
             </w:r>
           </w:p>
         </w:tc>
@@ -2036,7 +3446,7 @@
           </w:tcPr>
           <w:p>
             <w:r>
-              <w:t>0.611</w:t>
+              <w:t>20.110</w:t>
             </w:r>
           </w:p>
         </w:tc>
@@ -2046,7 +3456,7 @@
           </w:tcPr>
           <w:p>
             <w:r>
-              <w:t>0.910</w:t>
+              <w:t>0.785</w:t>
             </w:r>
           </w:p>
         </w:tc>
@@ -2068,7 +3478,7 @@
           </w:tcPr>
           <w:p>
             <w:r>
-              <w:t>0.667</w:t>
+              <w:t>17.000</w:t>
             </w:r>
           </w:p>
         </w:tc>
@@ -2078,7 +3488,7 @@
           </w:tcPr>
           <w:p>
             <w:r>
-              <w:t>0.938</w:t>
+              <w:t>0.000</w:t>
             </w:r>
           </w:p>
         </w:tc>
@@ -2100,7 +3510,7 @@
           </w:tcPr>
           <w:p>
             <w:r>
-              <w:t>0.212</w:t>
+              <w:t>18.638</w:t>
             </w:r>
           </w:p>
         </w:tc>
@@ -2110,7 +3520,7 @@
           </w:tcPr>
           <w:p>
             <w:r>
-              <w:t>0.047</w:t>
+              <w:t>1.576</w:t>
             </w:r>
           </w:p>
         </w:tc>
@@ -2142,7 +3552,7 @@
           </w:tcPr>
           <w:p>
             <w:r>
-              <w:t>0.304</w:t>
+              <w:t>0.000</w:t>
             </w:r>
           </w:p>
         </w:tc>
@@ -2164,7 +3574,7 @@
           </w:tcPr>
           <w:p>
             <w:r>
-              <w:t>0.938</w:t>
+              <w:t>122.000</w:t>
             </w:r>
           </w:p>
         </w:tc>
@@ -2174,7 +3584,7 @@
           </w:tcPr>
           <w:p>
             <w:r>
-              <w:t>0.938</w:t>
+              <w:t>40.000</w:t>
             </w:r>
           </w:p>
         </w:tc>
@@ -2182,7 +3592,7 @@
     </w:tbl>
     <w:p>
       <w:r>
-        <w:t>Mann-Whitney U Test Results:</w:t>
+        <w:t>Differences between successful and unsuccessful random variants (Mann-Whitney U):</w:t>
       </w:r>
     </w:p>
     <w:tbl>
@@ -2234,7 +3644,7 @@
           </w:tcPr>
           <w:p>
             <w:r>
-              <w:t>147863724.5</w:t>
+              <w:t>797037.5</w:t>
             </w:r>
           </w:p>
         </w:tc>
@@ -2256,7 +3666,7 @@
           </w:tcPr>
           <w:p>
             <w:r>
-              <w:t>0.0000e+00</w:t>
+              <w:t>1.8570e-191</w:t>
             </w:r>
           </w:p>
         </w:tc>
@@ -2276,7 +3686,7 @@
               <a:graphicData uri="http://schemas.openxmlformats.org/drawingml/2006/picture">
                 <pic:pic>
                   <pic:nvPicPr>
-                    <pic:cNvPr id="0" name="distance_per_tick_median_survival.png"/>
+                    <pic:cNvPr id="0" name="foods_median_survival.png"/>
                     <pic:cNvPicPr/>
                   </pic:nvPicPr>
                   <pic:blipFill>
@@ -2302,23 +3712,10 @@
     <w:p/>
     <w:p>
       <w:pPr>
-        <w:pStyle w:val="Heading2"/>
-      </w:pPr>
-      <w:r>
-        <w:t>3.5. Food eaten</w:t>
-      </w:r>
-    </w:p>
-    <w:p>
-      <w:r>
-        <w:t>Food consumption is the ultimate solution of the task. The more food consumed, the longer the survival. Normalized per tick food consumption may be the metric most directly linked to survival fitness.</w:t>
-      </w:r>
-    </w:p>
-    <w:p>
-      <w:pPr>
         <w:pStyle w:val="Heading3"/>
       </w:pPr>
       <w:r>
-        <w:t>3.5.1. Food consumption absolute</w:t>
+        <w:t>3.4.2. Food consumption per tick</w:t>
       </w:r>
     </w:p>
     <w:tbl>
@@ -2381,7 +3778,7 @@
           </w:tcPr>
           <w:p>
             <w:r>
-              <w:t>10000</w:t>
+              <w:t>300</w:t>
             </w:r>
           </w:p>
         </w:tc>
@@ -2391,7 +3788,7 @@
           </w:tcPr>
           <w:p>
             <w:r>
-              <w:t>15300</w:t>
+              <w:t>39400</w:t>
             </w:r>
           </w:p>
         </w:tc>
@@ -2413,7 +3810,7 @@
           </w:tcPr>
           <w:p>
             <w:r>
-              <w:t>7.238</w:t>
+              <w:t>0.137</w:t>
             </w:r>
           </w:p>
         </w:tc>
@@ -2423,7 +3820,7 @@
           </w:tcPr>
           <w:p>
             <w:r>
-              <w:t>0.295</w:t>
+              <w:t>0.022</w:t>
             </w:r>
           </w:p>
         </w:tc>
@@ -2445,7 +3842,7 @@
           </w:tcPr>
           <w:p>
             <w:r>
-              <w:t>5.000</w:t>
+              <w:t>0.152</w:t>
             </w:r>
           </w:p>
         </w:tc>
@@ -2477,7 +3874,7 @@
           </w:tcPr>
           <w:p>
             <w:r>
-              <w:t>8.819</w:t>
+              <w:t>0.054</w:t>
             </w:r>
           </w:p>
         </w:tc>
@@ -2487,7 +3884,7 @@
           </w:tcPr>
           <w:p>
             <w:r>
-              <w:t>0.788</w:t>
+              <w:t>0.031</w:t>
             </w:r>
           </w:p>
         </w:tc>
@@ -2541,7 +3938,7 @@
           </w:tcPr>
           <w:p>
             <w:r>
-              <w:t>141.000</w:t>
+              <w:t>0.227</w:t>
             </w:r>
           </w:p>
         </w:tc>
@@ -2551,7 +3948,7 @@
           </w:tcPr>
           <w:p>
             <w:r>
-              <w:t>24.000</w:t>
+              <w:t>0.185</w:t>
             </w:r>
           </w:p>
         </w:tc>
@@ -2559,7 +3956,7 @@
     </w:tbl>
     <w:p>
       <w:r>
-        <w:t>Mann-Whitney U Test Results:</w:t>
+        <w:t>Differences between successful and unsuccessful random variants (Mann-Whitney U):</w:t>
       </w:r>
     </w:p>
     <w:tbl>
@@ -2611,7 +4008,7 @@
           </w:tcPr>
           <w:p>
             <w:r>
-              <w:t>13237311.0</w:t>
+              <w:t>764851.5</w:t>
             </w:r>
           </w:p>
         </w:tc>
@@ -2633,7 +4030,7 @@
           </w:tcPr>
           <w:p>
             <w:r>
-              <w:t>0.0000e+00</w:t>
+              <w:t>3.3969e-191</w:t>
             </w:r>
           </w:p>
         </w:tc>
@@ -2653,375 +4050,11 @@
               <a:graphicData uri="http://schemas.openxmlformats.org/drawingml/2006/picture">
                 <pic:pic>
                   <pic:nvPicPr>
-                    <pic:cNvPr id="0" name="foods_median_survival.png"/>
+                    <pic:cNvPr id="0" name="foods_per_tick_median_survival.png"/>
                     <pic:cNvPicPr/>
                   </pic:nvPicPr>
                   <pic:blipFill>
                     <a:blip r:embed="rId16"/>
-                    <a:stretch>
-                      <a:fillRect/>
-                    </a:stretch>
-                  </pic:blipFill>
-                  <pic:spPr>
-                    <a:xfrm>
-                      <a:off x="0" y="0"/>
-                      <a:ext cx="5486400" cy="3610547"/>
-                    </a:xfrm>
-                    <a:prstGeom prst="rect"/>
-                  </pic:spPr>
-                </pic:pic>
-              </a:graphicData>
-            </a:graphic>
-          </wp:inline>
-        </w:drawing>
-      </w:r>
-    </w:p>
-    <w:p/>
-    <w:p>
-      <w:pPr>
-        <w:pStyle w:val="Heading3"/>
-      </w:pPr>
-      <w:r>
-        <w:t>3.5.2. Food consumption per tick</w:t>
-      </w:r>
-    </w:p>
-    <w:tbl>
-      <w:tblPr>
-        <w:tblStyle w:val="LightGrid-Accent1"/>
-        <w:tblW w:type="auto" w:w="0"/>
-        <w:tblLook w:firstColumn="1" w:firstRow="1" w:lastColumn="0" w:lastRow="0" w:noHBand="0" w:noVBand="1" w:val="04A0"/>
-      </w:tblPr>
-      <w:tblGrid>
-        <w:gridCol w:w="2880"/>
-        <w:gridCol w:w="2880"/>
-        <w:gridCol w:w="2880"/>
-      </w:tblGrid>
-      <w:tr>
-        <w:tc>
-          <w:tcPr>
-            <w:tcW w:type="dxa" w:w="2880"/>
-          </w:tcPr>
-          <w:p>
-            <w:r>
-              <w:t>Metric</w:t>
-            </w:r>
-          </w:p>
-        </w:tc>
-        <w:tc>
-          <w:tcPr>
-            <w:tcW w:type="dxa" w:w="2880"/>
-          </w:tcPr>
-          <w:p>
-            <w:r>
-              <w:t>Successful (Top 10%)</w:t>
-            </w:r>
-          </w:p>
-        </w:tc>
-        <w:tc>
-          <w:tcPr>
-            <w:tcW w:type="dxa" w:w="2880"/>
-          </w:tcPr>
-          <w:p>
-            <w:r>
-              <w:t>Unsuccessful (Bottom 10%)</w:t>
-            </w:r>
-          </w:p>
-        </w:tc>
-      </w:tr>
-      <w:tr>
-        <w:tc>
-          <w:tcPr>
-            <w:tcW w:type="dxa" w:w="2880"/>
-          </w:tcPr>
-          <w:p>
-            <w:r>
-              <w:t>Number of runs</w:t>
-            </w:r>
-          </w:p>
-        </w:tc>
-        <w:tc>
-          <w:tcPr>
-            <w:tcW w:type="dxa" w:w="2880"/>
-          </w:tcPr>
-          <w:p>
-            <w:r>
-              <w:t>10000</w:t>
-            </w:r>
-          </w:p>
-        </w:tc>
-        <w:tc>
-          <w:tcPr>
-            <w:tcW w:type="dxa" w:w="2880"/>
-          </w:tcPr>
-          <w:p>
-            <w:r>
-              <w:t>15300</w:t>
-            </w:r>
-          </w:p>
-        </w:tc>
-      </w:tr>
-      <w:tr>
-        <w:tc>
-          <w:tcPr>
-            <w:tcW w:type="dxa" w:w="2880"/>
-          </w:tcPr>
-          <w:p>
-            <w:r>
-              <w:t>Mean</w:t>
-            </w:r>
-          </w:p>
-        </w:tc>
-        <w:tc>
-          <w:tcPr>
-            <w:tcW w:type="dxa" w:w="2880"/>
-          </w:tcPr>
-          <w:p>
-            <w:r>
-              <w:t>0.087</w:t>
-            </w:r>
-          </w:p>
-        </w:tc>
-        <w:tc>
-          <w:tcPr>
-            <w:tcW w:type="dxa" w:w="2880"/>
-          </w:tcPr>
-          <w:p>
-            <w:r>
-              <w:t>0.010</w:t>
-            </w:r>
-          </w:p>
-        </w:tc>
-      </w:tr>
-      <w:tr>
-        <w:tc>
-          <w:tcPr>
-            <w:tcW w:type="dxa" w:w="2880"/>
-          </w:tcPr>
-          <w:p>
-            <w:r>
-              <w:t>Median</w:t>
-            </w:r>
-          </w:p>
-        </w:tc>
-        <w:tc>
-          <w:tcPr>
-            <w:tcW w:type="dxa" w:w="2880"/>
-          </w:tcPr>
-          <w:p>
-            <w:r>
-              <w:t>0.091</w:t>
-            </w:r>
-          </w:p>
-        </w:tc>
-        <w:tc>
-          <w:tcPr>
-            <w:tcW w:type="dxa" w:w="2880"/>
-          </w:tcPr>
-          <w:p>
-            <w:r>
-              <w:t>0.000</w:t>
-            </w:r>
-          </w:p>
-        </w:tc>
-      </w:tr>
-      <w:tr>
-        <w:tc>
-          <w:tcPr>
-            <w:tcW w:type="dxa" w:w="2880"/>
-          </w:tcPr>
-          <w:p>
-            <w:r>
-              <w:t>Std Dev</w:t>
-            </w:r>
-          </w:p>
-        </w:tc>
-        <w:tc>
-          <w:tcPr>
-            <w:tcW w:type="dxa" w:w="2880"/>
-          </w:tcPr>
-          <w:p>
-            <w:r>
-              <w:t>0.048</w:t>
-            </w:r>
-          </w:p>
-        </w:tc>
-        <w:tc>
-          <w:tcPr>
-            <w:tcW w:type="dxa" w:w="2880"/>
-          </w:tcPr>
-          <w:p>
-            <w:r>
-              <w:t>0.022</w:t>
-            </w:r>
-          </w:p>
-        </w:tc>
-      </w:tr>
-      <w:tr>
-        <w:tc>
-          <w:tcPr>
-            <w:tcW w:type="dxa" w:w="2880"/>
-          </w:tcPr>
-          <w:p>
-            <w:r>
-              <w:t>Min</w:t>
-            </w:r>
-          </w:p>
-        </w:tc>
-        <w:tc>
-          <w:tcPr>
-            <w:tcW w:type="dxa" w:w="2880"/>
-          </w:tcPr>
-          <w:p>
-            <w:r>
-              <w:t>0.000</w:t>
-            </w:r>
-          </w:p>
-        </w:tc>
-        <w:tc>
-          <w:tcPr>
-            <w:tcW w:type="dxa" w:w="2880"/>
-          </w:tcPr>
-          <w:p>
-            <w:r>
-              <w:t>0.000</w:t>
-            </w:r>
-          </w:p>
-        </w:tc>
-      </w:tr>
-      <w:tr>
-        <w:tc>
-          <w:tcPr>
-            <w:tcW w:type="dxa" w:w="2880"/>
-          </w:tcPr>
-          <w:p>
-            <w:r>
-              <w:t>Max</w:t>
-            </w:r>
-          </w:p>
-        </w:tc>
-        <w:tc>
-          <w:tcPr>
-            <w:tcW w:type="dxa" w:w="2880"/>
-          </w:tcPr>
-          <w:p>
-            <w:r>
-              <w:t>0.227</w:t>
-            </w:r>
-          </w:p>
-        </w:tc>
-        <w:tc>
-          <w:tcPr>
-            <w:tcW w:type="dxa" w:w="2880"/>
-          </w:tcPr>
-          <w:p>
-            <w:r>
-              <w:t>0.149</w:t>
-            </w:r>
-          </w:p>
-        </w:tc>
-      </w:tr>
-    </w:tbl>
-    <w:p>
-      <w:r>
-        <w:t>Mann-Whitney U Test Results:</w:t>
-      </w:r>
-    </w:p>
-    <w:tbl>
-      <w:tblPr>
-        <w:tblStyle w:val="LightGrid-Accent1"/>
-        <w:tblW w:type="auto" w:w="0"/>
-        <w:tblLook w:firstColumn="1" w:firstRow="1" w:lastColumn="0" w:lastRow="0" w:noHBand="0" w:noVBand="1" w:val="04A0"/>
-      </w:tblPr>
-      <w:tblGrid>
-        <w:gridCol w:w="4320"/>
-        <w:gridCol w:w="4320"/>
-      </w:tblGrid>
-      <w:tr>
-        <w:tc>
-          <w:tcPr>
-            <w:tcW w:type="dxa" w:w="4320"/>
-          </w:tcPr>
-          <w:p>
-            <w:r>
-              <w:t>Test Statistic</w:t>
-            </w:r>
-          </w:p>
-        </w:tc>
-        <w:tc>
-          <w:tcPr>
-            <w:tcW w:type="dxa" w:w="4320"/>
-          </w:tcPr>
-          <w:p>
-            <w:r>
-              <w:t>Value</w:t>
-            </w:r>
-          </w:p>
-        </w:tc>
-      </w:tr>
-      <w:tr>
-        <w:tc>
-          <w:tcPr>
-            <w:tcW w:type="dxa" w:w="4320"/>
-          </w:tcPr>
-          <w:p>
-            <w:r>
-              <w:t>U-statistic</w:t>
-            </w:r>
-          </w:p>
-        </w:tc>
-        <w:tc>
-          <w:tcPr>
-            <w:tcW w:type="dxa" w:w="4320"/>
-          </w:tcPr>
-          <w:p>
-            <w:r>
-              <w:t>14289863.5</w:t>
-            </w:r>
-          </w:p>
-        </w:tc>
-      </w:tr>
-      <w:tr>
-        <w:tc>
-          <w:tcPr>
-            <w:tcW w:type="dxa" w:w="4320"/>
-          </w:tcPr>
-          <w:p>
-            <w:r>
-              <w:t>p-value</w:t>
-            </w:r>
-          </w:p>
-        </w:tc>
-        <w:tc>
-          <w:tcPr>
-            <w:tcW w:type="dxa" w:w="4320"/>
-          </w:tcPr>
-          <w:p>
-            <w:r>
-              <w:t>0.0000e+00</w:t>
-            </w:r>
-          </w:p>
-        </w:tc>
-      </w:tr>
-    </w:tbl>
-    <w:p/>
-    <w:p>
-      <w:r>
-        <w:drawing>
-          <wp:inline xmlns:a="http://schemas.openxmlformats.org/drawingml/2006/main" xmlns:pic="http://schemas.openxmlformats.org/drawingml/2006/picture">
-            <wp:extent cx="5486400" cy="3610547"/>
-            <wp:docPr id="9" name="Picture 9"/>
-            <wp:cNvGraphicFramePr>
-              <a:graphicFrameLocks noChangeAspect="1"/>
-            </wp:cNvGraphicFramePr>
-            <a:graphic>
-              <a:graphicData uri="http://schemas.openxmlformats.org/drawingml/2006/picture">
-                <pic:pic>
-                  <pic:nvPicPr>
-                    <pic:cNvPr id="0" name="foods_per_tick_median_survival.png"/>
-                    <pic:cNvPicPr/>
-                  </pic:nvPicPr>
-                  <pic:blipFill>
-                    <a:blip r:embed="rId17"/>
                     <a:stretch>
                       <a:fillRect/>
                     </a:stretch>

</xml_diff>

<commit_message>
made a mess of the analysis script, but am fixing it lol
</commit_message>
<xml_diff>
--- a/data/random_no_regrow/analysis/median_survival/report_median_survival.docx
+++ b/data/random_no_regrow/analysis/median_survival/report_median_survival.docx
@@ -64,7 +64,7 @@
     </w:p>
     <w:p>
       <w:r>
-        <w:t>Summary of how long random wiring variants survive in the experimental environment. We measure survival time in simulation ticks across all 1000 variants to identify which wiring patterns lead to longer survival. We identify successful and unsuccessful variants using range-based thresholds: success is defined as achieving in the top 10% of the achievable performance range. This approach captures true performance excellence even if achieved only by a small number of variants and is used for detailed comparisons in subsequent sections.</w:t>
+        <w:t>Summary of how long random wiring variants survive in the experimental environment. We measure survival time in simulation ticks across all 1000 variants and 100 runs per variant. The statistics below provide a comprehensive overview of survival time distribution across all measurements.</w:t>
       </w:r>
     </w:p>
     <w:p>
@@ -73,11 +73,6 @@
       </w:pPr>
       <w:r>
         <w:t>Overall Descriptive Statistics (Across All Variants):</w:t>
-      </w:r>
-    </w:p>
-    <w:p>
-      <w:r>
-        <w:t xml:space="preserve">Summary statistics computed across individual lifetime measurements from all 1000 variants and 100 runs per variant. </w:t>
       </w:r>
     </w:p>
     <w:tbl>
@@ -423,1118 +418,41 @@
     </w:tbl>
     <w:p>
       <w:pPr>
-        <w:pStyle w:val="Heading3"/>
+        <w:pStyle w:val="Heading2"/>
       </w:pPr>
       <w:r>
-        <w:t>Range-Based Performance Grouping:</w:t>
+        <w:t>2. Group Selection Based on Survival Race</w:t>
       </w:r>
     </w:p>
     <w:p>
       <w:r>
-        <w:t>Success is measured based on median survival across 100 runs with different randomizer seeds. The 1000 different wiring variants are split into successful and unsuccessful groups based on their performance. The achievable range of median liefetimes is split into percentiles. Variants in the 'successful' group had median lifetimes in the top 10% of that range, while variants in the 'unsuccessful' group had median lifetimes in the bottom 10% of that range. This approach respects natural performance gaps and identifies only the variants that truly solve the task well regardless of the number of variants that achieve this.</w:t>
+        <w:t xml:space="preserve">Variants are classified as successful or unsuccessful based on their median survival time relative to the achievable performance range. Successful variants achieve median survival ≥ 100.6 ticks (top 10% of 16.0–110.0 range). Unsuccessful variants achieve median survival ≤ 25.4 ticks (bottom 10% of range). </w:t>
       </w:r>
     </w:p>
-    <w:tbl>
-      <w:tblPr>
-        <w:tblStyle w:val="LightGrid-Accent1"/>
-        <w:tblW w:type="auto" w:w="0"/>
-        <w:tblLook w:firstColumn="1" w:firstRow="1" w:lastColumn="0" w:lastRow="0" w:noHBand="0" w:noVBand="1" w:val="04A0"/>
-      </w:tblPr>
-      <w:tblGrid>
-        <w:gridCol w:w="4320"/>
-        <w:gridCol w:w="4320"/>
-      </w:tblGrid>
-      <w:tr>
-        <w:tc>
-          <w:tcPr>
-            <w:tcW w:type="dxa" w:w="4320"/>
-          </w:tcPr>
-          <w:p>
-            <w:r>
-              <w:t>Metric</w:t>
-            </w:r>
-          </w:p>
-        </w:tc>
-        <w:tc>
-          <w:tcPr>
-            <w:tcW w:type="dxa" w:w="4320"/>
-          </w:tcPr>
-          <w:p>
-            <w:r>
-              <w:t>Value (ticks)</w:t>
-            </w:r>
-          </w:p>
-        </w:tc>
-      </w:tr>
-      <w:tr>
-        <w:tc>
-          <w:tcPr>
-            <w:tcW w:type="dxa" w:w="4320"/>
-          </w:tcPr>
-          <w:p>
-            <w:r>
-              <w:t>Successful threshold (top 10% of range)</w:t>
-            </w:r>
-          </w:p>
-        </w:tc>
-        <w:tc>
-          <w:tcPr>
-            <w:tcW w:type="dxa" w:w="4320"/>
-          </w:tcPr>
-          <w:p>
-            <w:r>
-              <w:t>&gt;= 100.6</w:t>
-            </w:r>
-          </w:p>
-        </w:tc>
-      </w:tr>
-      <w:tr>
-        <w:tc>
-          <w:tcPr>
-            <w:tcW w:type="dxa" w:w="4320"/>
-          </w:tcPr>
-          <w:p>
-            <w:r>
-              <w:t>Unsuccessful threshold (bottom 10% of range)</w:t>
-            </w:r>
-          </w:p>
-        </w:tc>
-        <w:tc>
-          <w:tcPr>
-            <w:tcW w:type="dxa" w:w="4320"/>
-          </w:tcPr>
-          <w:p>
-            <w:r>
-              <w:t>&lt;= 25.4</w:t>
-            </w:r>
-          </w:p>
-        </w:tc>
-      </w:tr>
-      <w:tr>
-        <w:tc>
-          <w:tcPr>
-            <w:tcW w:type="dxa" w:w="4320"/>
-          </w:tcPr>
-          <w:p>
-            <w:r>
-              <w:t>Variants identified in each group</w:t>
-            </w:r>
-          </w:p>
-        </w:tc>
-        <w:tc>
-          <w:tcPr>
-            <w:tcW w:type="dxa" w:w="4320"/>
-          </w:tcPr>
-          <w:p>
-            <w:r>
-              <w:t>Successful: 3, Unsuccessful: 394</w:t>
-            </w:r>
-          </w:p>
-        </w:tc>
-      </w:tr>
-    </w:tbl>
     <w:p>
       <w:pPr>
         <w:pStyle w:val="Heading3"/>
       </w:pPr>
       <w:r>
-        <w:t>Overall Descriptive Statistics per Variant:</w:t>
+        <w:t>Successful Variant Group (Top 10%):</w:t>
       </w:r>
     </w:p>
     <w:p>
       <w:r>
-        <w:t>Detailed breakdown of descriptive statistics computed across all variants. This table aggregates statistics per variant and then shows the highest, lowest, and average values of the 1000 variants. Heavy-tailed distributions are characterized by skewness and kurtosis; variants with high skewness or kurtosis have more extreme or rare events.</w:t>
+        <w:t>variant_468, variant_639, variant_819</w:t>
       </w:r>
     </w:p>
-    <w:tbl>
-      <w:tblPr>
-        <w:tblStyle w:val="LightGrid-Accent1"/>
-        <w:tblW w:type="auto" w:w="0"/>
-        <w:tblLook w:firstColumn="1" w:firstRow="1" w:lastColumn="0" w:lastRow="0" w:noHBand="0" w:noVBand="1" w:val="04A0"/>
-      </w:tblPr>
-      <w:tblGrid>
-        <w:gridCol w:w="1440"/>
-        <w:gridCol w:w="1440"/>
-        <w:gridCol w:w="1440"/>
-        <w:gridCol w:w="1440"/>
-        <w:gridCol w:w="1440"/>
-        <w:gridCol w:w="1440"/>
-      </w:tblGrid>
-      <w:tr>
-        <w:tc>
-          <w:tcPr>
-            <w:tcW w:type="dxa" w:w="1440"/>
-          </w:tcPr>
-          <w:p>
-            <w:r>
-              <w:t>Statistic</w:t>
-            </w:r>
-          </w:p>
-        </w:tc>
-        <w:tc>
-          <w:tcPr>
-            <w:tcW w:type="dxa" w:w="1440"/>
-          </w:tcPr>
-          <w:p>
-            <w:r>
-              <w:t>Highest Value</w:t>
-            </w:r>
-          </w:p>
-        </w:tc>
-        <w:tc>
-          <w:tcPr>
-            <w:tcW w:type="dxa" w:w="1440"/>
-          </w:tcPr>
-          <w:p>
-            <w:r>
-              <w:t>Variant (Highest)</w:t>
-            </w:r>
-          </w:p>
-        </w:tc>
-        <w:tc>
-          <w:tcPr>
-            <w:tcW w:type="dxa" w:w="1440"/>
-          </w:tcPr>
-          <w:p>
-            <w:r>
-              <w:t>Lowest Value</w:t>
-            </w:r>
-          </w:p>
-        </w:tc>
-        <w:tc>
-          <w:tcPr>
-            <w:tcW w:type="dxa" w:w="1440"/>
-          </w:tcPr>
-          <w:p>
-            <w:r>
-              <w:t>Variant (Lowest)</w:t>
-            </w:r>
-          </w:p>
-        </w:tc>
-        <w:tc>
-          <w:tcPr>
-            <w:tcW w:type="dxa" w:w="1440"/>
-          </w:tcPr>
-          <w:p>
-            <w:r>
-              <w:t>Average</w:t>
-            </w:r>
-          </w:p>
-        </w:tc>
-      </w:tr>
-      <w:tr>
-        <w:tc>
-          <w:tcPr>
-            <w:tcW w:type="dxa" w:w="1440"/>
-          </w:tcPr>
-          <w:p>
-            <w:r>
-              <w:t>MEAN</w:t>
-            </w:r>
-          </w:p>
-        </w:tc>
-        <w:tc>
-          <w:tcPr>
-            <w:tcW w:type="dxa" w:w="1440"/>
-          </w:tcPr>
-          <w:p>
-            <w:r>
-              <w:t>135.72</w:t>
-            </w:r>
-          </w:p>
-        </w:tc>
-        <w:tc>
-          <w:tcPr>
-            <w:tcW w:type="dxa" w:w="1440"/>
-          </w:tcPr>
-          <w:p>
-            <w:r>
-              <w:t>variant_819</w:t>
-            </w:r>
-          </w:p>
-        </w:tc>
-        <w:tc>
-          <w:tcPr>
-            <w:tcW w:type="dxa" w:w="1440"/>
-          </w:tcPr>
-          <w:p>
-            <w:r>
-              <w:t>16.00</w:t>
-            </w:r>
-          </w:p>
-        </w:tc>
-        <w:tc>
-          <w:tcPr>
-            <w:tcW w:type="dxa" w:w="1440"/>
-          </w:tcPr>
-          <w:p>
-            <w:r>
-              <w:t>variant_269</w:t>
-            </w:r>
-          </w:p>
-        </w:tc>
-        <w:tc>
-          <w:tcPr>
-            <w:tcW w:type="dxa" w:w="1440"/>
-          </w:tcPr>
-          <w:p>
-            <w:r>
-              <w:t>33.93</w:t>
-            </w:r>
-          </w:p>
-        </w:tc>
-      </w:tr>
-      <w:tr>
-        <w:tc>
-          <w:tcPr>
-            <w:tcW w:type="dxa" w:w="1440"/>
-          </w:tcPr>
-          <w:p>
-            <w:r>
-              <w:t>MEDIAN</w:t>
-            </w:r>
-          </w:p>
-        </w:tc>
-        <w:tc>
-          <w:tcPr>
-            <w:tcW w:type="dxa" w:w="1440"/>
-          </w:tcPr>
-          <w:p>
-            <w:r>
-              <w:t>110.00</w:t>
-            </w:r>
-          </w:p>
-        </w:tc>
-        <w:tc>
-          <w:tcPr>
-            <w:tcW w:type="dxa" w:w="1440"/>
-          </w:tcPr>
-          <w:p>
-            <w:r>
-              <w:t>variant_639</w:t>
-            </w:r>
-          </w:p>
-        </w:tc>
-        <w:tc>
-          <w:tcPr>
-            <w:tcW w:type="dxa" w:w="1440"/>
-          </w:tcPr>
-          <w:p>
-            <w:r>
-              <w:t>16.00</w:t>
-            </w:r>
-          </w:p>
-        </w:tc>
-        <w:tc>
-          <w:tcPr>
-            <w:tcW w:type="dxa" w:w="1440"/>
-          </w:tcPr>
-          <w:p>
-            <w:r>
-              <w:t>variant_105</w:t>
-            </w:r>
-          </w:p>
-        </w:tc>
-        <w:tc>
-          <w:tcPr>
-            <w:tcW w:type="dxa" w:w="1440"/>
-          </w:tcPr>
-          <w:p>
-            <w:r>
-              <w:t>28.56</w:t>
-            </w:r>
-          </w:p>
-        </w:tc>
-      </w:tr>
-      <w:tr>
-        <w:tc>
-          <w:tcPr>
-            <w:tcW w:type="dxa" w:w="1440"/>
-          </w:tcPr>
-          <w:p>
-            <w:r>
-              <w:t>STD</w:t>
-            </w:r>
-          </w:p>
-        </w:tc>
-        <w:tc>
-          <w:tcPr>
-            <w:tcW w:type="dxa" w:w="1440"/>
-          </w:tcPr>
-          <w:p>
-            <w:r>
-              <w:t>127.58</w:t>
-            </w:r>
-          </w:p>
-        </w:tc>
-        <w:tc>
-          <w:tcPr>
-            <w:tcW w:type="dxa" w:w="1440"/>
-          </w:tcPr>
-          <w:p>
-            <w:r>
-              <w:t>variant_195</w:t>
-            </w:r>
-          </w:p>
-        </w:tc>
-        <w:tc>
-          <w:tcPr>
-            <w:tcW w:type="dxa" w:w="1440"/>
-          </w:tcPr>
-          <w:p>
-            <w:r>
-              <w:t>0.00</w:t>
-            </w:r>
-          </w:p>
-        </w:tc>
-        <w:tc>
-          <w:tcPr>
-            <w:tcW w:type="dxa" w:w="1440"/>
-          </w:tcPr>
-          <w:p>
-            <w:r>
-              <w:t>variant_269</w:t>
-            </w:r>
-          </w:p>
-        </w:tc>
-        <w:tc>
-          <w:tcPr>
-            <w:tcW w:type="dxa" w:w="1440"/>
-          </w:tcPr>
-          <w:p>
-            <w:r>
-              <w:t>16.58</w:t>
-            </w:r>
-          </w:p>
-        </w:tc>
-      </w:tr>
-      <w:tr>
-        <w:tc>
-          <w:tcPr>
-            <w:tcW w:type="dxa" w:w="1440"/>
-          </w:tcPr>
-          <w:p>
-            <w:r>
-              <w:t>MIN</w:t>
-            </w:r>
-          </w:p>
-        </w:tc>
-        <w:tc>
-          <w:tcPr>
-            <w:tcW w:type="dxa" w:w="1440"/>
-          </w:tcPr>
-          <w:p>
-            <w:r>
-              <w:t>30.00</w:t>
-            </w:r>
-          </w:p>
-        </w:tc>
-        <w:tc>
-          <w:tcPr>
-            <w:tcW w:type="dxa" w:w="1440"/>
-          </w:tcPr>
-          <w:p>
-            <w:r>
-              <w:t>variant_461</w:t>
-            </w:r>
-          </w:p>
-        </w:tc>
-        <w:tc>
-          <w:tcPr>
-            <w:tcW w:type="dxa" w:w="1440"/>
-          </w:tcPr>
-          <w:p>
-            <w:r>
-              <w:t>16.00</w:t>
-            </w:r>
-          </w:p>
-        </w:tc>
-        <w:tc>
-          <w:tcPr>
-            <w:tcW w:type="dxa" w:w="1440"/>
-          </w:tcPr>
-          <w:p>
-            <w:r>
-              <w:t>variant_02</w:t>
-            </w:r>
-          </w:p>
-        </w:tc>
-        <w:tc>
-          <w:tcPr>
-            <w:tcW w:type="dxa" w:w="1440"/>
-          </w:tcPr>
-          <w:p>
-            <w:r>
-              <w:t>17.89</w:t>
-            </w:r>
-          </w:p>
-        </w:tc>
-      </w:tr>
-      <w:tr>
-        <w:tc>
-          <w:tcPr>
-            <w:tcW w:type="dxa" w:w="1440"/>
-          </w:tcPr>
-          <w:p>
-            <w:r>
-              <w:t>MAX</w:t>
-            </w:r>
-          </w:p>
-        </w:tc>
-        <w:tc>
-          <w:tcPr>
-            <w:tcW w:type="dxa" w:w="1440"/>
-          </w:tcPr>
-          <w:p>
-            <w:r>
-              <w:t>795.00</w:t>
-            </w:r>
-          </w:p>
-        </w:tc>
-        <w:tc>
-          <w:tcPr>
-            <w:tcW w:type="dxa" w:w="1440"/>
-          </w:tcPr>
-          <w:p>
-            <w:r>
-              <w:t>variant_195</w:t>
-            </w:r>
-          </w:p>
-        </w:tc>
-        <w:tc>
-          <w:tcPr>
-            <w:tcW w:type="dxa" w:w="1440"/>
-          </w:tcPr>
-          <w:p>
-            <w:r>
-              <w:t>16.00</w:t>
-            </w:r>
-          </w:p>
-        </w:tc>
-        <w:tc>
-          <w:tcPr>
-            <w:tcW w:type="dxa" w:w="1440"/>
-          </w:tcPr>
-          <w:p>
-            <w:r>
-              <w:t>variant_269</w:t>
-            </w:r>
-          </w:p>
-        </w:tc>
-        <w:tc>
-          <w:tcPr>
-            <w:tcW w:type="dxa" w:w="1440"/>
-          </w:tcPr>
-          <w:p>
-            <w:r>
-              <w:t>103.67</w:t>
-            </w:r>
-          </w:p>
-        </w:tc>
-      </w:tr>
-      <w:tr>
-        <w:tc>
-          <w:tcPr>
-            <w:tcW w:type="dxa" w:w="1440"/>
-          </w:tcPr>
-          <w:p>
-            <w:r>
-              <w:t>RANGE</w:t>
-            </w:r>
-          </w:p>
-        </w:tc>
-        <w:tc>
-          <w:tcPr>
-            <w:tcW w:type="dxa" w:w="1440"/>
-          </w:tcPr>
-          <w:p>
-            <w:r>
-              <w:t>774.00</w:t>
-            </w:r>
-          </w:p>
-        </w:tc>
-        <w:tc>
-          <w:tcPr>
-            <w:tcW w:type="dxa" w:w="1440"/>
-          </w:tcPr>
-          <w:p>
-            <w:r>
-              <w:t>variant_195</w:t>
-            </w:r>
-          </w:p>
-        </w:tc>
-        <w:tc>
-          <w:tcPr>
-            <w:tcW w:type="dxa" w:w="1440"/>
-          </w:tcPr>
-          <w:p>
-            <w:r>
-              <w:t>0.00</w:t>
-            </w:r>
-          </w:p>
-        </w:tc>
-        <w:tc>
-          <w:tcPr>
-            <w:tcW w:type="dxa" w:w="1440"/>
-          </w:tcPr>
-          <w:p>
-            <w:r>
-              <w:t>variant_269</w:t>
-            </w:r>
-          </w:p>
-        </w:tc>
-        <w:tc>
-          <w:tcPr>
-            <w:tcW w:type="dxa" w:w="1440"/>
-          </w:tcPr>
-          <w:p>
-            <w:r>
-              <w:t>85.78</w:t>
-            </w:r>
-          </w:p>
-        </w:tc>
-      </w:tr>
-      <w:tr>
-        <w:tc>
-          <w:tcPr>
-            <w:tcW w:type="dxa" w:w="1440"/>
-          </w:tcPr>
-          <w:p>
-            <w:r>
-              <w:t>IQR</w:t>
-            </w:r>
-          </w:p>
-        </w:tc>
-        <w:tc>
-          <w:tcPr>
-            <w:tcW w:type="dxa" w:w="1440"/>
-          </w:tcPr>
-          <w:p>
-            <w:r>
-              <w:t>140.00</w:t>
-            </w:r>
-          </w:p>
-        </w:tc>
-        <w:tc>
-          <w:tcPr>
-            <w:tcW w:type="dxa" w:w="1440"/>
-          </w:tcPr>
-          <w:p>
-            <w:r>
-              <w:t>variant_177</w:t>
-            </w:r>
-          </w:p>
-        </w:tc>
-        <w:tc>
-          <w:tcPr>
-            <w:tcW w:type="dxa" w:w="1440"/>
-          </w:tcPr>
-          <w:p>
-            <w:r>
-              <w:t>0.00</w:t>
-            </w:r>
-          </w:p>
-        </w:tc>
-        <w:tc>
-          <w:tcPr>
-            <w:tcW w:type="dxa" w:w="1440"/>
-          </w:tcPr>
-          <w:p>
-            <w:r>
-              <w:t>variant_107</w:t>
-            </w:r>
-          </w:p>
-        </w:tc>
-        <w:tc>
-          <w:tcPr>
-            <w:tcW w:type="dxa" w:w="1440"/>
-          </w:tcPr>
-          <w:p>
-            <w:r>
-              <w:t>17.76</w:t>
-            </w:r>
-          </w:p>
-        </w:tc>
-      </w:tr>
-      <w:tr>
-        <w:tc>
-          <w:tcPr>
-            <w:tcW w:type="dxa" w:w="1440"/>
-          </w:tcPr>
-          <w:p>
-            <w:r>
-              <w:t>P5</w:t>
-            </w:r>
-          </w:p>
-        </w:tc>
-        <w:tc>
-          <w:tcPr>
-            <w:tcW w:type="dxa" w:w="1440"/>
-          </w:tcPr>
-          <w:p>
-            <w:r>
-              <w:t>33.95</w:t>
-            </w:r>
-          </w:p>
-        </w:tc>
-        <w:tc>
-          <w:tcPr>
-            <w:tcW w:type="dxa" w:w="1440"/>
-          </w:tcPr>
-          <w:p>
-            <w:r>
-              <w:t>variant_843</w:t>
-            </w:r>
-          </w:p>
-        </w:tc>
-        <w:tc>
-          <w:tcPr>
-            <w:tcW w:type="dxa" w:w="1440"/>
-          </w:tcPr>
-          <w:p>
-            <w:r>
-              <w:t>16.00</w:t>
-            </w:r>
-          </w:p>
-        </w:tc>
-        <w:tc>
-          <w:tcPr>
-            <w:tcW w:type="dxa" w:w="1440"/>
-          </w:tcPr>
-          <w:p>
-            <w:r>
-              <w:t>variant_02</w:t>
-            </w:r>
-          </w:p>
-        </w:tc>
-        <w:tc>
-          <w:tcPr>
-            <w:tcW w:type="dxa" w:w="1440"/>
-          </w:tcPr>
-          <w:p>
-            <w:r>
-              <w:t>19.10</w:t>
-            </w:r>
-          </w:p>
-        </w:tc>
-      </w:tr>
-      <w:tr>
-        <w:tc>
-          <w:tcPr>
-            <w:tcW w:type="dxa" w:w="1440"/>
-          </w:tcPr>
-          <w:p>
-            <w:r>
-              <w:t>P25</w:t>
-            </w:r>
-          </w:p>
-        </w:tc>
-        <w:tc>
-          <w:tcPr>
-            <w:tcW w:type="dxa" w:w="1440"/>
-          </w:tcPr>
-          <w:p>
-            <w:r>
-              <w:t>67.00</w:t>
-            </w:r>
-          </w:p>
-        </w:tc>
-        <w:tc>
-          <w:tcPr>
-            <w:tcW w:type="dxa" w:w="1440"/>
-          </w:tcPr>
-          <w:p>
-            <w:r>
-              <w:t>variant_52</w:t>
-            </w:r>
-          </w:p>
-        </w:tc>
-        <w:tc>
-          <w:tcPr>
-            <w:tcW w:type="dxa" w:w="1440"/>
-          </w:tcPr>
-          <w:p>
-            <w:r>
-              <w:t>16.00</w:t>
-            </w:r>
-          </w:p>
-        </w:tc>
-        <w:tc>
-          <w:tcPr>
-            <w:tcW w:type="dxa" w:w="1440"/>
-          </w:tcPr>
-          <w:p>
-            <w:r>
-              <w:t>variant_09</w:t>
-            </w:r>
-          </w:p>
-        </w:tc>
-        <w:tc>
-          <w:tcPr>
-            <w:tcW w:type="dxa" w:w="1440"/>
-          </w:tcPr>
-          <w:p>
-            <w:r>
-              <w:t>22.32</w:t>
-            </w:r>
-          </w:p>
-        </w:tc>
-      </w:tr>
-      <w:tr>
-        <w:tc>
-          <w:tcPr>
-            <w:tcW w:type="dxa" w:w="1440"/>
-          </w:tcPr>
-          <w:p>
-            <w:r>
-              <w:t>P75</w:t>
-            </w:r>
-          </w:p>
-        </w:tc>
-        <w:tc>
-          <w:tcPr>
-            <w:tcW w:type="dxa" w:w="1440"/>
-          </w:tcPr>
-          <w:p>
-            <w:r>
-              <w:t>175.75</w:t>
-            </w:r>
-          </w:p>
-        </w:tc>
-        <w:tc>
-          <w:tcPr>
-            <w:tcW w:type="dxa" w:w="1440"/>
-          </w:tcPr>
-          <w:p>
-            <w:r>
-              <w:t>variant_819</w:t>
-            </w:r>
-          </w:p>
-        </w:tc>
-        <w:tc>
-          <w:tcPr>
-            <w:tcW w:type="dxa" w:w="1440"/>
-          </w:tcPr>
-          <w:p>
-            <w:r>
-              <w:t>16.00</w:t>
-            </w:r>
-          </w:p>
-        </w:tc>
-        <w:tc>
-          <w:tcPr>
-            <w:tcW w:type="dxa" w:w="1440"/>
-          </w:tcPr>
-          <w:p>
-            <w:r>
-              <w:t>variant_107</w:t>
-            </w:r>
-          </w:p>
-        </w:tc>
-        <w:tc>
-          <w:tcPr>
-            <w:tcW w:type="dxa" w:w="1440"/>
-          </w:tcPr>
-          <w:p>
-            <w:r>
-              <w:t>40.08</w:t>
-            </w:r>
-          </w:p>
-        </w:tc>
-      </w:tr>
-      <w:tr>
-        <w:tc>
-          <w:tcPr>
-            <w:tcW w:type="dxa" w:w="1440"/>
-          </w:tcPr>
-          <w:p>
-            <w:r>
-              <w:t>P95</w:t>
-            </w:r>
-          </w:p>
-        </w:tc>
-        <w:tc>
-          <w:tcPr>
-            <w:tcW w:type="dxa" w:w="1440"/>
-          </w:tcPr>
-          <w:p>
-            <w:r>
-              <w:t>407.85</w:t>
-            </w:r>
-          </w:p>
-        </w:tc>
-        <w:tc>
-          <w:tcPr>
-            <w:tcW w:type="dxa" w:w="1440"/>
-          </w:tcPr>
-          <w:p>
-            <w:r>
-              <w:t>variant_177</w:t>
-            </w:r>
-          </w:p>
-        </w:tc>
-        <w:tc>
-          <w:tcPr>
-            <w:tcW w:type="dxa" w:w="1440"/>
-          </w:tcPr>
-          <w:p>
-            <w:r>
-              <w:t>16.00</w:t>
-            </w:r>
-          </w:p>
-        </w:tc>
-        <w:tc>
-          <w:tcPr>
-            <w:tcW w:type="dxa" w:w="1440"/>
-          </w:tcPr>
-          <w:p>
-            <w:r>
-              <w:t>variant_18</w:t>
-            </w:r>
-          </w:p>
-        </w:tc>
-        <w:tc>
-          <w:tcPr>
-            <w:tcW w:type="dxa" w:w="1440"/>
-          </w:tcPr>
-          <w:p>
-            <w:r>
-              <w:t>65.82</w:t>
-            </w:r>
-          </w:p>
-        </w:tc>
-      </w:tr>
-      <w:tr>
-        <w:tc>
-          <w:tcPr>
-            <w:tcW w:type="dxa" w:w="1440"/>
-          </w:tcPr>
-          <w:p>
-            <w:r>
-              <w:t>SKEWNESS</w:t>
-            </w:r>
-          </w:p>
-        </w:tc>
-        <w:tc>
-          <w:tcPr>
-            <w:tcW w:type="dxa" w:w="1440"/>
-          </w:tcPr>
-          <w:p>
-            <w:r>
-              <w:t>9.85</w:t>
-            </w:r>
-          </w:p>
-        </w:tc>
-        <w:tc>
-          <w:tcPr>
-            <w:tcW w:type="dxa" w:w="1440"/>
-          </w:tcPr>
-          <w:p>
-            <w:r>
-              <w:t>variant_597</w:t>
-            </w:r>
-          </w:p>
-        </w:tc>
-        <w:tc>
-          <w:tcPr>
-            <w:tcW w:type="dxa" w:w="1440"/>
-          </w:tcPr>
-          <w:p>
-            <w:r>
-              <w:t>-1.56</w:t>
-            </w:r>
-          </w:p>
-        </w:tc>
-        <w:tc>
-          <w:tcPr>
-            <w:tcW w:type="dxa" w:w="1440"/>
-          </w:tcPr>
-          <w:p>
-            <w:r>
-              <w:t>variant_903</w:t>
-            </w:r>
-          </w:p>
-        </w:tc>
-        <w:tc>
-          <w:tcPr>
-            <w:tcW w:type="dxa" w:w="1440"/>
-          </w:tcPr>
-          <w:p>
-            <w:r>
-              <w:t>2.18</w:t>
-            </w:r>
-          </w:p>
-        </w:tc>
-      </w:tr>
-      <w:tr>
-        <w:tc>
-          <w:tcPr>
-            <w:tcW w:type="dxa" w:w="1440"/>
-          </w:tcPr>
-          <w:p>
-            <w:r>
-              <w:t>KURTOSIS</w:t>
-            </w:r>
-          </w:p>
-        </w:tc>
-        <w:tc>
-          <w:tcPr>
-            <w:tcW w:type="dxa" w:w="1440"/>
-          </w:tcPr>
-          <w:p>
-            <w:r>
-              <w:t>95.01</w:t>
-            </w:r>
-          </w:p>
-        </w:tc>
-        <w:tc>
-          <w:tcPr>
-            <w:tcW w:type="dxa" w:w="1440"/>
-          </w:tcPr>
-          <w:p>
-            <w:r>
-              <w:t>variant_567</w:t>
-            </w:r>
-          </w:p>
-        </w:tc>
-        <w:tc>
-          <w:tcPr>
-            <w:tcW w:type="dxa" w:w="1440"/>
-          </w:tcPr>
-          <w:p>
-            <w:r>
-              <w:t>-1.50</w:t>
-            </w:r>
-          </w:p>
-        </w:tc>
-        <w:tc>
-          <w:tcPr>
-            <w:tcW w:type="dxa" w:w="1440"/>
-          </w:tcPr>
-          <w:p>
-            <w:r>
-              <w:t>variant_884</w:t>
-            </w:r>
-          </w:p>
-        </w:tc>
-        <w:tc>
-          <w:tcPr>
-            <w:tcW w:type="dxa" w:w="1440"/>
-          </w:tcPr>
-          <w:p>
-            <w:r>
-              <w:t>7.53</w:t>
-            </w:r>
-          </w:p>
-        </w:tc>
-      </w:tr>
-      <w:tr>
-        <w:tc>
-          <w:tcPr>
-            <w:tcW w:type="dxa" w:w="1440"/>
-          </w:tcPr>
-          <w:p>
-            <w:r>
-              <w:t>CV</w:t>
-            </w:r>
-          </w:p>
-        </w:tc>
-        <w:tc>
-          <w:tcPr>
-            <w:tcW w:type="dxa" w:w="1440"/>
-          </w:tcPr>
-          <w:p>
-            <w:r>
-              <w:t>128.73</w:t>
-            </w:r>
-          </w:p>
-        </w:tc>
-        <w:tc>
-          <w:tcPr>
-            <w:tcW w:type="dxa" w:w="1440"/>
-          </w:tcPr>
-          <w:p>
-            <w:r>
-              <w:t>variant_195</w:t>
-            </w:r>
-          </w:p>
-        </w:tc>
-        <w:tc>
-          <w:tcPr>
-            <w:tcW w:type="dxa" w:w="1440"/>
-          </w:tcPr>
-          <w:p>
-            <w:r>
-              <w:t>0.00</w:t>
-            </w:r>
-          </w:p>
-        </w:tc>
-        <w:tc>
-          <w:tcPr>
-            <w:tcW w:type="dxa" w:w="1440"/>
-          </w:tcPr>
-          <w:p>
-            <w:r>
-              <w:t>variant_269</w:t>
-            </w:r>
-          </w:p>
-        </w:tc>
-        <w:tc>
-          <w:tcPr>
-            <w:tcW w:type="dxa" w:w="1440"/>
-          </w:tcPr>
-          <w:p>
-            <w:r>
-              <w:t>43.49</w:t>
-            </w:r>
-          </w:p>
-        </w:tc>
-      </w:tr>
-    </w:tbl>
     <w:p>
       <w:pPr>
-        <w:pStyle w:val="Heading2"/>
+        <w:pStyle w:val="Heading3"/>
       </w:pPr>
       <w:r>
-        <w:t>1.2. Summary Statistics - Benchmark Variants</w:t>
+        <w:t>Unsuccessful Variant Group (Bottom 10%):</w:t>
       </w:r>
     </w:p>
     <w:p>
       <w:r>
-        <w:t>No benchmark variants provided for this analysis.</w:t>
-      </w:r>
-    </w:p>
-    <w:p>
-      <w:pPr>
-        <w:pStyle w:val="Heading2"/>
-      </w:pPr>
-      <w:r>
-        <w:t>2. Survival Race Selection</w:t>
-      </w:r>
-    </w:p>
-    <w:p>
-      <w:r>
-        <w:t>The survival race plot tracks how many individuals from each wiring variant survive over time. Each curve represents a variant's cumulative survival, showing how fitness changes across the simulation. We use this visualization to identify which variants are robustly long-lived. The comparison table shows key statistics for successful versus unsuccessful variants, helping quantify the performance gap.</w:t>
-      </w:r>
-    </w:p>
-    <w:p>
-      <w:r>
-        <w:t>This plot shows the survival curves for all 1000 wiring variants. Variants are color-coded by their performance achievement (range-based thresholds):</w:t>
-      </w:r>
-    </w:p>
-    <w:p>
-      <w:r>
-        <w:t xml:space="preserve">  • Green: Top 10% of variants (median survival ≥ 100.6 ticks) — 3 variants</w:t>
-      </w:r>
-    </w:p>
-    <w:p>
-      <w:r>
-        <w:t xml:space="preserve">  • Red: Bottom 10% of variants (median survival ≤ 25.4 ticks) — 394 variants</w:t>
-      </w:r>
-    </w:p>
-    <w:p>
-      <w:r>
-        <w:t xml:space="preserve">  • Gray: Middle range (other variants)</w:t>
+        <w:t>variant_09, variant_100, variant_101, variant_102, variant_103, variant_104, variant_105, variant_107, variant_108, variant_11, variant_111, variant_113, variant_116, variant_119, variant_121, variant_123, variant_124, variant_126, variant_127, variant_129, variant_131, variant_136, variant_138, variant_140, variant_142, variant_146, variant_149, variant_15, variant_154, variant_158, variant_162, variant_163, variant_169, variant_171, variant_178, variant_179, variant_18, variant_180, variant_181, variant_186, variant_187, variant_188, variant_189, variant_19, variant_190, variant_191, variant_196, variant_197, variant_199, variant_20, variant_200, variant_201, variant_209, variant_21, variant_212, variant_218, variant_220, variant_223, variant_225, variant_227, variant_228, variant_233, variant_236, variant_239, variant_241, variant_245, variant_250, variant_254, variant_255, variant_259, variant_262, variant_263, variant_264, variant_267, variant_269, variant_276, variant_278, variant_281, variant_282, variant_288, variant_295, variant_296, variant_297, variant_298, variant_30, variant_300, variant_305, variant_307, variant_311, variant_312, variant_317, variant_318, variant_319, variant_32, variant_323, variant_325, variant_337, variant_34, variant_340, variant_341, variant_342, variant_344, variant_347, variant_349, variant_35, variant_352, variant_353, variant_360, variant_362, variant_363, variant_366, variant_37, variant_371, variant_374, variant_375, variant_376, variant_377, variant_378, variant_38, variant_382, variant_385, variant_387, variant_388, variant_39, variant_391, variant_395, variant_396, variant_403, variant_404, variant_405, variant_406, variant_408, variant_410, variant_412, variant_413, variant_416, variant_417, variant_418, variant_420, variant_426, variant_428, variant_429, variant_430, variant_432, variant_434, variant_436, variant_439, variant_44, variant_441, variant_446, variant_449, variant_452, variant_454, variant_459, variant_46, variant_460, variant_463, variant_465, variant_467, variant_469, variant_471, variant_474, variant_477, variant_480, variant_481, variant_483, variant_487, variant_489, variant_49, variant_496, variant_497, variant_499, variant_50, variant_502, variant_505, variant_507, variant_510, variant_511, variant_513, variant_515, variant_518, variant_519, variant_521, variant_522, variant_525, variant_529, variant_536, variant_538, variant_542, variant_545, variant_546, variant_547, variant_549, variant_55, variant_550, variant_552, variant_554, variant_56, variant_561, variant_563, variant_564, variant_566, variant_567, variant_571, variant_574, variant_575, variant_576, variant_579, variant_58, variant_581, variant_582, variant_583, variant_585, variant_588, variant_590, variant_591, variant_593, variant_594, variant_595, variant_596, variant_597, variant_600, variant_601, variant_605, variant_61, variant_614, variant_617, variant_618, variant_619, variant_621, variant_622, variant_624, variant_626, variant_627, variant_628, variant_63, variant_632, variant_638, variant_641, variant_643, variant_644, variant_648, variant_649, variant_653, variant_654, variant_659, variant_66, variant_661, variant_663, variant_67, variant_673, variant_674, variant_675, variant_676, variant_678, variant_682, variant_684, variant_686, variant_689, variant_69, variant_691, variant_692, variant_696, variant_70, variant_700, variant_704, variant_709, variant_712, variant_714, variant_718, variant_72, variant_720, variant_722, variant_724, variant_726, variant_727, variant_729, variant_732, variant_734, variant_739, variant_74, variant_740, variant_741, variant_742, variant_744, variant_745, variant_746, variant_749, variant_75, variant_751, variant_753, variant_754, variant_755, variant_757, variant_758, variant_759, variant_76, variant_761, variant_762, variant_763, variant_77, variant_771, variant_772, variant_777, variant_778, variant_779, variant_780, variant_782, variant_786, variant_791, variant_793, variant_794, variant_798, variant_80, variant_802, variant_805, variant_806, variant_810, variant_812, variant_813, variant_815, variant_817, variant_818, variant_82, variant_820, variant_823, variant_824, variant_825, variant_826, variant_831, variant_833, variant_837, variant_846, variant_847, variant_848, variant_852, variant_853, variant_856, variant_858, variant_861, variant_865, variant_87, variant_874, variant_877, variant_879, variant_881, variant_883, variant_885, variant_886, variant_887, variant_888, variant_889, variant_89, variant_893, variant_895, variant_898, variant_899, variant_901, variant_906, variant_908, variant_909, variant_912, variant_918, variant_924, variant_929, variant_932, variant_937, variant_94, variant_941, variant_942, variant_947, variant_949, variant_953, variant_954, variant_956, variant_958, variant_965, variant_966, variant_967, variant_971, variant_972, variant_973, variant_974, variant_978, variant_979, variant_982, variant_984, variant_986, variant_987, variant_988, variant_99, variant_992, variant_993, variant_999</w:t>
       </w:r>
     </w:p>
     <w:p>
@@ -1575,10 +493,68 @@
     </w:p>
     <w:p/>
     <w:p>
+      <w:pPr>
+        <w:pStyle w:val="Heading2"/>
+      </w:pPr>
       <w:r>
-        <w:t>Successful vs Unsuccessful Comparison:</w:t>
+        <w:t>3. Comparison</w:t>
       </w:r>
     </w:p>
+    <w:p>
+      <w:r>
+        <w:t>This section compares metrics between successful and unsuccessful random variants, and against benchmark implementations where available. Survival times comparison helps validate our group selection; subsequent sections examine behavioral and performance metrics.</w:t>
+      </w:r>
+    </w:p>
+    <w:p>
+      <w:pPr>
+        <w:pStyle w:val="Heading3"/>
+      </w:pPr>
+      <w:r>
+        <w:t>3.1. Survival Times</w:t>
+      </w:r>
+    </w:p>
+    <w:p>
+      <w:r>
+        <w:t>Comparison of lifetime survival between successful and unsuccessful variants. Note: This metric is somewhat redundant since we selected groups specifically based on survival time, but it provides useful verification of group separation and reveals distribution characteristics.</w:t>
+      </w:r>
+    </w:p>
+    <w:p>
+      <w:r>
+        <w:drawing>
+          <wp:inline xmlns:a="http://schemas.openxmlformats.org/drawingml/2006/main" xmlns:pic="http://schemas.openxmlformats.org/drawingml/2006/picture">
+            <wp:extent cx="5486400" cy="3610547"/>
+            <wp:docPr id="2" name="Picture 2"/>
+            <wp:cNvGraphicFramePr>
+              <a:graphicFrameLocks noChangeAspect="1"/>
+            </wp:cNvGraphicFramePr>
+            <a:graphic>
+              <a:graphicData uri="http://schemas.openxmlformats.org/drawingml/2006/picture">
+                <pic:pic>
+                  <pic:nvPicPr>
+                    <pic:cNvPr id="0" name="comp_survival_median_survival.png"/>
+                    <pic:cNvPicPr/>
+                  </pic:nvPicPr>
+                  <pic:blipFill>
+                    <a:blip r:embed="rId10"/>
+                    <a:stretch>
+                      <a:fillRect/>
+                    </a:stretch>
+                  </pic:blipFill>
+                  <pic:spPr>
+                    <a:xfrm>
+                      <a:off x="0" y="0"/>
+                      <a:ext cx="5486400" cy="3610547"/>
+                    </a:xfrm>
+                    <a:prstGeom prst="rect"/>
+                  </pic:spPr>
+                </pic:pic>
+              </a:graphicData>
+            </a:graphic>
+          </wp:inline>
+        </w:drawing>
+      </w:r>
+    </w:p>
+    <w:p/>
     <w:tbl>
       <w:tblPr>
         <w:tblStyle w:val="LightGrid-Accent1"/>
@@ -1607,7 +583,7 @@
           </w:tcPr>
           <w:p>
             <w:r>
-              <w:t>Successful (Top 10% of Variants)</w:t>
+              <w:t>Successful (Top 10%)</w:t>
             </w:r>
           </w:p>
         </w:tc>
@@ -1617,7 +593,7 @@
           </w:tcPr>
           <w:p>
             <w:r>
-              <w:t>Unsuccessful (Bottom 10% of Variants)</w:t>
+              <w:t>Unsuccessful (Bottom 10%)</w:t>
             </w:r>
           </w:p>
         </w:tc>
@@ -1661,7 +637,7 @@
           </w:tcPr>
           <w:p>
             <w:r>
-              <w:t>Mean (ticks)</w:t>
+              <w:t>Mean</w:t>
             </w:r>
           </w:p>
         </w:tc>
@@ -1671,7 +647,7 @@
           </w:tcPr>
           <w:p>
             <w:r>
-              <w:t>123.8</w:t>
+              <w:t>123.773</w:t>
             </w:r>
           </w:p>
         </w:tc>
@@ -1681,7 +657,7 @@
           </w:tcPr>
           <w:p>
             <w:r>
-              <w:t>22.8</w:t>
+              <w:t>22.849</w:t>
             </w:r>
           </w:p>
         </w:tc>
@@ -1693,7 +669,7 @@
           </w:tcPr>
           <w:p>
             <w:r>
-              <w:t>Median (ticks)</w:t>
+              <w:t>Median</w:t>
             </w:r>
           </w:p>
         </w:tc>
@@ -1703,7 +679,7 @@
           </w:tcPr>
           <w:p>
             <w:r>
-              <w:t>108.0</w:t>
+              <w:t>108.000</w:t>
             </w:r>
           </w:p>
         </w:tc>
@@ -1713,7 +689,7 @@
           </w:tcPr>
           <w:p>
             <w:r>
-              <w:t>17.0</w:t>
+              <w:t>17.000</w:t>
             </w:r>
           </w:p>
         </w:tc>
@@ -1725,7 +701,7 @@
           </w:tcPr>
           <w:p>
             <w:r>
-              <w:t>Std Dev (ticks)</w:t>
+              <w:t>Std Dev</w:t>
             </w:r>
           </w:p>
         </w:tc>
@@ -1735,7 +711,7 @@
           </w:tcPr>
           <w:p>
             <w:r>
-              <w:t>96.5</w:t>
+              <w:t>96.508</w:t>
             </w:r>
           </w:p>
         </w:tc>
@@ -1745,7 +721,7 @@
           </w:tcPr>
           <w:p>
             <w:r>
-              <w:t>13.2</w:t>
+              <w:t>13.176</w:t>
             </w:r>
           </w:p>
         </w:tc>
@@ -1757,7 +733,7 @@
           </w:tcPr>
           <w:p>
             <w:r>
-              <w:t>Min (ticks)</w:t>
+              <w:t>Min</w:t>
             </w:r>
           </w:p>
         </w:tc>
@@ -1767,7 +743,7 @@
           </w:tcPr>
           <w:p>
             <w:r>
-              <w:t>16.0</w:t>
+              <w:t>16.000</w:t>
             </w:r>
           </w:p>
         </w:tc>
@@ -1777,7 +753,7 @@
           </w:tcPr>
           <w:p>
             <w:r>
-              <w:t>16.0</w:t>
+              <w:t>16.000</w:t>
             </w:r>
           </w:p>
         </w:tc>
@@ -1789,7 +765,7 @@
           </w:tcPr>
           <w:p>
             <w:r>
-              <w:t>Max (ticks)</w:t>
+              <w:t>Max</w:t>
             </w:r>
           </w:p>
         </w:tc>
@@ -1799,7 +775,7 @@
           </w:tcPr>
           <w:p>
             <w:r>
-              <w:t>645.0</w:t>
+              <w:t>645.000</w:t>
             </w:r>
           </w:p>
         </w:tc>
@@ -1809,95 +785,18 @@
           </w:tcPr>
           <w:p>
             <w:r>
-              <w:t>342.0</w:t>
+              <w:t>342.000</w:t>
             </w:r>
           </w:p>
         </w:tc>
       </w:tr>
     </w:tbl>
     <w:p>
-      <w:r>
-        <w:drawing>
-          <wp:inline xmlns:a="http://schemas.openxmlformats.org/drawingml/2006/main" xmlns:pic="http://schemas.openxmlformats.org/drawingml/2006/picture">
-            <wp:extent cx="5486400" cy="3607410"/>
-            <wp:docPr id="2" name="Picture 2"/>
-            <wp:cNvGraphicFramePr>
-              <a:graphicFrameLocks noChangeAspect="1"/>
-            </wp:cNvGraphicFramePr>
-            <a:graphic>
-              <a:graphicData uri="http://schemas.openxmlformats.org/drawingml/2006/picture">
-                <pic:pic>
-                  <pic:nvPicPr>
-                    <pic:cNvPr id="0" name="comp_survival_median_survival.png"/>
-                    <pic:cNvPicPr/>
-                  </pic:nvPicPr>
-                  <pic:blipFill>
-                    <a:blip r:embed="rId10"/>
-                    <a:stretch>
-                      <a:fillRect/>
-                    </a:stretch>
-                  </pic:blipFill>
-                  <pic:spPr>
-                    <a:xfrm>
-                      <a:off x="0" y="0"/>
-                      <a:ext cx="5486400" cy="3607410"/>
-                    </a:xfrm>
-                    <a:prstGeom prst="rect"/>
-                  </pic:spPr>
-                </pic:pic>
-              </a:graphicData>
-            </a:graphic>
-          </wp:inline>
-        </w:drawing>
-      </w:r>
-    </w:p>
-    <w:p/>
-    <w:p>
-      <w:pPr>
-        <w:pStyle w:val="Heading3"/>
-      </w:pPr>
-      <w:r>
-        <w:t>Variant Group Membership (for debugging/tracking):</w:t>
-      </w:r>
-    </w:p>
-    <w:p>
-      <w:pPr>
-        <w:pStyle w:val="Heading4"/>
-      </w:pPr>
-      <w:r>
-        <w:t>Successful Variants (3 total):</w:t>
-      </w:r>
-    </w:p>
-    <w:p>
-      <w:r>
-        <w:t>variant_468, variant_639, variant_819</w:t>
-      </w:r>
-    </w:p>
-    <w:p>
-      <w:pPr>
-        <w:pStyle w:val="Heading4"/>
-      </w:pPr>
-      <w:r>
-        <w:t>Unsuccessful Variants (394 total):</w:t>
-      </w:r>
-    </w:p>
-    <w:p>
-      <w:r>
-        <w:t>variant_09, variant_100, variant_101, variant_102, variant_103, variant_104, variant_105, variant_107, variant_108, variant_11, variant_111, variant_113, variant_116, variant_119, variant_121, variant_123, variant_124, variant_126, variant_127, variant_129, variant_131, variant_136, variant_138, variant_140, variant_142, variant_146, variant_149, variant_15, variant_154, variant_158, variant_162, variant_163, variant_169, variant_171, variant_178, variant_179, variant_18, variant_180, variant_181, variant_186, variant_187, variant_188, variant_189, variant_19, variant_190, variant_191, variant_196, variant_197, variant_199, variant_20, variant_200, variant_201, variant_209, variant_21, variant_212, variant_218, variant_220, variant_223, variant_225, variant_227, variant_228, variant_233, variant_236, variant_239, variant_241, variant_245, variant_250, variant_254, variant_255, variant_259, variant_262, variant_263, variant_264, variant_267, variant_269, variant_276, variant_278, variant_281, variant_282, variant_288, variant_295, variant_296, variant_297, variant_298, variant_30, variant_300, variant_305, variant_307, variant_311, variant_312, variant_317, variant_318, variant_319, variant_32, variant_323, variant_325, variant_337, variant_34, variant_340, variant_341, variant_342, variant_344, variant_347, variant_349, variant_35, variant_352, variant_353, variant_360, variant_362, variant_363, variant_366, variant_37, variant_371, variant_374, variant_375, variant_376, variant_377, variant_378, variant_38, variant_382, variant_385, variant_387, variant_388, variant_39, variant_391, variant_395, variant_396, variant_403, variant_404, variant_405, variant_406, variant_408, variant_410, variant_412, variant_413, variant_416, variant_417, variant_418, variant_420, variant_426, variant_428, variant_429, variant_430, variant_432, variant_434, variant_436, variant_439, variant_44, variant_441, variant_446, variant_449, variant_452, variant_454, variant_459, variant_46, variant_460, variant_463, variant_465, variant_467, variant_469, variant_471, variant_474, variant_477, variant_480, variant_481, variant_483, variant_487, variant_489, variant_49, variant_496, variant_497, variant_499, variant_50, variant_502, variant_505, variant_507, variant_510, variant_511, variant_513, variant_515, variant_518, variant_519, variant_521, variant_522, variant_525, variant_529, variant_536, variant_538, variant_542, variant_545, variant_546, variant_547, variant_549, variant_55, variant_550, variant_552, variant_554, variant_56, variant_561, variant_563, variant_564, variant_566, variant_567, variant_571, variant_574, variant_575, variant_576, variant_579, variant_58, variant_581, variant_582, variant_583, variant_585, variant_588, variant_590, variant_591, variant_593, variant_594, variant_595, variant_596, variant_597, variant_600, variant_601, variant_605, variant_61, variant_614, variant_617, variant_618, variant_619, variant_621, variant_622, variant_624, variant_626, variant_627, variant_628, variant_63, variant_632, variant_638, variant_641, variant_643, variant_644, variant_648, variant_649, variant_653, variant_654, variant_659, variant_66, variant_661, variant_663, variant_67, variant_673, variant_674, variant_675, variant_676, variant_678, variant_682, variant_684, variant_686, variant_689, variant_69, variant_691, variant_692, variant_696, variant_70, variant_700, variant_704, variant_709, variant_712, variant_714, variant_718, variant_72, variant_720, variant_722, variant_724, variant_726, variant_727, variant_729, variant_732, variant_734, variant_739, variant_74, variant_740, variant_741, variant_742, variant_744, variant_745, variant_746, variant_749, variant_75, variant_751, variant_753, variant_754, variant_755, variant_757, variant_758, variant_759, variant_76, variant_761, variant_762, variant_763, variant_77, variant_771, variant_772, variant_777, variant_778, variant_779, variant_780, variant_782, variant_786, variant_791, variant_793, variant_794, variant_798, variant_80, variant_802, variant_805, variant_806, variant_810, variant_812, variant_813, variant_815, variant_817, variant_818, variant_82, variant_820, variant_823, variant_824, variant_825, variant_826, variant_831, variant_833, variant_837, variant_846, variant_847, variant_848, variant_852, variant_853, variant_856, variant_858, variant_861, variant_865, variant_87, variant_874, variant_877, variant_879, variant_881, variant_883, variant_885, variant_886, variant_887, variant_888, variant_889, variant_89, variant_893, variant_895, variant_898, variant_899, variant_901, variant_906, variant_908, variant_909, variant_912, variant_918, variant_924, variant_929, variant_932, variant_937, variant_94, variant_941, variant_942, variant_947, variant_949, variant_953, variant_954, variant_956, variant_958, variant_965, variant_966, variant_967, variant_971, variant_972, variant_973, variant_974, variant_978, variant_979, variant_982, variant_984, variant_986, variant_987, variant_988, variant_99, variant_992, variant_993, variant_999</w:t>
-      </w:r>
-    </w:p>
-    <w:p/>
-    <w:p>
       <w:pPr>
         <w:pStyle w:val="Heading3"/>
       </w:pPr>
       <w:r>
         <w:t>Differences between successful and unsuccessful random variants (Mann-Whitney U):</w:t>
-      </w:r>
-    </w:p>
-    <w:p>
-      <w:r>
-        <w:t xml:space="preserve">This statistical test compares whether successful and unsuccessful random variants have significantly different survival distributions. </w:t>
       </w:r>
     </w:p>
     <w:tbl>
@@ -1980,207 +879,25 @@
     <w:p/>
     <w:p>
       <w:pPr>
-        <w:pStyle w:val="Heading2"/>
+        <w:pStyle w:val="Heading3"/>
       </w:pPr>
       <w:r>
-        <w:t>3. Comparison between groups</w:t>
+        <w:t>TBD - Interpretation of survival time differences.</w:t>
+      </w:r>
+    </w:p>
+    <w:p>
+      <w:pPr>
+        <w:pStyle w:val="Heading3"/>
+      </w:pPr>
+      <w:r>
+        <w:t>3.2. Movement Efficiency</w:t>
       </w:r>
     </w:p>
     <w:p>
       <w:r>
-        <w:t xml:space="preserve">Break down of successful versus unsuccessful variants across multiple metrics. </w:t>
+        <w:t>Movement efficiency quantifies how effectively variants use sensory information to guide movement. Calculated as movements divided by sensing events in each cardinal direction (N, E, S, W). A ratio close to 1.0 indicates tight coupling between sensing and acting; higher ratios suggest either deliberate multi-movement strategies or noisy sensor integration.</w:t>
       </w:r>
     </w:p>
-    <w:p>
-      <w:pPr>
-        <w:pStyle w:val="Heading2"/>
-      </w:pPr>
-      <w:r>
-        <w:t>3.1. Movement Efficiency</w:t>
-      </w:r>
-    </w:p>
-    <w:p>
-      <w:r>
-        <w:t>For each cardinal direction (North, East, South, West), we calculate the ratio of movement commands to sensory detections. These are total numbers per run and only give a first overview indication of decision accuracy. A ratio close to 1.0 indicates tight coupling between sensing and movement. Ratios far from 1.0 (either higher or lower) indicate decoupling: movement without sensing, or moving more selectively despite sensing. This metric indicates fundamental differences in movement strategy between successful and unsuccessful variants but differences must be investigated on a tick-by-tick basis.</w:t>
-      </w:r>
-    </w:p>
-    <w:p>
-      <w:r>
-        <w:t>Movement Efficiency = Movement Count ÷ Sensing Count per direction</w:t>
-      </w:r>
-    </w:p>
-    <w:tbl>
-      <w:tblPr>
-        <w:tblStyle w:val="LightGrid-Accent1"/>
-        <w:tblW w:type="auto" w:w="0"/>
-        <w:tblLook w:firstColumn="1" w:firstRow="1" w:lastColumn="0" w:lastRow="0" w:noHBand="0" w:noVBand="1" w:val="04A0"/>
-      </w:tblPr>
-      <w:tblGrid>
-        <w:gridCol w:w="2880"/>
-        <w:gridCol w:w="2880"/>
-        <w:gridCol w:w="2880"/>
-      </w:tblGrid>
-      <w:tr>
-        <w:tc>
-          <w:tcPr>
-            <w:tcW w:type="dxa" w:w="2880"/>
-          </w:tcPr>
-          <w:p>
-            <w:r>
-              <w:t>Direction</w:t>
-            </w:r>
-          </w:p>
-        </w:tc>
-        <w:tc>
-          <w:tcPr>
-            <w:tcW w:type="dxa" w:w="2880"/>
-          </w:tcPr>
-          <w:p>
-            <w:r>
-              <w:t>Unsuccessful (Mean ± Std)</w:t>
-            </w:r>
-          </w:p>
-        </w:tc>
-        <w:tc>
-          <w:tcPr>
-            <w:tcW w:type="dxa" w:w="2880"/>
-          </w:tcPr>
-          <w:p>
-            <w:r>
-              <w:t>Successful (Mean ± Std)</w:t>
-            </w:r>
-          </w:p>
-        </w:tc>
-      </w:tr>
-      <w:tr>
-        <w:tc>
-          <w:tcPr>
-            <w:tcW w:type="dxa" w:w="2880"/>
-          </w:tcPr>
-          <w:p>
-            <w:r>
-              <w:t>N</w:t>
-            </w:r>
-          </w:p>
-        </w:tc>
-        <w:tc>
-          <w:tcPr>
-            <w:tcW w:type="dxa" w:w="2880"/>
-          </w:tcPr>
-          <w:p>
-            <w:r>
-              <w:t>1.125 ± 1.792</w:t>
-            </w:r>
-          </w:p>
-        </w:tc>
-        <w:tc>
-          <w:tcPr>
-            <w:tcW w:type="dxa" w:w="2880"/>
-          </w:tcPr>
-          <w:p>
-            <w:r>
-              <w:t>2.221 ± 2.099</w:t>
-            </w:r>
-          </w:p>
-        </w:tc>
-      </w:tr>
-      <w:tr>
-        <w:tc>
-          <w:tcPr>
-            <w:tcW w:type="dxa" w:w="2880"/>
-          </w:tcPr>
-          <w:p>
-            <w:r>
-              <w:t>E</w:t>
-            </w:r>
-          </w:p>
-        </w:tc>
-        <w:tc>
-          <w:tcPr>
-            <w:tcW w:type="dxa" w:w="2880"/>
-          </w:tcPr>
-          <w:p>
-            <w:r>
-              <w:t>1.130 ± 1.801</w:t>
-            </w:r>
-          </w:p>
-        </w:tc>
-        <w:tc>
-          <w:tcPr>
-            <w:tcW w:type="dxa" w:w="2880"/>
-          </w:tcPr>
-          <w:p>
-            <w:r>
-              <w:t>0.357 ± 0.386</w:t>
-            </w:r>
-          </w:p>
-        </w:tc>
-      </w:tr>
-      <w:tr>
-        <w:tc>
-          <w:tcPr>
-            <w:tcW w:type="dxa" w:w="2880"/>
-          </w:tcPr>
-          <w:p>
-            <w:r>
-              <w:t>S</w:t>
-            </w:r>
-          </w:p>
-        </w:tc>
-        <w:tc>
-          <w:tcPr>
-            <w:tcW w:type="dxa" w:w="2880"/>
-          </w:tcPr>
-          <w:p>
-            <w:r>
-              <w:t>1.100 ± 1.781</w:t>
-            </w:r>
-          </w:p>
-        </w:tc>
-        <w:tc>
-          <w:tcPr>
-            <w:tcW w:type="dxa" w:w="2880"/>
-          </w:tcPr>
-          <w:p>
-            <w:r>
-              <w:t>1.478 ± 1.448</w:t>
-            </w:r>
-          </w:p>
-        </w:tc>
-      </w:tr>
-      <w:tr>
-        <w:tc>
-          <w:tcPr>
-            <w:tcW w:type="dxa" w:w="2880"/>
-          </w:tcPr>
-          <w:p>
-            <w:r>
-              <w:t>W</w:t>
-            </w:r>
-          </w:p>
-        </w:tc>
-        <w:tc>
-          <w:tcPr>
-            <w:tcW w:type="dxa" w:w="2880"/>
-          </w:tcPr>
-          <w:p>
-            <w:r>
-              <w:t>1.245 ± 1.943</w:t>
-            </w:r>
-          </w:p>
-        </w:tc>
-        <w:tc>
-          <w:tcPr>
-            <w:tcW w:type="dxa" w:w="2880"/>
-          </w:tcPr>
-          <w:p>
-            <w:r>
-              <w:t>0.876 ± 1.112</w:t>
-            </w:r>
-          </w:p>
-        </w:tc>
-      </w:tr>
-    </w:tbl>
     <w:p>
       <w:r>
         <w:drawing>
@@ -2220,15 +937,23 @@
     <w:p/>
     <w:p>
       <w:pPr>
-        <w:pStyle w:val="Heading2"/>
+        <w:pStyle w:val="Heading3"/>
       </w:pPr>
       <w:r>
-        <w:t>3.2. Decision Accuracy</w:t>
+        <w:t>TBD - Interpretation of movement efficiency by direction.</w:t>
+      </w:r>
+    </w:p>
+    <w:p>
+      <w:pPr>
+        <w:pStyle w:val="Heading3"/>
+      </w:pPr>
+      <w:r>
+        <w:t>3.3. Decision Accuracy</w:t>
       </w:r>
     </w:p>
     <w:p>
       <w:r>
-        <w:t>Decision accuracy quantifies how often choices are aligned with food source locations. This measures, whether the wiring interprets sensory input to direct movement toward food. Higher accuracy indicates more direct coupling of decisions. We compare the distribution of accuracy values between successful and unsuccessful variants to determine whether fitness correlates with decision-making precision, or if other factors like movement efficiency play a larger role. Note that moving onto sensed food is a very shortsighted strategy that might not lead to an optimal solution in more complex tasks e.g. with food regrow in previous positions.</w:t>
+        <w:t>Decision accuracy quantifies how often choices are aligned with food source locations. This measures whether the wiring interprets sensory input to direct movement toward food. Higher accuracy indicates more direct coupling of decisions.</w:t>
       </w:r>
     </w:p>
     <w:p>
@@ -2236,6 +961,43 @@
         <w:t>Decision Accuracy = Correct Decisions ÷ Total Decisions</w:t>
       </w:r>
     </w:p>
+    <w:p>
+      <w:r>
+        <w:drawing>
+          <wp:inline xmlns:a="http://schemas.openxmlformats.org/drawingml/2006/main" xmlns:pic="http://schemas.openxmlformats.org/drawingml/2006/picture">
+            <wp:extent cx="5486400" cy="3610547"/>
+            <wp:docPr id="4" name="Picture 4"/>
+            <wp:cNvGraphicFramePr>
+              <a:graphicFrameLocks noChangeAspect="1"/>
+            </wp:cNvGraphicFramePr>
+            <a:graphic>
+              <a:graphicData uri="http://schemas.openxmlformats.org/drawingml/2006/picture">
+                <pic:pic>
+                  <pic:nvPicPr>
+                    <pic:cNvPr id="0" name="decision_accuracy_median_survival.png"/>
+                    <pic:cNvPicPr/>
+                  </pic:nvPicPr>
+                  <pic:blipFill>
+                    <a:blip r:embed="rId12"/>
+                    <a:stretch>
+                      <a:fillRect/>
+                    </a:stretch>
+                  </pic:blipFill>
+                  <pic:spPr>
+                    <a:xfrm>
+                      <a:off x="0" y="0"/>
+                      <a:ext cx="5486400" cy="3610547"/>
+                    </a:xfrm>
+                    <a:prstGeom prst="rect"/>
+                  </pic:spPr>
+                </pic:pic>
+              </a:graphicData>
+            </a:graphic>
+          </wp:inline>
+        </w:drawing>
+      </w:r>
+    </w:p>
+    <w:p/>
     <w:tbl>
       <w:tblPr>
         <w:tblStyle w:val="LightGrid-Accent1"/>
@@ -2318,7 +1080,7 @@
           </w:tcPr>
           <w:p>
             <w:r>
-              <w:t>Mean accuracy</w:t>
+              <w:t>Mean</w:t>
             </w:r>
           </w:p>
         </w:tc>
@@ -2350,7 +1112,7 @@
           </w:tcPr>
           <w:p>
             <w:r>
-              <w:t>Median accuracy</w:t>
+              <w:t>Median</w:t>
             </w:r>
           </w:p>
         </w:tc>
@@ -2473,6 +1235,9 @@
       </w:tr>
     </w:tbl>
     <w:p>
+      <w:pPr>
+        <w:pStyle w:val="Heading3"/>
+      </w:pPr>
       <w:r>
         <w:t>Differences between successful and unsuccessful random variants (Mann-Whitney U):</w:t>
       </w:r>
@@ -2556,11 +1321,40 @@
     </w:tbl>
     <w:p/>
     <w:p>
+      <w:pPr>
+        <w:pStyle w:val="Heading3"/>
+      </w:pPr>
+      <w:r>
+        <w:t>TBD - Interpretation of decision accuracy differences.</w:t>
+      </w:r>
+    </w:p>
+    <w:p>
+      <w:pPr>
+        <w:pStyle w:val="Heading3"/>
+      </w:pPr>
+      <w:r>
+        <w:t>3.4. Distance Traveled</w:t>
+      </w:r>
+    </w:p>
+    <w:p>
+      <w:r>
+        <w:t>Distance measures how far the worm travels through the environment. Total distance provides insight into exploration strategy; distance per tick reveals movement efficiency in relation to time spent.</w:t>
+      </w:r>
+    </w:p>
+    <w:p>
+      <w:pPr>
+        <w:pStyle w:val="Heading4"/>
+      </w:pPr>
+      <w:r>
+        <w:t>3.4.1. Distance Traveled (Absolute)</w:t>
+      </w:r>
+    </w:p>
+    <w:p>
       <w:r>
         <w:drawing>
           <wp:inline xmlns:a="http://schemas.openxmlformats.org/drawingml/2006/main" xmlns:pic="http://schemas.openxmlformats.org/drawingml/2006/picture">
-            <wp:extent cx="5486400" cy="3607410"/>
-            <wp:docPr id="4" name="Picture 4"/>
+            <wp:extent cx="5486400" cy="3610547"/>
+            <wp:docPr id="5" name="Picture 5"/>
             <wp:cNvGraphicFramePr>
               <a:graphicFrameLocks noChangeAspect="1"/>
             </wp:cNvGraphicFramePr>
@@ -2568,11 +1362,11 @@
               <a:graphicData uri="http://schemas.openxmlformats.org/drawingml/2006/picture">
                 <pic:pic>
                   <pic:nvPicPr>
-                    <pic:cNvPr id="0" name="decision_accuracy_median_survival.png"/>
+                    <pic:cNvPr id="0" name="comp_distance_median_survival.png"/>
                     <pic:cNvPicPr/>
                   </pic:nvPicPr>
                   <pic:blipFill>
-                    <a:blip r:embed="rId12"/>
+                    <a:blip r:embed="rId13"/>
                     <a:stretch>
                       <a:fillRect/>
                     </a:stretch>
@@ -2580,7 +1374,7 @@
                   <pic:spPr>
                     <a:xfrm>
                       <a:off x="0" y="0"/>
-                      <a:ext cx="5486400" cy="3607410"/>
+                      <a:ext cx="5486400" cy="3610547"/>
                     </a:xfrm>
                     <a:prstGeom prst="rect"/>
                   </pic:spPr>
@@ -2592,27 +1386,6 @@
       </w:r>
     </w:p>
     <w:p/>
-    <w:p>
-      <w:pPr>
-        <w:pStyle w:val="Heading2"/>
-      </w:pPr>
-      <w:r>
-        <w:t>3.3. Distance travelled</w:t>
-      </w:r>
-    </w:p>
-    <w:p>
-      <w:r>
-        <w:t>Distance travelled total and normalized per tick for lifespan differences. We compare movement patterns between successful and unsuccessful variants to understand how spatial exploration versus local exploitation correlates with fitness.</w:t>
-      </w:r>
-    </w:p>
-    <w:p>
-      <w:pPr>
-        <w:pStyle w:val="Heading3"/>
-      </w:pPr>
-      <w:r>
-        <w:t>3.3.1. Distance travelled absolute</w:t>
-      </w:r>
-    </w:p>
     <w:tbl>
       <w:tblPr>
         <w:tblStyle w:val="LightGrid-Accent1"/>
@@ -2850,6 +1623,9 @@
       </w:tr>
     </w:tbl>
     <w:p>
+      <w:pPr>
+        <w:pStyle w:val="Heading3"/>
+      </w:pPr>
       <w:r>
         <w:t>Differences between successful and unsuccessful random variants (Mann-Whitney U):</w:t>
       </w:r>
@@ -2903,7 +1679,7 @@
           </w:tcPr>
           <w:p>
             <w:r>
-              <w:t>1062892.0</w:t>
+              <w:t>1062892.0000</w:t>
             </w:r>
           </w:p>
         </w:tc>
@@ -2933,369 +1709,42 @@
     </w:tbl>
     <w:p/>
     <w:p>
+      <w:pPr>
+        <w:pStyle w:val="Heading3"/>
+      </w:pPr>
       <w:r>
-        <w:drawing>
-          <wp:inline xmlns:a="http://schemas.openxmlformats.org/drawingml/2006/main" xmlns:pic="http://schemas.openxmlformats.org/drawingml/2006/picture">
-            <wp:extent cx="5486400" cy="3610547"/>
-            <wp:docPr id="5" name="Picture 5"/>
-            <wp:cNvGraphicFramePr>
-              <a:graphicFrameLocks noChangeAspect="1"/>
-            </wp:cNvGraphicFramePr>
-            <a:graphic>
-              <a:graphicData uri="http://schemas.openxmlformats.org/drawingml/2006/picture">
-                <pic:pic>
-                  <pic:nvPicPr>
-                    <pic:cNvPr id="0" name="distance_median_survival.png"/>
-                    <pic:cNvPicPr/>
-                  </pic:nvPicPr>
-                  <pic:blipFill>
-                    <a:blip r:embed="rId13"/>
-                    <a:stretch>
-                      <a:fillRect/>
-                    </a:stretch>
-                  </pic:blipFill>
-                  <pic:spPr>
-                    <a:xfrm>
-                      <a:off x="0" y="0"/>
-                      <a:ext cx="5486400" cy="3610547"/>
-                    </a:xfrm>
-                    <a:prstGeom prst="rect"/>
-                  </pic:spPr>
-                </pic:pic>
-              </a:graphicData>
-            </a:graphic>
-          </wp:inline>
-        </w:drawing>
+        <w:t>TBD - Interpretation of distance differences.</w:t>
       </w:r>
     </w:p>
-    <w:p/>
+    <w:p>
+      <w:pPr>
+        <w:pStyle w:val="Heading4"/>
+      </w:pPr>
+      <w:r>
+        <w:t>3.4.2. Distance Per Tick (Normalized)</w:t>
+      </w:r>
+    </w:p>
     <w:p>
       <w:pPr>
         <w:pStyle w:val="Heading3"/>
       </w:pPr>
       <w:r>
-        <w:t>3.3.2. Distance travelled per tick</w:t>
+        <w:t>3.5. Food Consumption</w:t>
       </w:r>
     </w:p>
-    <w:tbl>
-      <w:tblPr>
-        <w:tblStyle w:val="LightGrid-Accent1"/>
-        <w:tblW w:type="auto" w:w="0"/>
-        <w:tblLook w:firstColumn="1" w:firstRow="1" w:lastColumn="0" w:lastRow="0" w:noHBand="0" w:noVBand="1" w:val="04A0"/>
-      </w:tblPr>
-      <w:tblGrid>
-        <w:gridCol w:w="2880"/>
-        <w:gridCol w:w="2880"/>
-        <w:gridCol w:w="2880"/>
-      </w:tblGrid>
-      <w:tr>
-        <w:tc>
-          <w:tcPr>
-            <w:tcW w:type="dxa" w:w="2880"/>
-          </w:tcPr>
-          <w:p>
-            <w:r>
-              <w:t>Metric</w:t>
-            </w:r>
-          </w:p>
-        </w:tc>
-        <w:tc>
-          <w:tcPr>
-            <w:tcW w:type="dxa" w:w="2880"/>
-          </w:tcPr>
-          <w:p>
-            <w:r>
-              <w:t>Successful (Top 10%)</w:t>
-            </w:r>
-          </w:p>
-        </w:tc>
-        <w:tc>
-          <w:tcPr>
-            <w:tcW w:type="dxa" w:w="2880"/>
-          </w:tcPr>
-          <w:p>
-            <w:r>
-              <w:t>Unsuccessful (Bottom 10%)</w:t>
-            </w:r>
-          </w:p>
-        </w:tc>
-      </w:tr>
-      <w:tr>
-        <w:tc>
-          <w:tcPr>
-            <w:tcW w:type="dxa" w:w="2880"/>
-          </w:tcPr>
-          <w:p>
-            <w:r>
-              <w:t>Number of runs</w:t>
-            </w:r>
-          </w:p>
-        </w:tc>
-        <w:tc>
-          <w:tcPr>
-            <w:tcW w:type="dxa" w:w="2880"/>
-          </w:tcPr>
-          <w:p>
-            <w:r>
-              <w:t>300</w:t>
-            </w:r>
-          </w:p>
-        </w:tc>
-        <w:tc>
-          <w:tcPr>
-            <w:tcW w:type="dxa" w:w="2880"/>
-          </w:tcPr>
-          <w:p>
-            <w:r>
-              <w:t>39400</w:t>
-            </w:r>
-          </w:p>
-        </w:tc>
-      </w:tr>
-      <w:tr>
-        <w:tc>
-          <w:tcPr>
-            <w:tcW w:type="dxa" w:w="2880"/>
-          </w:tcPr>
-          <w:p>
-            <w:r>
-              <w:t>Mean</w:t>
-            </w:r>
-          </w:p>
-        </w:tc>
-        <w:tc>
-          <w:tcPr>
-            <w:tcW w:type="dxa" w:w="2880"/>
-          </w:tcPr>
-          <w:p>
-            <w:r>
-              <w:t>0.752</w:t>
-            </w:r>
-          </w:p>
-        </w:tc>
-        <w:tc>
-          <w:tcPr>
-            <w:tcW w:type="dxa" w:w="2880"/>
-          </w:tcPr>
-          <w:p>
-            <w:r>
-              <w:t>0.824</w:t>
-            </w:r>
-          </w:p>
-        </w:tc>
-      </w:tr>
-      <w:tr>
-        <w:tc>
-          <w:tcPr>
-            <w:tcW w:type="dxa" w:w="2880"/>
-          </w:tcPr>
-          <w:p>
-            <w:r>
-              <w:t>Median</w:t>
-            </w:r>
-          </w:p>
-        </w:tc>
-        <w:tc>
-          <w:tcPr>
-            <w:tcW w:type="dxa" w:w="2880"/>
-          </w:tcPr>
-          <w:p>
-            <w:r>
-              <w:t>0.776</w:t>
-            </w:r>
-          </w:p>
-        </w:tc>
-        <w:tc>
-          <w:tcPr>
-            <w:tcW w:type="dxa" w:w="2880"/>
-          </w:tcPr>
-          <w:p>
-            <w:r>
-              <w:t>0.875</w:t>
-            </w:r>
-          </w:p>
-        </w:tc>
-      </w:tr>
-      <w:tr>
-        <w:tc>
-          <w:tcPr>
-            <w:tcW w:type="dxa" w:w="2880"/>
-          </w:tcPr>
-          <w:p>
-            <w:r>
-              <w:t>Std Dev</w:t>
-            </w:r>
-          </w:p>
-        </w:tc>
-        <w:tc>
-          <w:tcPr>
-            <w:tcW w:type="dxa" w:w="2880"/>
-          </w:tcPr>
-          <w:p>
-            <w:r>
-              <w:t>0.103</w:t>
-            </w:r>
-          </w:p>
-        </w:tc>
-        <w:tc>
-          <w:tcPr>
-            <w:tcW w:type="dxa" w:w="2880"/>
-          </w:tcPr>
-          <w:p>
-            <w:r>
-              <w:t>0.153</w:t>
-            </w:r>
-          </w:p>
-        </w:tc>
-      </w:tr>
-      <w:tr>
-        <w:tc>
-          <w:tcPr>
-            <w:tcW w:type="dxa" w:w="2880"/>
-          </w:tcPr>
-          <w:p>
-            <w:r>
-              <w:t>Min</w:t>
-            </w:r>
-          </w:p>
-        </w:tc>
-        <w:tc>
-          <w:tcPr>
-            <w:tcW w:type="dxa" w:w="2880"/>
-          </w:tcPr>
-          <w:p>
-            <w:r>
-              <w:t>0.357</w:t>
-            </w:r>
-          </w:p>
-        </w:tc>
-        <w:tc>
-          <w:tcPr>
-            <w:tcW w:type="dxa" w:w="2880"/>
-          </w:tcPr>
-          <w:p>
-            <w:r>
-              <w:t>0.000</w:t>
-            </w:r>
-          </w:p>
-        </w:tc>
-      </w:tr>
-      <w:tr>
-        <w:tc>
-          <w:tcPr>
-            <w:tcW w:type="dxa" w:w="2880"/>
-          </w:tcPr>
-          <w:p>
-            <w:r>
-              <w:t>Max</w:t>
-            </w:r>
-          </w:p>
-        </w:tc>
-        <w:tc>
-          <w:tcPr>
-            <w:tcW w:type="dxa" w:w="2880"/>
-          </w:tcPr>
-          <w:p>
-            <w:r>
-              <w:t>0.938</w:t>
-            </w:r>
-          </w:p>
-        </w:tc>
-        <w:tc>
-          <w:tcPr>
-            <w:tcW w:type="dxa" w:w="2880"/>
-          </w:tcPr>
-          <w:p>
-            <w:r>
-              <w:t>0.938</w:t>
-            </w:r>
-          </w:p>
-        </w:tc>
-      </w:tr>
-    </w:tbl>
     <w:p>
       <w:r>
-        <w:t>Differences between successful and unsuccessful random variants (Mann-Whitney U):</w:t>
+        <w:t>Food consumption measures the number of food items eaten by the worm. Total foods shows absolute consumption; foods per tick reveals feeding efficiency relative to time.</w:t>
       </w:r>
     </w:p>
-    <w:tbl>
-      <w:tblPr>
-        <w:tblStyle w:val="LightGrid-Accent1"/>
-        <w:tblW w:type="auto" w:w="0"/>
-        <w:tblLook w:firstColumn="1" w:firstRow="1" w:lastColumn="0" w:lastRow="0" w:noHBand="0" w:noVBand="1" w:val="04A0"/>
-      </w:tblPr>
-      <w:tblGrid>
-        <w:gridCol w:w="4320"/>
-        <w:gridCol w:w="4320"/>
-      </w:tblGrid>
-      <w:tr>
-        <w:tc>
-          <w:tcPr>
-            <w:tcW w:type="dxa" w:w="4320"/>
-          </w:tcPr>
-          <w:p>
-            <w:r>
-              <w:t>Test Statistic</w:t>
-            </w:r>
-          </w:p>
-        </w:tc>
-        <w:tc>
-          <w:tcPr>
-            <w:tcW w:type="dxa" w:w="4320"/>
-          </w:tcPr>
-          <w:p>
-            <w:r>
-              <w:t>Value</w:t>
-            </w:r>
-          </w:p>
-        </w:tc>
-      </w:tr>
-      <w:tr>
-        <w:tc>
-          <w:tcPr>
-            <w:tcW w:type="dxa" w:w="4320"/>
-          </w:tcPr>
-          <w:p>
-            <w:r>
-              <w:t>U-statistic</w:t>
-            </w:r>
-          </w:p>
-        </w:tc>
-        <w:tc>
-          <w:tcPr>
-            <w:tcW w:type="dxa" w:w="4320"/>
-          </w:tcPr>
-          <w:p>
-            <w:r>
-              <w:t>8745068.5</w:t>
-            </w:r>
-          </w:p>
-        </w:tc>
-      </w:tr>
-      <w:tr>
-        <w:tc>
-          <w:tcPr>
-            <w:tcW w:type="dxa" w:w="4320"/>
-          </w:tcPr>
-          <w:p>
-            <w:r>
-              <w:t>p-value</w:t>
-            </w:r>
-          </w:p>
-        </w:tc>
-        <w:tc>
-          <w:tcPr>
-            <w:tcW w:type="dxa" w:w="4320"/>
-          </w:tcPr>
-          <w:p>
-            <w:r>
-              <w:t>3.1366e-48</w:t>
-            </w:r>
-          </w:p>
-        </w:tc>
-      </w:tr>
-    </w:tbl>
-    <w:p/>
+    <w:p>
+      <w:pPr>
+        <w:pStyle w:val="Heading4"/>
+      </w:pPr>
+      <w:r>
+        <w:t>3.5.1. Food Consumption (Absolute)</w:t>
+      </w:r>
+    </w:p>
     <w:p>
       <w:r>
         <w:drawing>
@@ -3309,7 +1758,7 @@
               <a:graphicData uri="http://schemas.openxmlformats.org/drawingml/2006/picture">
                 <pic:pic>
                   <pic:nvPicPr>
-                    <pic:cNvPr id="0" name="distance_per_tick_median_survival.png"/>
+                    <pic:cNvPr id="0" name="comp_foods_median_survival.png"/>
                     <pic:cNvPicPr/>
                   </pic:nvPicPr>
                   <pic:blipFill>
@@ -3333,27 +1782,6 @@
       </w:r>
     </w:p>
     <w:p/>
-    <w:p>
-      <w:pPr>
-        <w:pStyle w:val="Heading2"/>
-      </w:pPr>
-      <w:r>
-        <w:t>3.4. Food eaten</w:t>
-      </w:r>
-    </w:p>
-    <w:p>
-      <w:r>
-        <w:t>Food consumption is the ultimate solution of the task. The more food consumed, the longer the survival. Normalized per tick food consumption may be the metric most directly linked to survival fitness.</w:t>
-      </w:r>
-    </w:p>
-    <w:p>
-      <w:pPr>
-        <w:pStyle w:val="Heading3"/>
-      </w:pPr>
-      <w:r>
-        <w:t>3.4.1. Food consumption absolute</w:t>
-      </w:r>
-    </w:p>
     <w:tbl>
       <w:tblPr>
         <w:tblStyle w:val="LightGrid-Accent1"/>
@@ -3591,6 +2019,9 @@
       </w:tr>
     </w:tbl>
     <w:p>
+      <w:pPr>
+        <w:pStyle w:val="Heading3"/>
+      </w:pPr>
       <w:r>
         <w:t>Differences between successful and unsuccessful random variants (Mann-Whitney U):</w:t>
       </w:r>
@@ -3644,7 +2075,7 @@
           </w:tcPr>
           <w:p>
             <w:r>
-              <w:t>797037.5</w:t>
+              <w:t>797037.5000</w:t>
             </w:r>
           </w:p>
         </w:tc>
@@ -3674,406 +2105,21 @@
     </w:tbl>
     <w:p/>
     <w:p>
-      <w:r>
-        <w:drawing>
-          <wp:inline xmlns:a="http://schemas.openxmlformats.org/drawingml/2006/main" xmlns:pic="http://schemas.openxmlformats.org/drawingml/2006/picture">
-            <wp:extent cx="5486400" cy="3610547"/>
-            <wp:docPr id="7" name="Picture 7"/>
-            <wp:cNvGraphicFramePr>
-              <a:graphicFrameLocks noChangeAspect="1"/>
-            </wp:cNvGraphicFramePr>
-            <a:graphic>
-              <a:graphicData uri="http://schemas.openxmlformats.org/drawingml/2006/picture">
-                <pic:pic>
-                  <pic:nvPicPr>
-                    <pic:cNvPr id="0" name="foods_median_survival.png"/>
-                    <pic:cNvPicPr/>
-                  </pic:nvPicPr>
-                  <pic:blipFill>
-                    <a:blip r:embed="rId15"/>
-                    <a:stretch>
-                      <a:fillRect/>
-                    </a:stretch>
-                  </pic:blipFill>
-                  <pic:spPr>
-                    <a:xfrm>
-                      <a:off x="0" y="0"/>
-                      <a:ext cx="5486400" cy="3610547"/>
-                    </a:xfrm>
-                    <a:prstGeom prst="rect"/>
-                  </pic:spPr>
-                </pic:pic>
-              </a:graphicData>
-            </a:graphic>
-          </wp:inline>
-        </w:drawing>
-      </w:r>
-    </w:p>
-    <w:p/>
-    <w:p>
       <w:pPr>
         <w:pStyle w:val="Heading3"/>
       </w:pPr>
       <w:r>
-        <w:t>3.4.2. Food consumption per tick</w:t>
+        <w:t>TBD - Interpretation of food consumption differences.</w:t>
       </w:r>
     </w:p>
-    <w:tbl>
-      <w:tblPr>
-        <w:tblStyle w:val="LightGrid-Accent1"/>
-        <w:tblW w:type="auto" w:w="0"/>
-        <w:tblLook w:firstColumn="1" w:firstRow="1" w:lastColumn="0" w:lastRow="0" w:noHBand="0" w:noVBand="1" w:val="04A0"/>
-      </w:tblPr>
-      <w:tblGrid>
-        <w:gridCol w:w="2880"/>
-        <w:gridCol w:w="2880"/>
-        <w:gridCol w:w="2880"/>
-      </w:tblGrid>
-      <w:tr>
-        <w:tc>
-          <w:tcPr>
-            <w:tcW w:type="dxa" w:w="2880"/>
-          </w:tcPr>
-          <w:p>
-            <w:r>
-              <w:t>Metric</w:t>
-            </w:r>
-          </w:p>
-        </w:tc>
-        <w:tc>
-          <w:tcPr>
-            <w:tcW w:type="dxa" w:w="2880"/>
-          </w:tcPr>
-          <w:p>
-            <w:r>
-              <w:t>Successful (Top 10%)</w:t>
-            </w:r>
-          </w:p>
-        </w:tc>
-        <w:tc>
-          <w:tcPr>
-            <w:tcW w:type="dxa" w:w="2880"/>
-          </w:tcPr>
-          <w:p>
-            <w:r>
-              <w:t>Unsuccessful (Bottom 10%)</w:t>
-            </w:r>
-          </w:p>
-        </w:tc>
-      </w:tr>
-      <w:tr>
-        <w:tc>
-          <w:tcPr>
-            <w:tcW w:type="dxa" w:w="2880"/>
-          </w:tcPr>
-          <w:p>
-            <w:r>
-              <w:t>Number of runs</w:t>
-            </w:r>
-          </w:p>
-        </w:tc>
-        <w:tc>
-          <w:tcPr>
-            <w:tcW w:type="dxa" w:w="2880"/>
-          </w:tcPr>
-          <w:p>
-            <w:r>
-              <w:t>300</w:t>
-            </w:r>
-          </w:p>
-        </w:tc>
-        <w:tc>
-          <w:tcPr>
-            <w:tcW w:type="dxa" w:w="2880"/>
-          </w:tcPr>
-          <w:p>
-            <w:r>
-              <w:t>39400</w:t>
-            </w:r>
-          </w:p>
-        </w:tc>
-      </w:tr>
-      <w:tr>
-        <w:tc>
-          <w:tcPr>
-            <w:tcW w:type="dxa" w:w="2880"/>
-          </w:tcPr>
-          <w:p>
-            <w:r>
-              <w:t>Mean</w:t>
-            </w:r>
-          </w:p>
-        </w:tc>
-        <w:tc>
-          <w:tcPr>
-            <w:tcW w:type="dxa" w:w="2880"/>
-          </w:tcPr>
-          <w:p>
-            <w:r>
-              <w:t>0.137</w:t>
-            </w:r>
-          </w:p>
-        </w:tc>
-        <w:tc>
-          <w:tcPr>
-            <w:tcW w:type="dxa" w:w="2880"/>
-          </w:tcPr>
-          <w:p>
-            <w:r>
-              <w:t>0.022</w:t>
-            </w:r>
-          </w:p>
-        </w:tc>
-      </w:tr>
-      <w:tr>
-        <w:tc>
-          <w:tcPr>
-            <w:tcW w:type="dxa" w:w="2880"/>
-          </w:tcPr>
-          <w:p>
-            <w:r>
-              <w:t>Median</w:t>
-            </w:r>
-          </w:p>
-        </w:tc>
-        <w:tc>
-          <w:tcPr>
-            <w:tcW w:type="dxa" w:w="2880"/>
-          </w:tcPr>
-          <w:p>
-            <w:r>
-              <w:t>0.152</w:t>
-            </w:r>
-          </w:p>
-        </w:tc>
-        <w:tc>
-          <w:tcPr>
-            <w:tcW w:type="dxa" w:w="2880"/>
-          </w:tcPr>
-          <w:p>
-            <w:r>
-              <w:t>0.000</w:t>
-            </w:r>
-          </w:p>
-        </w:tc>
-      </w:tr>
-      <w:tr>
-        <w:tc>
-          <w:tcPr>
-            <w:tcW w:type="dxa" w:w="2880"/>
-          </w:tcPr>
-          <w:p>
-            <w:r>
-              <w:t>Std Dev</w:t>
-            </w:r>
-          </w:p>
-        </w:tc>
-        <w:tc>
-          <w:tcPr>
-            <w:tcW w:type="dxa" w:w="2880"/>
-          </w:tcPr>
-          <w:p>
-            <w:r>
-              <w:t>0.054</w:t>
-            </w:r>
-          </w:p>
-        </w:tc>
-        <w:tc>
-          <w:tcPr>
-            <w:tcW w:type="dxa" w:w="2880"/>
-          </w:tcPr>
-          <w:p>
-            <w:r>
-              <w:t>0.031</w:t>
-            </w:r>
-          </w:p>
-        </w:tc>
-      </w:tr>
-      <w:tr>
-        <w:tc>
-          <w:tcPr>
-            <w:tcW w:type="dxa" w:w="2880"/>
-          </w:tcPr>
-          <w:p>
-            <w:r>
-              <w:t>Min</w:t>
-            </w:r>
-          </w:p>
-        </w:tc>
-        <w:tc>
-          <w:tcPr>
-            <w:tcW w:type="dxa" w:w="2880"/>
-          </w:tcPr>
-          <w:p>
-            <w:r>
-              <w:t>0.000</w:t>
-            </w:r>
-          </w:p>
-        </w:tc>
-        <w:tc>
-          <w:tcPr>
-            <w:tcW w:type="dxa" w:w="2880"/>
-          </w:tcPr>
-          <w:p>
-            <w:r>
-              <w:t>0.000</w:t>
-            </w:r>
-          </w:p>
-        </w:tc>
-      </w:tr>
-      <w:tr>
-        <w:tc>
-          <w:tcPr>
-            <w:tcW w:type="dxa" w:w="2880"/>
-          </w:tcPr>
-          <w:p>
-            <w:r>
-              <w:t>Max</w:t>
-            </w:r>
-          </w:p>
-        </w:tc>
-        <w:tc>
-          <w:tcPr>
-            <w:tcW w:type="dxa" w:w="2880"/>
-          </w:tcPr>
-          <w:p>
-            <w:r>
-              <w:t>0.227</w:t>
-            </w:r>
-          </w:p>
-        </w:tc>
-        <w:tc>
-          <w:tcPr>
-            <w:tcW w:type="dxa" w:w="2880"/>
-          </w:tcPr>
-          <w:p>
-            <w:r>
-              <w:t>0.185</w:t>
-            </w:r>
-          </w:p>
-        </w:tc>
-      </w:tr>
-    </w:tbl>
     <w:p>
+      <w:pPr>
+        <w:pStyle w:val="Heading4"/>
+      </w:pPr>
       <w:r>
-        <w:t>Differences between successful and unsuccessful random variants (Mann-Whitney U):</w:t>
+        <w:t>3.5.2. Food Per Tick (Normalized)</w:t>
       </w:r>
     </w:p>
-    <w:tbl>
-      <w:tblPr>
-        <w:tblStyle w:val="LightGrid-Accent1"/>
-        <w:tblW w:type="auto" w:w="0"/>
-        <w:tblLook w:firstColumn="1" w:firstRow="1" w:lastColumn="0" w:lastRow="0" w:noHBand="0" w:noVBand="1" w:val="04A0"/>
-      </w:tblPr>
-      <w:tblGrid>
-        <w:gridCol w:w="4320"/>
-        <w:gridCol w:w="4320"/>
-      </w:tblGrid>
-      <w:tr>
-        <w:tc>
-          <w:tcPr>
-            <w:tcW w:type="dxa" w:w="4320"/>
-          </w:tcPr>
-          <w:p>
-            <w:r>
-              <w:t>Test Statistic</w:t>
-            </w:r>
-          </w:p>
-        </w:tc>
-        <w:tc>
-          <w:tcPr>
-            <w:tcW w:type="dxa" w:w="4320"/>
-          </w:tcPr>
-          <w:p>
-            <w:r>
-              <w:t>Value</w:t>
-            </w:r>
-          </w:p>
-        </w:tc>
-      </w:tr>
-      <w:tr>
-        <w:tc>
-          <w:tcPr>
-            <w:tcW w:type="dxa" w:w="4320"/>
-          </w:tcPr>
-          <w:p>
-            <w:r>
-              <w:t>U-statistic</w:t>
-            </w:r>
-          </w:p>
-        </w:tc>
-        <w:tc>
-          <w:tcPr>
-            <w:tcW w:type="dxa" w:w="4320"/>
-          </w:tcPr>
-          <w:p>
-            <w:r>
-              <w:t>764851.5</w:t>
-            </w:r>
-          </w:p>
-        </w:tc>
-      </w:tr>
-      <w:tr>
-        <w:tc>
-          <w:tcPr>
-            <w:tcW w:type="dxa" w:w="4320"/>
-          </w:tcPr>
-          <w:p>
-            <w:r>
-              <w:t>p-value</w:t>
-            </w:r>
-          </w:p>
-        </w:tc>
-        <w:tc>
-          <w:tcPr>
-            <w:tcW w:type="dxa" w:w="4320"/>
-          </w:tcPr>
-          <w:p>
-            <w:r>
-              <w:t>3.3969e-191</w:t>
-            </w:r>
-          </w:p>
-        </w:tc>
-      </w:tr>
-    </w:tbl>
-    <w:p/>
-    <w:p>
-      <w:r>
-        <w:drawing>
-          <wp:inline xmlns:a="http://schemas.openxmlformats.org/drawingml/2006/main" xmlns:pic="http://schemas.openxmlformats.org/drawingml/2006/picture">
-            <wp:extent cx="5486400" cy="3610547"/>
-            <wp:docPr id="8" name="Picture 8"/>
-            <wp:cNvGraphicFramePr>
-              <a:graphicFrameLocks noChangeAspect="1"/>
-            </wp:cNvGraphicFramePr>
-            <a:graphic>
-              <a:graphicData uri="http://schemas.openxmlformats.org/drawingml/2006/picture">
-                <pic:pic>
-                  <pic:nvPicPr>
-                    <pic:cNvPr id="0" name="foods_per_tick_median_survival.png"/>
-                    <pic:cNvPicPr/>
-                  </pic:nvPicPr>
-                  <pic:blipFill>
-                    <a:blip r:embed="rId16"/>
-                    <a:stretch>
-                      <a:fillRect/>
-                    </a:stretch>
-                  </pic:blipFill>
-                  <pic:spPr>
-                    <a:xfrm>
-                      <a:off x="0" y="0"/>
-                      <a:ext cx="5486400" cy="3610547"/>
-                    </a:xfrm>
-                    <a:prstGeom prst="rect"/>
-                  </pic:spPr>
-                </pic:pic>
-              </a:graphicData>
-            </a:graphic>
-          </wp:inline>
-        </w:drawing>
-      </w:r>
-    </w:p>
-    <w:p/>
     <w:sectPr>
       <w:pgSz w:w="12240" w:h="15840"/>
       <w:pgMar w:top="1440" w:right="1800" w:bottom="1440" w:left="1800" w:header="720" w:footer="720" w:gutter="0"/>

</xml_diff>

<commit_message>
fixed the report...finally...what a mess
</commit_message>
<xml_diff>
--- a/data/random_no_regrow/analysis/median_survival/report_median_survival.docx
+++ b/data/random_no_regrow/analysis/median_survival/report_median_survival.docx
@@ -418,6 +418,657 @@
     </w:tbl>
     <w:p>
       <w:pPr>
+        <w:pStyle w:val="Heading3"/>
+      </w:pPr>
+      <w:r>
+        <w:t>Per-variant Summary (Highest, Lowest, Average across variants):</w:t>
+      </w:r>
+    </w:p>
+    <w:tbl>
+      <w:tblPr>
+        <w:tblStyle w:val="LightGrid-Accent1"/>
+        <w:tblW w:type="auto" w:w="0"/>
+        <w:tblLook w:firstColumn="1" w:firstRow="1" w:lastColumn="0" w:lastRow="0" w:noHBand="0" w:noVBand="1" w:val="04A0"/>
+      </w:tblPr>
+      <w:tblGrid>
+        <w:gridCol w:w="2160"/>
+        <w:gridCol w:w="2160"/>
+        <w:gridCol w:w="2160"/>
+        <w:gridCol w:w="2160"/>
+      </w:tblGrid>
+      <w:tr>
+        <w:tc>
+          <w:tcPr>
+            <w:tcW w:type="dxa" w:w="2160"/>
+          </w:tcPr>
+          <w:p>
+            <w:r>
+              <w:t>Statistic</w:t>
+            </w:r>
+          </w:p>
+        </w:tc>
+        <w:tc>
+          <w:tcPr>
+            <w:tcW w:type="dxa" w:w="2160"/>
+          </w:tcPr>
+          <w:p>
+            <w:r>
+              <w:t>Highest (variant)</w:t>
+            </w:r>
+          </w:p>
+        </w:tc>
+        <w:tc>
+          <w:tcPr>
+            <w:tcW w:type="dxa" w:w="2160"/>
+          </w:tcPr>
+          <w:p>
+            <w:r>
+              <w:t>Lowest (variant)</w:t>
+            </w:r>
+          </w:p>
+        </w:tc>
+        <w:tc>
+          <w:tcPr>
+            <w:tcW w:type="dxa" w:w="2160"/>
+          </w:tcPr>
+          <w:p>
+            <w:r>
+              <w:t>Average (across variants)</w:t>
+            </w:r>
+          </w:p>
+        </w:tc>
+      </w:tr>
+      <w:tr>
+        <w:tc>
+          <w:tcPr>
+            <w:tcW w:type="dxa" w:w="2160"/>
+          </w:tcPr>
+          <w:p>
+            <w:r>
+              <w:t>Mean</w:t>
+            </w:r>
+          </w:p>
+        </w:tc>
+        <w:tc>
+          <w:tcPr>
+            <w:tcW w:type="dxa" w:w="2160"/>
+          </w:tcPr>
+          <w:p>
+            <w:r>
+              <w:t>135.72 ticks (variant_819)</w:t>
+            </w:r>
+          </w:p>
+        </w:tc>
+        <w:tc>
+          <w:tcPr>
+            <w:tcW w:type="dxa" w:w="2160"/>
+          </w:tcPr>
+          <w:p>
+            <w:r>
+              <w:t>16.00 ticks (variant_269)</w:t>
+            </w:r>
+          </w:p>
+        </w:tc>
+        <w:tc>
+          <w:tcPr>
+            <w:tcW w:type="dxa" w:w="2160"/>
+          </w:tcPr>
+          <w:p>
+            <w:r>
+              <w:t>33.93 ticks</w:t>
+            </w:r>
+          </w:p>
+        </w:tc>
+      </w:tr>
+      <w:tr>
+        <w:tc>
+          <w:tcPr>
+            <w:tcW w:type="dxa" w:w="2160"/>
+          </w:tcPr>
+          <w:p>
+            <w:r>
+              <w:t>Median</w:t>
+            </w:r>
+          </w:p>
+        </w:tc>
+        <w:tc>
+          <w:tcPr>
+            <w:tcW w:type="dxa" w:w="2160"/>
+          </w:tcPr>
+          <w:p>
+            <w:r>
+              <w:t>110.00 ticks (variant_639)</w:t>
+            </w:r>
+          </w:p>
+        </w:tc>
+        <w:tc>
+          <w:tcPr>
+            <w:tcW w:type="dxa" w:w="2160"/>
+          </w:tcPr>
+          <w:p>
+            <w:r>
+              <w:t>16.00 ticks (variant_105)</w:t>
+            </w:r>
+          </w:p>
+        </w:tc>
+        <w:tc>
+          <w:tcPr>
+            <w:tcW w:type="dxa" w:w="2160"/>
+          </w:tcPr>
+          <w:p>
+            <w:r>
+              <w:t>28.56 ticks</w:t>
+            </w:r>
+          </w:p>
+        </w:tc>
+      </w:tr>
+      <w:tr>
+        <w:tc>
+          <w:tcPr>
+            <w:tcW w:type="dxa" w:w="2160"/>
+          </w:tcPr>
+          <w:p>
+            <w:r>
+              <w:t>Std Dev</w:t>
+            </w:r>
+          </w:p>
+        </w:tc>
+        <w:tc>
+          <w:tcPr>
+            <w:tcW w:type="dxa" w:w="2160"/>
+          </w:tcPr>
+          <w:p>
+            <w:r>
+              <w:t>127.58 ticks (variant_195)</w:t>
+            </w:r>
+          </w:p>
+        </w:tc>
+        <w:tc>
+          <w:tcPr>
+            <w:tcW w:type="dxa" w:w="2160"/>
+          </w:tcPr>
+          <w:p>
+            <w:r>
+              <w:t>0.00 ticks (variant_269)</w:t>
+            </w:r>
+          </w:p>
+        </w:tc>
+        <w:tc>
+          <w:tcPr>
+            <w:tcW w:type="dxa" w:w="2160"/>
+          </w:tcPr>
+          <w:p>
+            <w:r>
+              <w:t>16.58 ticks</w:t>
+            </w:r>
+          </w:p>
+        </w:tc>
+      </w:tr>
+      <w:tr>
+        <w:tc>
+          <w:tcPr>
+            <w:tcW w:type="dxa" w:w="2160"/>
+          </w:tcPr>
+          <w:p>
+            <w:r>
+              <w:t>Min</w:t>
+            </w:r>
+          </w:p>
+        </w:tc>
+        <w:tc>
+          <w:tcPr>
+            <w:tcW w:type="dxa" w:w="2160"/>
+          </w:tcPr>
+          <w:p>
+            <w:r>
+              <w:t>30.00 ticks (variant_461)</w:t>
+            </w:r>
+          </w:p>
+        </w:tc>
+        <w:tc>
+          <w:tcPr>
+            <w:tcW w:type="dxa" w:w="2160"/>
+          </w:tcPr>
+          <w:p>
+            <w:r>
+              <w:t>16.00 ticks (variant_02)</w:t>
+            </w:r>
+          </w:p>
+        </w:tc>
+        <w:tc>
+          <w:tcPr>
+            <w:tcW w:type="dxa" w:w="2160"/>
+          </w:tcPr>
+          <w:p>
+            <w:r>
+              <w:t>17.89 ticks</w:t>
+            </w:r>
+          </w:p>
+        </w:tc>
+      </w:tr>
+      <w:tr>
+        <w:tc>
+          <w:tcPr>
+            <w:tcW w:type="dxa" w:w="2160"/>
+          </w:tcPr>
+          <w:p>
+            <w:r>
+              <w:t>Max</w:t>
+            </w:r>
+          </w:p>
+        </w:tc>
+        <w:tc>
+          <w:tcPr>
+            <w:tcW w:type="dxa" w:w="2160"/>
+          </w:tcPr>
+          <w:p>
+            <w:r>
+              <w:t>795.00 ticks (variant_195)</w:t>
+            </w:r>
+          </w:p>
+        </w:tc>
+        <w:tc>
+          <w:tcPr>
+            <w:tcW w:type="dxa" w:w="2160"/>
+          </w:tcPr>
+          <w:p>
+            <w:r>
+              <w:t>16.00 ticks (variant_269)</w:t>
+            </w:r>
+          </w:p>
+        </w:tc>
+        <w:tc>
+          <w:tcPr>
+            <w:tcW w:type="dxa" w:w="2160"/>
+          </w:tcPr>
+          <w:p>
+            <w:r>
+              <w:t>103.67 ticks</w:t>
+            </w:r>
+          </w:p>
+        </w:tc>
+      </w:tr>
+      <w:tr>
+        <w:tc>
+          <w:tcPr>
+            <w:tcW w:type="dxa" w:w="2160"/>
+          </w:tcPr>
+          <w:p>
+            <w:r>
+              <w:t>Range</w:t>
+            </w:r>
+          </w:p>
+        </w:tc>
+        <w:tc>
+          <w:tcPr>
+            <w:tcW w:type="dxa" w:w="2160"/>
+          </w:tcPr>
+          <w:p>
+            <w:r>
+              <w:t>774.00 ticks (variant_195)</w:t>
+            </w:r>
+          </w:p>
+        </w:tc>
+        <w:tc>
+          <w:tcPr>
+            <w:tcW w:type="dxa" w:w="2160"/>
+          </w:tcPr>
+          <w:p>
+            <w:r>
+              <w:t>0.00 ticks (variant_269)</w:t>
+            </w:r>
+          </w:p>
+        </w:tc>
+        <w:tc>
+          <w:tcPr>
+            <w:tcW w:type="dxa" w:w="2160"/>
+          </w:tcPr>
+          <w:p>
+            <w:r>
+              <w:t>85.78 ticks</w:t>
+            </w:r>
+          </w:p>
+        </w:tc>
+      </w:tr>
+      <w:tr>
+        <w:tc>
+          <w:tcPr>
+            <w:tcW w:type="dxa" w:w="2160"/>
+          </w:tcPr>
+          <w:p>
+            <w:r>
+              <w:t>IQR (25th-75th)</w:t>
+            </w:r>
+          </w:p>
+        </w:tc>
+        <w:tc>
+          <w:tcPr>
+            <w:tcW w:type="dxa" w:w="2160"/>
+          </w:tcPr>
+          <w:p>
+            <w:r>
+              <w:t>140.00 ticks (variant_177)</w:t>
+            </w:r>
+          </w:p>
+        </w:tc>
+        <w:tc>
+          <w:tcPr>
+            <w:tcW w:type="dxa" w:w="2160"/>
+          </w:tcPr>
+          <w:p>
+            <w:r>
+              <w:t>0.00 ticks (variant_107)</w:t>
+            </w:r>
+          </w:p>
+        </w:tc>
+        <w:tc>
+          <w:tcPr>
+            <w:tcW w:type="dxa" w:w="2160"/>
+          </w:tcPr>
+          <w:p>
+            <w:r>
+              <w:t>17.76 ticks</w:t>
+            </w:r>
+          </w:p>
+        </w:tc>
+      </w:tr>
+      <w:tr>
+        <w:tc>
+          <w:tcPr>
+            <w:tcW w:type="dxa" w:w="2160"/>
+          </w:tcPr>
+          <w:p>
+            <w:r>
+              <w:t>5th Percentile</w:t>
+            </w:r>
+          </w:p>
+        </w:tc>
+        <w:tc>
+          <w:tcPr>
+            <w:tcW w:type="dxa" w:w="2160"/>
+          </w:tcPr>
+          <w:p>
+            <w:r>
+              <w:t>33.95 ticks (variant_843)</w:t>
+            </w:r>
+          </w:p>
+        </w:tc>
+        <w:tc>
+          <w:tcPr>
+            <w:tcW w:type="dxa" w:w="2160"/>
+          </w:tcPr>
+          <w:p>
+            <w:r>
+              <w:t>16.00 ticks (variant_02)</w:t>
+            </w:r>
+          </w:p>
+        </w:tc>
+        <w:tc>
+          <w:tcPr>
+            <w:tcW w:type="dxa" w:w="2160"/>
+          </w:tcPr>
+          <w:p>
+            <w:r>
+              <w:t>19.10 ticks</w:t>
+            </w:r>
+          </w:p>
+        </w:tc>
+      </w:tr>
+      <w:tr>
+        <w:tc>
+          <w:tcPr>
+            <w:tcW w:type="dxa" w:w="2160"/>
+          </w:tcPr>
+          <w:p>
+            <w:r>
+              <w:t>25th Percentile</w:t>
+            </w:r>
+          </w:p>
+        </w:tc>
+        <w:tc>
+          <w:tcPr>
+            <w:tcW w:type="dxa" w:w="2160"/>
+          </w:tcPr>
+          <w:p>
+            <w:r>
+              <w:t>67.00 ticks (variant_52)</w:t>
+            </w:r>
+          </w:p>
+        </w:tc>
+        <w:tc>
+          <w:tcPr>
+            <w:tcW w:type="dxa" w:w="2160"/>
+          </w:tcPr>
+          <w:p>
+            <w:r>
+              <w:t>16.00 ticks (variant_09)</w:t>
+            </w:r>
+          </w:p>
+        </w:tc>
+        <w:tc>
+          <w:tcPr>
+            <w:tcW w:type="dxa" w:w="2160"/>
+          </w:tcPr>
+          <w:p>
+            <w:r>
+              <w:t>22.32 ticks</w:t>
+            </w:r>
+          </w:p>
+        </w:tc>
+      </w:tr>
+      <w:tr>
+        <w:tc>
+          <w:tcPr>
+            <w:tcW w:type="dxa" w:w="2160"/>
+          </w:tcPr>
+          <w:p>
+            <w:r>
+              <w:t>75th Percentile</w:t>
+            </w:r>
+          </w:p>
+        </w:tc>
+        <w:tc>
+          <w:tcPr>
+            <w:tcW w:type="dxa" w:w="2160"/>
+          </w:tcPr>
+          <w:p>
+            <w:r>
+              <w:t>175.75 ticks (variant_819)</w:t>
+            </w:r>
+          </w:p>
+        </w:tc>
+        <w:tc>
+          <w:tcPr>
+            <w:tcW w:type="dxa" w:w="2160"/>
+          </w:tcPr>
+          <w:p>
+            <w:r>
+              <w:t>16.00 ticks (variant_107)</w:t>
+            </w:r>
+          </w:p>
+        </w:tc>
+        <w:tc>
+          <w:tcPr>
+            <w:tcW w:type="dxa" w:w="2160"/>
+          </w:tcPr>
+          <w:p>
+            <w:r>
+              <w:t>40.08 ticks</w:t>
+            </w:r>
+          </w:p>
+        </w:tc>
+      </w:tr>
+      <w:tr>
+        <w:tc>
+          <w:tcPr>
+            <w:tcW w:type="dxa" w:w="2160"/>
+          </w:tcPr>
+          <w:p>
+            <w:r>
+              <w:t>95th Percentile</w:t>
+            </w:r>
+          </w:p>
+        </w:tc>
+        <w:tc>
+          <w:tcPr>
+            <w:tcW w:type="dxa" w:w="2160"/>
+          </w:tcPr>
+          <w:p>
+            <w:r>
+              <w:t>407.85 ticks (variant_177)</w:t>
+            </w:r>
+          </w:p>
+        </w:tc>
+        <w:tc>
+          <w:tcPr>
+            <w:tcW w:type="dxa" w:w="2160"/>
+          </w:tcPr>
+          <w:p>
+            <w:r>
+              <w:t>16.00 ticks (variant_18)</w:t>
+            </w:r>
+          </w:p>
+        </w:tc>
+        <w:tc>
+          <w:tcPr>
+            <w:tcW w:type="dxa" w:w="2160"/>
+          </w:tcPr>
+          <w:p>
+            <w:r>
+              <w:t>65.82 ticks</w:t>
+            </w:r>
+          </w:p>
+        </w:tc>
+      </w:tr>
+      <w:tr>
+        <w:tc>
+          <w:tcPr>
+            <w:tcW w:type="dxa" w:w="2160"/>
+          </w:tcPr>
+          <w:p>
+            <w:r>
+              <w:t>Skewness</w:t>
+            </w:r>
+          </w:p>
+        </w:tc>
+        <w:tc>
+          <w:tcPr>
+            <w:tcW w:type="dxa" w:w="2160"/>
+          </w:tcPr>
+          <w:p>
+            <w:r>
+              <w:t>9.849 (variant_597)</w:t>
+            </w:r>
+          </w:p>
+        </w:tc>
+        <w:tc>
+          <w:tcPr>
+            <w:tcW w:type="dxa" w:w="2160"/>
+          </w:tcPr>
+          <w:p>
+            <w:r>
+              <w:t>-1.557 (variant_903)</w:t>
+            </w:r>
+          </w:p>
+        </w:tc>
+        <w:tc>
+          <w:tcPr>
+            <w:tcW w:type="dxa" w:w="2160"/>
+          </w:tcPr>
+          <w:p>
+            <w:r>
+              <w:t>2.183</w:t>
+            </w:r>
+          </w:p>
+        </w:tc>
+      </w:tr>
+      <w:tr>
+        <w:tc>
+          <w:tcPr>
+            <w:tcW w:type="dxa" w:w="2160"/>
+          </w:tcPr>
+          <w:p>
+            <w:r>
+              <w:t>Kurtosis (excess)</w:t>
+            </w:r>
+          </w:p>
+        </w:tc>
+        <w:tc>
+          <w:tcPr>
+            <w:tcW w:type="dxa" w:w="2160"/>
+          </w:tcPr>
+          <w:p>
+            <w:r>
+              <w:t>95.010 (variant_567)</w:t>
+            </w:r>
+          </w:p>
+        </w:tc>
+        <w:tc>
+          <w:tcPr>
+            <w:tcW w:type="dxa" w:w="2160"/>
+          </w:tcPr>
+          <w:p>
+            <w:r>
+              <w:t>-1.504 (variant_884)</w:t>
+            </w:r>
+          </w:p>
+        </w:tc>
+        <w:tc>
+          <w:tcPr>
+            <w:tcW w:type="dxa" w:w="2160"/>
+          </w:tcPr>
+          <w:p>
+            <w:r>
+              <w:t>7.526</w:t>
+            </w:r>
+          </w:p>
+        </w:tc>
+      </w:tr>
+      <w:tr>
+        <w:tc>
+          <w:tcPr>
+            <w:tcW w:type="dxa" w:w="2160"/>
+          </w:tcPr>
+          <w:p>
+            <w:r>
+              <w:t>Coefficient of Variation</w:t>
+            </w:r>
+          </w:p>
+        </w:tc>
+        <w:tc>
+          <w:tcPr>
+            <w:tcW w:type="dxa" w:w="2160"/>
+          </w:tcPr>
+          <w:p>
+            <w:r>
+              <w:t>128.73 % (variant_195)</w:t>
+            </w:r>
+          </w:p>
+        </w:tc>
+        <w:tc>
+          <w:tcPr>
+            <w:tcW w:type="dxa" w:w="2160"/>
+          </w:tcPr>
+          <w:p>
+            <w:r>
+              <w:t>0.00 % (variant_269)</w:t>
+            </w:r>
+          </w:p>
+        </w:tc>
+        <w:tc>
+          <w:tcPr>
+            <w:tcW w:type="dxa" w:w="2160"/>
+          </w:tcPr>
+          <w:p>
+            <w:r>
+              <w:t>43.49 %</w:t>
+            </w:r>
+          </w:p>
+        </w:tc>
+      </w:tr>
+    </w:tbl>
+    <w:p>
+      <w:pPr>
         <w:pStyle w:val="Heading2"/>
       </w:pPr>
       <w:r>
@@ -426,33 +1077,187 @@
     </w:p>
     <w:p>
       <w:r>
-        <w:t xml:space="preserve">Variants are classified as successful or unsuccessful based on their median survival time relative to the achievable performance range. Successful variants achieve median survival ≥ 100.6 ticks (top 10% of 16.0–110.0 range). Unsuccessful variants achieve median survival ≤ 25.4 ticks (bottom 10% of range). </w:t>
+        <w:t>Success is measured based on median survival across 100 runs with different randomizer seeds. The 1000 different wiring variants are split into successful and unsuccessful groups based on their performance. The achievable range of median liefetimes is split into percentiles. Variants in the 'successful' group had median lifetimes in the top 10% of that range, while variants in the 'unsuccessful' group had median lifetimes in the bottom 10% of that range. This approach respects natural performance gaps and identifies only the variants that truly solve the task well regardless of the number of variants that achieve this.</w:t>
       </w:r>
     </w:p>
+    <w:tbl>
+      <w:tblPr>
+        <w:tblStyle w:val="LightGrid-Accent1"/>
+        <w:tblW w:type="auto" w:w="0"/>
+        <w:tblLook w:firstColumn="1" w:firstRow="1" w:lastColumn="0" w:lastRow="0" w:noHBand="0" w:noVBand="1" w:val="04A0"/>
+      </w:tblPr>
+      <w:tblGrid>
+        <w:gridCol w:w="4320"/>
+        <w:gridCol w:w="4320"/>
+      </w:tblGrid>
+      <w:tr>
+        <w:tc>
+          <w:tcPr>
+            <w:tcW w:type="dxa" w:w="4320"/>
+          </w:tcPr>
+          <w:p>
+            <w:r>
+              <w:t>Metric</w:t>
+            </w:r>
+          </w:p>
+        </w:tc>
+        <w:tc>
+          <w:tcPr>
+            <w:tcW w:type="dxa" w:w="4320"/>
+          </w:tcPr>
+          <w:p>
+            <w:r>
+              <w:t>Value (ticks)</w:t>
+            </w:r>
+          </w:p>
+        </w:tc>
+      </w:tr>
+      <w:tr>
+        <w:tc>
+          <w:tcPr>
+            <w:tcW w:type="dxa" w:w="4320"/>
+          </w:tcPr>
+          <w:p>
+            <w:r>
+              <w:t>Successful threshold (top 10% of range)</w:t>
+            </w:r>
+          </w:p>
+        </w:tc>
+        <w:tc>
+          <w:tcPr>
+            <w:tcW w:type="dxa" w:w="4320"/>
+          </w:tcPr>
+          <w:p>
+            <w:r>
+              <w:t>&gt;= 100.6</w:t>
+            </w:r>
+          </w:p>
+        </w:tc>
+      </w:tr>
+      <w:tr>
+        <w:tc>
+          <w:tcPr>
+            <w:tcW w:type="dxa" w:w="4320"/>
+          </w:tcPr>
+          <w:p>
+            <w:r>
+              <w:t>Unsuccessful threshold (bottom 10% of range)</w:t>
+            </w:r>
+          </w:p>
+        </w:tc>
+        <w:tc>
+          <w:tcPr>
+            <w:tcW w:type="dxa" w:w="4320"/>
+          </w:tcPr>
+          <w:p>
+            <w:r>
+              <w:t>&lt;= 25.4</w:t>
+            </w:r>
+          </w:p>
+        </w:tc>
+      </w:tr>
+      <w:tr>
+        <w:tc>
+          <w:tcPr>
+            <w:tcW w:type="dxa" w:w="4320"/>
+          </w:tcPr>
+          <w:p>
+            <w:r>
+              <w:t>Variants identified in each group</w:t>
+            </w:r>
+          </w:p>
+        </w:tc>
+        <w:tc>
+          <w:tcPr>
+            <w:tcW w:type="dxa" w:w="4320"/>
+          </w:tcPr>
+          <w:p>
+            <w:r>
+              <w:t>Successful: 3, Unsuccessful: 394</w:t>
+            </w:r>
+          </w:p>
+        </w:tc>
+      </w:tr>
+    </w:tbl>
+    <w:p/>
+    <w:tbl>
+      <w:tblPr>
+        <w:tblStyle w:val="LightGrid-Accent1"/>
+        <w:tblW w:type="auto" w:w="0"/>
+        <w:tblLook w:firstColumn="1" w:firstRow="1" w:lastColumn="0" w:lastRow="0" w:noHBand="0" w:noVBand="1" w:val="04A0"/>
+      </w:tblPr>
+      <w:tblGrid>
+        <w:gridCol w:w="8640"/>
+      </w:tblGrid>
+      <w:tr>
+        <w:tc>
+          <w:tcPr>
+            <w:tcW w:type="dxa" w:w="8640"/>
+          </w:tcPr>
+          <w:p>
+            <w:r>
+              <w:rPr>
+                <w:b/>
+                <w:sz w:val="16"/>
+              </w:rPr>
+              <w:t xml:space="preserve">Successful Variant Group (Top 10%): </w:t>
+            </w:r>
+            <w:r>
+              <w:rPr>
+                <w:sz w:val="16"/>
+              </w:rPr>
+              <w:t>468, 639, 819</w:t>
+            </w:r>
+          </w:p>
+        </w:tc>
+      </w:tr>
+      <w:tr>
+        <w:tc>
+          <w:tcPr>
+            <w:tcW w:type="dxa" w:w="8640"/>
+          </w:tcPr>
+          <w:p>
+            <w:r>
+              <w:rPr>
+                <w:b/>
+                <w:sz w:val="16"/>
+              </w:rPr>
+              <w:t xml:space="preserve">Unsuccessful Variant Group (Bottom 10%): </w:t>
+            </w:r>
+            <w:r>
+              <w:rPr>
+                <w:sz w:val="16"/>
+              </w:rPr>
+              <w:t>9, 11, 15, 18, 19, 20, 21, 30, 32, 34, 35, 37, 38, 39, 44, 46, 49, 50, 55, 56, 58, 61, 63, 66, 67, 69, 70, 72, 74, 75, 76, 77, 80, 82, 87, 89, 94, 99, 100, 101, 102, 103, 104, 105, 107, 108, 111, 113, 116, 119, 121, 123, 124, 126, 127, 129, 131, 136, 138, 140, 142, 146, 149, 154, 158, 162, 163, 169, 171, 178, 179, 180, 181, 186, 187, 188, 189, 190, 191, 196, 197, 199, 200, 201, 209, 212, 218, 220, 223, 225, 227, 228, 233, 236, 239, 241, 245, 250, 254, 255, 259, 262, 263, 264, 267, 269, 276, 278, 281, 282, 288, 295, 296, 297, 298, 300, 305, 307, 311, 312, 317, 318, 319, 323, 325, 337, 340, 341, 342, 344, 347, 349, 352, 353, 360, 362, 363, 366, 371, 374, 375, 376, 377, 378, 382, 385, 387, 388, 391, 395, 396, 403, 404, 405, 406, 408, 410, 412, 413, 416, 417, 418, 420, 426, 428, 429, 430, 432, 434, 436, 439, 441, 446, 449, 452, 454, 459, 460, 463, 465, 467, 469, 471, 474, 477, 480, 481, 483, 487, 489, 496, 497, 499, 502, 505, 507, 510, 511, 513, 515, 518, 519, 521, 522, 525, 529, 536, 538, 542, 545, 546, 547, 549, 550, 552, 554, 561, 563, 564, 566, 567, 571, 574, 575, 576, 579, 581, 582, 583, 585, 588, 590, 591, 593, 594, 595, 596, 597, 600, 601, 605, 614, 617, 618, 619, 621, 622, 624, 626, 627, 628, 632, 638, 641, 643, 644, 648, 649, 653, 654, 659, 661, 663, 673, 674, 675, 676, 678, 682, 684, 686, 689, 691, 692, 696, 700, 704, 709, 712, 714, 718, 720, 722, 724, 726, 727, 729, 732, 734, 739, 740, 741, 742, 744, 745, 746, 749, 751, 753, 754, 755, 757, 758, 759, 761, 762, 763, 771, 772, 777, 778, 779, 780, 782, 786, 791, 793, 794, 798, 802, 805, 806, 810, 812, 813, 815, 817, 818, 820, 823, 824, 825, 826, 831, 833, 837, 846, 847, 848, 852, 853, 856, 858, 861, 865, 874, 877, 879, 881, 883, 885, 886, 887, 888, 889, 893, 895, 898, 899, 901, 906, 908, 909, 912, 918, 924, 929, 932, 937, 941, 942, 947, 949, 953, 954, 956, 958, 965, 966, 967, 971, 972, 973, 974, 978, 979, 982, 984, 986, 987, 988, 992, 993, 999</w:t>
+            </w:r>
+          </w:p>
+        </w:tc>
+      </w:tr>
+    </w:tbl>
+    <w:p/>
     <w:p>
-      <w:pPr>
-        <w:pStyle w:val="Heading3"/>
-      </w:pPr>
       <w:r>
-        <w:t>Successful Variant Group (Top 10%):</w:t>
+        <w:t>The survival race plot tracks how many individuals from each wiring variant survive over time. Each curve represents a variant's cumulative survival, showing how fitness changes across the simulation. We use this visualization to identify which variants are robustly long-lived. The comparison table shows key statistics for successful versus unsuccessful variants, helping quantify the performance gap.</w:t>
       </w:r>
     </w:p>
     <w:p>
       <w:r>
-        <w:t>variant_468, variant_639, variant_819</w:t>
-      </w:r>
-    </w:p>
-    <w:p>
-      <w:pPr>
-        <w:pStyle w:val="Heading3"/>
-      </w:pPr>
-      <w:r>
-        <w:t>Unsuccessful Variant Group (Bottom 10%):</w:t>
+        <w:t>This plot shows the survival curves for all 1000 wiring variants. Variants are color-coded by their performance achievement (range-based thresholds):</w:t>
       </w:r>
     </w:p>
     <w:p>
       <w:r>
-        <w:t>variant_09, variant_100, variant_101, variant_102, variant_103, variant_104, variant_105, variant_107, variant_108, variant_11, variant_111, variant_113, variant_116, variant_119, variant_121, variant_123, variant_124, variant_126, variant_127, variant_129, variant_131, variant_136, variant_138, variant_140, variant_142, variant_146, variant_149, variant_15, variant_154, variant_158, variant_162, variant_163, variant_169, variant_171, variant_178, variant_179, variant_18, variant_180, variant_181, variant_186, variant_187, variant_188, variant_189, variant_19, variant_190, variant_191, variant_196, variant_197, variant_199, variant_20, variant_200, variant_201, variant_209, variant_21, variant_212, variant_218, variant_220, variant_223, variant_225, variant_227, variant_228, variant_233, variant_236, variant_239, variant_241, variant_245, variant_250, variant_254, variant_255, variant_259, variant_262, variant_263, variant_264, variant_267, variant_269, variant_276, variant_278, variant_281, variant_282, variant_288, variant_295, variant_296, variant_297, variant_298, variant_30, variant_300, variant_305, variant_307, variant_311, variant_312, variant_317, variant_318, variant_319, variant_32, variant_323, variant_325, variant_337, variant_34, variant_340, variant_341, variant_342, variant_344, variant_347, variant_349, variant_35, variant_352, variant_353, variant_360, variant_362, variant_363, variant_366, variant_37, variant_371, variant_374, variant_375, variant_376, variant_377, variant_378, variant_38, variant_382, variant_385, variant_387, variant_388, variant_39, variant_391, variant_395, variant_396, variant_403, variant_404, variant_405, variant_406, variant_408, variant_410, variant_412, variant_413, variant_416, variant_417, variant_418, variant_420, variant_426, variant_428, variant_429, variant_430, variant_432, variant_434, variant_436, variant_439, variant_44, variant_441, variant_446, variant_449, variant_452, variant_454, variant_459, variant_46, variant_460, variant_463, variant_465, variant_467, variant_469, variant_471, variant_474, variant_477, variant_480, variant_481, variant_483, variant_487, variant_489, variant_49, variant_496, variant_497, variant_499, variant_50, variant_502, variant_505, variant_507, variant_510, variant_511, variant_513, variant_515, variant_518, variant_519, variant_521, variant_522, variant_525, variant_529, variant_536, variant_538, variant_542, variant_545, variant_546, variant_547, variant_549, variant_55, variant_550, variant_552, variant_554, variant_56, variant_561, variant_563, variant_564, variant_566, variant_567, variant_571, variant_574, variant_575, variant_576, variant_579, variant_58, variant_581, variant_582, variant_583, variant_585, variant_588, variant_590, variant_591, variant_593, variant_594, variant_595, variant_596, variant_597, variant_600, variant_601, variant_605, variant_61, variant_614, variant_617, variant_618, variant_619, variant_621, variant_622, variant_624, variant_626, variant_627, variant_628, variant_63, variant_632, variant_638, variant_641, variant_643, variant_644, variant_648, variant_649, variant_653, variant_654, variant_659, variant_66, variant_661, variant_663, variant_67, variant_673, variant_674, variant_675, variant_676, variant_678, variant_682, variant_684, variant_686, variant_689, variant_69, variant_691, variant_692, variant_696, variant_70, variant_700, variant_704, variant_709, variant_712, variant_714, variant_718, variant_72, variant_720, variant_722, variant_724, variant_726, variant_727, variant_729, variant_732, variant_734, variant_739, variant_74, variant_740, variant_741, variant_742, variant_744, variant_745, variant_746, variant_749, variant_75, variant_751, variant_753, variant_754, variant_755, variant_757, variant_758, variant_759, variant_76, variant_761, variant_762, variant_763, variant_77, variant_771, variant_772, variant_777, variant_778, variant_779, variant_780, variant_782, variant_786, variant_791, variant_793, variant_794, variant_798, variant_80, variant_802, variant_805, variant_806, variant_810, variant_812, variant_813, variant_815, variant_817, variant_818, variant_82, variant_820, variant_823, variant_824, variant_825, variant_826, variant_831, variant_833, variant_837, variant_846, variant_847, variant_848, variant_852, variant_853, variant_856, variant_858, variant_861, variant_865, variant_87, variant_874, variant_877, variant_879, variant_881, variant_883, variant_885, variant_886, variant_887, variant_888, variant_889, variant_89, variant_893, variant_895, variant_898, variant_899, variant_901, variant_906, variant_908, variant_909, variant_912, variant_918, variant_924, variant_929, variant_932, variant_937, variant_94, variant_941, variant_942, variant_947, variant_949, variant_953, variant_954, variant_956, variant_958, variant_965, variant_966, variant_967, variant_971, variant_972, variant_973, variant_974, variant_978, variant_979, variant_982, variant_984, variant_986, variant_987, variant_988, variant_99, variant_992, variant_993, variant_999</w:t>
+        <w:t xml:space="preserve">  • Green: Top 10% of variants (median survival ≥ 100.6 ticks) — 3 variants</w:t>
+      </w:r>
+    </w:p>
+    <w:p>
+      <w:r>
+        <w:t xml:space="preserve">  • Red: Bottom 10% of variants (median survival ≤ 25.4 ticks) — 394 variants</w:t>
+      </w:r>
+    </w:p>
+    <w:p>
+      <w:r>
+        <w:t xml:space="preserve">  • Gray: Middle range (other variants)</w:t>
       </w:r>
     </w:p>
     <w:p>
@@ -492,6 +1297,247 @@
       </w:r>
     </w:p>
     <w:p/>
+    <w:p>
+      <w:r>
+        <w:t>Successful vs Unsuccessful Comparison:</w:t>
+      </w:r>
+    </w:p>
+    <w:tbl>
+      <w:tblPr>
+        <w:tblStyle w:val="LightGrid-Accent1"/>
+        <w:tblW w:type="auto" w:w="0"/>
+        <w:tblLook w:firstColumn="1" w:firstRow="1" w:lastColumn="0" w:lastRow="0" w:noHBand="0" w:noVBand="1" w:val="04A0"/>
+      </w:tblPr>
+      <w:tblGrid>
+        <w:gridCol w:w="2880"/>
+        <w:gridCol w:w="2880"/>
+        <w:gridCol w:w="2880"/>
+      </w:tblGrid>
+      <w:tr>
+        <w:tc>
+          <w:tcPr>
+            <w:tcW w:type="dxa" w:w="2880"/>
+          </w:tcPr>
+          <w:p>
+            <w:r>
+              <w:t>Metric</w:t>
+            </w:r>
+          </w:p>
+        </w:tc>
+        <w:tc>
+          <w:tcPr>
+            <w:tcW w:type="dxa" w:w="2880"/>
+          </w:tcPr>
+          <w:p>
+            <w:r>
+              <w:t>Successful (Top 10% of Variants)</w:t>
+            </w:r>
+          </w:p>
+        </w:tc>
+        <w:tc>
+          <w:tcPr>
+            <w:tcW w:type="dxa" w:w="2880"/>
+          </w:tcPr>
+          <w:p>
+            <w:r>
+              <w:t>Unsuccessful (Bottom 10% of Variants)</w:t>
+            </w:r>
+          </w:p>
+        </w:tc>
+      </w:tr>
+      <w:tr>
+        <w:tc>
+          <w:tcPr>
+            <w:tcW w:type="dxa" w:w="2880"/>
+          </w:tcPr>
+          <w:p>
+            <w:r>
+              <w:t>Number of runs</w:t>
+            </w:r>
+          </w:p>
+        </w:tc>
+        <w:tc>
+          <w:tcPr>
+            <w:tcW w:type="dxa" w:w="2880"/>
+          </w:tcPr>
+          <w:p>
+            <w:r>
+              <w:t>300</w:t>
+            </w:r>
+          </w:p>
+        </w:tc>
+        <w:tc>
+          <w:tcPr>
+            <w:tcW w:type="dxa" w:w="2880"/>
+          </w:tcPr>
+          <w:p>
+            <w:r>
+              <w:t>39400</w:t>
+            </w:r>
+          </w:p>
+        </w:tc>
+      </w:tr>
+      <w:tr>
+        <w:tc>
+          <w:tcPr>
+            <w:tcW w:type="dxa" w:w="2880"/>
+          </w:tcPr>
+          <w:p>
+            <w:r>
+              <w:t>Mean (ticks)</w:t>
+            </w:r>
+          </w:p>
+        </w:tc>
+        <w:tc>
+          <w:tcPr>
+            <w:tcW w:type="dxa" w:w="2880"/>
+          </w:tcPr>
+          <w:p>
+            <w:r>
+              <w:t>123.8</w:t>
+            </w:r>
+          </w:p>
+        </w:tc>
+        <w:tc>
+          <w:tcPr>
+            <w:tcW w:type="dxa" w:w="2880"/>
+          </w:tcPr>
+          <w:p>
+            <w:r>
+              <w:t>22.8</w:t>
+            </w:r>
+          </w:p>
+        </w:tc>
+      </w:tr>
+      <w:tr>
+        <w:tc>
+          <w:tcPr>
+            <w:tcW w:type="dxa" w:w="2880"/>
+          </w:tcPr>
+          <w:p>
+            <w:r>
+              <w:t>Median (ticks)</w:t>
+            </w:r>
+          </w:p>
+        </w:tc>
+        <w:tc>
+          <w:tcPr>
+            <w:tcW w:type="dxa" w:w="2880"/>
+          </w:tcPr>
+          <w:p>
+            <w:r>
+              <w:t>108.0</w:t>
+            </w:r>
+          </w:p>
+        </w:tc>
+        <w:tc>
+          <w:tcPr>
+            <w:tcW w:type="dxa" w:w="2880"/>
+          </w:tcPr>
+          <w:p>
+            <w:r>
+              <w:t>17.0</w:t>
+            </w:r>
+          </w:p>
+        </w:tc>
+      </w:tr>
+      <w:tr>
+        <w:tc>
+          <w:tcPr>
+            <w:tcW w:type="dxa" w:w="2880"/>
+          </w:tcPr>
+          <w:p>
+            <w:r>
+              <w:t>Std Dev (ticks)</w:t>
+            </w:r>
+          </w:p>
+        </w:tc>
+        <w:tc>
+          <w:tcPr>
+            <w:tcW w:type="dxa" w:w="2880"/>
+          </w:tcPr>
+          <w:p>
+            <w:r>
+              <w:t>96.5</w:t>
+            </w:r>
+          </w:p>
+        </w:tc>
+        <w:tc>
+          <w:tcPr>
+            <w:tcW w:type="dxa" w:w="2880"/>
+          </w:tcPr>
+          <w:p>
+            <w:r>
+              <w:t>13.2</w:t>
+            </w:r>
+          </w:p>
+        </w:tc>
+      </w:tr>
+      <w:tr>
+        <w:tc>
+          <w:tcPr>
+            <w:tcW w:type="dxa" w:w="2880"/>
+          </w:tcPr>
+          <w:p>
+            <w:r>
+              <w:t>Min (ticks)</w:t>
+            </w:r>
+          </w:p>
+        </w:tc>
+        <w:tc>
+          <w:tcPr>
+            <w:tcW w:type="dxa" w:w="2880"/>
+          </w:tcPr>
+          <w:p>
+            <w:r>
+              <w:t>16.0</w:t>
+            </w:r>
+          </w:p>
+        </w:tc>
+        <w:tc>
+          <w:tcPr>
+            <w:tcW w:type="dxa" w:w="2880"/>
+          </w:tcPr>
+          <w:p>
+            <w:r>
+              <w:t>16.0</w:t>
+            </w:r>
+          </w:p>
+        </w:tc>
+      </w:tr>
+      <w:tr>
+        <w:tc>
+          <w:tcPr>
+            <w:tcW w:type="dxa" w:w="2880"/>
+          </w:tcPr>
+          <w:p>
+            <w:r>
+              <w:t>Max (ticks)</w:t>
+            </w:r>
+          </w:p>
+        </w:tc>
+        <w:tc>
+          <w:tcPr>
+            <w:tcW w:type="dxa" w:w="2880"/>
+          </w:tcPr>
+          <w:p>
+            <w:r>
+              <w:t>645.0</w:t>
+            </w:r>
+          </w:p>
+        </w:tc>
+        <w:tc>
+          <w:tcPr>
+            <w:tcW w:type="dxa" w:w="2880"/>
+          </w:tcPr>
+          <w:p>
+            <w:r>
+              <w:t>342.0</w:t>
+            </w:r>
+          </w:p>
+        </w:tc>
+      </w:tr>
+    </w:tbl>
     <w:p>
       <w:pPr>
         <w:pStyle w:val="Heading2"/>
@@ -878,9 +1924,7 @@
     </w:tbl>
     <w:p/>
     <w:p>
-      <w:pPr>
-        <w:pStyle w:val="Heading3"/>
-      </w:pPr>
+      <w:pPr/>
       <w:r>
         <w:t>TBD - Interpretation of survival time differences.</w:t>
       </w:r>
@@ -898,6 +1942,184 @@
         <w:t>Movement efficiency quantifies how effectively variants use sensory information to guide movement. Calculated as movements divided by sensing events in each cardinal direction (N, E, S, W). A ratio close to 1.0 indicates tight coupling between sensing and acting; higher ratios suggest either deliberate multi-movement strategies or noisy sensor integration.</w:t>
       </w:r>
     </w:p>
+    <w:p>
+      <w:r>
+        <w:t>Movement Efficiency = Movement Count ÷ Sensing Count per direction</w:t>
+      </w:r>
+    </w:p>
+    <w:tbl>
+      <w:tblPr>
+        <w:tblStyle w:val="LightGrid-Accent1"/>
+        <w:tblW w:type="auto" w:w="0"/>
+        <w:tblLook w:firstColumn="1" w:firstRow="1" w:lastColumn="0" w:lastRow="0" w:noHBand="0" w:noVBand="1" w:val="04A0"/>
+      </w:tblPr>
+      <w:tblGrid>
+        <w:gridCol w:w="2880"/>
+        <w:gridCol w:w="2880"/>
+        <w:gridCol w:w="2880"/>
+      </w:tblGrid>
+      <w:tr>
+        <w:tc>
+          <w:tcPr>
+            <w:tcW w:type="dxa" w:w="2880"/>
+          </w:tcPr>
+          <w:p>
+            <w:r>
+              <w:t>Direction</w:t>
+            </w:r>
+          </w:p>
+        </w:tc>
+        <w:tc>
+          <w:tcPr>
+            <w:tcW w:type="dxa" w:w="2880"/>
+          </w:tcPr>
+          <w:p>
+            <w:r>
+              <w:t>Unsuccessful (Mean ± Std)</w:t>
+            </w:r>
+          </w:p>
+        </w:tc>
+        <w:tc>
+          <w:tcPr>
+            <w:tcW w:type="dxa" w:w="2880"/>
+          </w:tcPr>
+          <w:p>
+            <w:r>
+              <w:t>Successful (Mean ± Std)</w:t>
+            </w:r>
+          </w:p>
+        </w:tc>
+      </w:tr>
+      <w:tr>
+        <w:tc>
+          <w:tcPr>
+            <w:tcW w:type="dxa" w:w="2880"/>
+          </w:tcPr>
+          <w:p>
+            <w:r>
+              <w:t>N</w:t>
+            </w:r>
+          </w:p>
+        </w:tc>
+        <w:tc>
+          <w:tcPr>
+            <w:tcW w:type="dxa" w:w="2880"/>
+          </w:tcPr>
+          <w:p>
+            <w:r>
+              <w:t>1.125 ± 1.792</w:t>
+            </w:r>
+          </w:p>
+        </w:tc>
+        <w:tc>
+          <w:tcPr>
+            <w:tcW w:type="dxa" w:w="2880"/>
+          </w:tcPr>
+          <w:p>
+            <w:r>
+              <w:t>2.221 ± 2.099</w:t>
+            </w:r>
+          </w:p>
+        </w:tc>
+      </w:tr>
+      <w:tr>
+        <w:tc>
+          <w:tcPr>
+            <w:tcW w:type="dxa" w:w="2880"/>
+          </w:tcPr>
+          <w:p>
+            <w:r>
+              <w:t>E</w:t>
+            </w:r>
+          </w:p>
+        </w:tc>
+        <w:tc>
+          <w:tcPr>
+            <w:tcW w:type="dxa" w:w="2880"/>
+          </w:tcPr>
+          <w:p>
+            <w:r>
+              <w:t>1.130 ± 1.801</w:t>
+            </w:r>
+          </w:p>
+        </w:tc>
+        <w:tc>
+          <w:tcPr>
+            <w:tcW w:type="dxa" w:w="2880"/>
+          </w:tcPr>
+          <w:p>
+            <w:r>
+              <w:t>0.357 ± 0.386</w:t>
+            </w:r>
+          </w:p>
+        </w:tc>
+      </w:tr>
+      <w:tr>
+        <w:tc>
+          <w:tcPr>
+            <w:tcW w:type="dxa" w:w="2880"/>
+          </w:tcPr>
+          <w:p>
+            <w:r>
+              <w:t>S</w:t>
+            </w:r>
+          </w:p>
+        </w:tc>
+        <w:tc>
+          <w:tcPr>
+            <w:tcW w:type="dxa" w:w="2880"/>
+          </w:tcPr>
+          <w:p>
+            <w:r>
+              <w:t>1.100 ± 1.781</w:t>
+            </w:r>
+          </w:p>
+        </w:tc>
+        <w:tc>
+          <w:tcPr>
+            <w:tcW w:type="dxa" w:w="2880"/>
+          </w:tcPr>
+          <w:p>
+            <w:r>
+              <w:t>1.478 ± 1.448</w:t>
+            </w:r>
+          </w:p>
+        </w:tc>
+      </w:tr>
+      <w:tr>
+        <w:tc>
+          <w:tcPr>
+            <w:tcW w:type="dxa" w:w="2880"/>
+          </w:tcPr>
+          <w:p>
+            <w:r>
+              <w:t>W</w:t>
+            </w:r>
+          </w:p>
+        </w:tc>
+        <w:tc>
+          <w:tcPr>
+            <w:tcW w:type="dxa" w:w="2880"/>
+          </w:tcPr>
+          <w:p>
+            <w:r>
+              <w:t>1.245 ± 1.943</w:t>
+            </w:r>
+          </w:p>
+        </w:tc>
+        <w:tc>
+          <w:tcPr>
+            <w:tcW w:type="dxa" w:w="2880"/>
+          </w:tcPr>
+          <w:p>
+            <w:r>
+              <w:t>0.876 ± 1.112</w:t>
+            </w:r>
+          </w:p>
+        </w:tc>
+      </w:tr>
+    </w:tbl>
+    <w:p/>
     <w:p>
       <w:r>
         <w:drawing>
@@ -936,9 +2158,7 @@
     </w:p>
     <w:p/>
     <w:p>
-      <w:pPr>
-        <w:pStyle w:val="Heading3"/>
-      </w:pPr>
+      <w:pPr/>
       <w:r>
         <w:t>TBD - Interpretation of movement efficiency by direction.</w:t>
       </w:r>
@@ -953,12 +2173,7 @@
     </w:p>
     <w:p>
       <w:r>
-        <w:t>Decision accuracy quantifies how often choices are aligned with food source locations. This measures whether the wiring interprets sensory input to direct movement toward food. Higher accuracy indicates more direct coupling of decisions.</w:t>
-      </w:r>
-    </w:p>
-    <w:p>
-      <w:r>
-        <w:t>Decision Accuracy = Correct Decisions ÷ Total Decisions</w:t>
+        <w:t>Decision accuracy quantifies how often choices are aligned with food source locations. This measures, whether the wiring interprets sensory input to direct movement toward food. Higher accuracy indicates more direct coupling of decisions. We compare the distribution of accuracy values between successful and unsuccessful variants to determine whether fitness correlates with decision-making precision, or if other factors like movement efficiency play a larger role. Note that moving onto sensed food is a very shortsighted strategy that might not lead to an optimal solution in more complex tasks e.g. with food regrow in previous positions.</w:t>
       </w:r>
     </w:p>
     <w:p>
@@ -998,6 +2213,11 @@
       </w:r>
     </w:p>
     <w:p/>
+    <w:p>
+      <w:r>
+        <w:t>Decision Accuracy = Correct Decisions ÷ Total Decisions</w:t>
+      </w:r>
+    </w:p>
     <w:tbl>
       <w:tblPr>
         <w:tblStyle w:val="LightGrid-Accent1"/>
@@ -1321,9 +2541,7 @@
     </w:tbl>
     <w:p/>
     <w:p>
-      <w:pPr>
-        <w:pStyle w:val="Heading3"/>
-      </w:pPr>
+      <w:pPr/>
       <w:r>
         <w:t>TBD - Interpretation of decision accuracy differences.</w:t>
       </w:r>
@@ -1338,7 +2556,7 @@
     </w:p>
     <w:p>
       <w:r>
-        <w:t>Distance measures how far the worm travels through the environment. Total distance provides insight into exploration strategy; distance per tick reveals movement efficiency in relation to time spent.</w:t>
+        <w:t>Distance travelled total and normalized per tick for lifespan differences. We compare movement patterns between successful and unsuccessful variants to understand how spatial exploration versus local exploitation correlates with fitness.</w:t>
       </w:r>
     </w:p>
     <w:p>
@@ -1709,9 +2927,7 @@
     </w:tbl>
     <w:p/>
     <w:p>
-      <w:pPr>
-        <w:pStyle w:val="Heading3"/>
-      </w:pPr>
+      <w:pPr/>
       <w:r>
         <w:t>TBD - Interpretation of distance differences.</w:t>
       </w:r>
@@ -1722,27 +2938,6 @@
       </w:pPr>
       <w:r>
         <w:t>3.4.2. Distance Per Tick (Normalized)</w:t>
-      </w:r>
-    </w:p>
-    <w:p>
-      <w:pPr>
-        <w:pStyle w:val="Heading3"/>
-      </w:pPr>
-      <w:r>
-        <w:t>3.5. Food Consumption</w:t>
-      </w:r>
-    </w:p>
-    <w:p>
-      <w:r>
-        <w:t>Food consumption measures the number of food items eaten by the worm. Total foods shows absolute consumption; foods per tick reveals feeding efficiency relative to time.</w:t>
-      </w:r>
-    </w:p>
-    <w:p>
-      <w:pPr>
-        <w:pStyle w:val="Heading4"/>
-      </w:pPr>
-      <w:r>
-        <w:t>3.5.1. Food Consumption (Absolute)</w:t>
       </w:r>
     </w:p>
     <w:p>
@@ -1758,7 +2953,7 @@
               <a:graphicData uri="http://schemas.openxmlformats.org/drawingml/2006/picture">
                 <pic:pic>
                   <pic:nvPicPr>
-                    <pic:cNvPr id="0" name="comp_foods_median_survival.png"/>
+                    <pic:cNvPr id="0" name="comp_distance_per_tick_median_survival.png"/>
                     <pic:cNvPicPr/>
                   </pic:nvPicPr>
                   <pic:blipFill>
@@ -1874,7 +3069,7 @@
           </w:tcPr>
           <w:p>
             <w:r>
-              <w:t>20.110</w:t>
+              <w:t>0.752</w:t>
             </w:r>
           </w:p>
         </w:tc>
@@ -1884,7 +3079,7 @@
           </w:tcPr>
           <w:p>
             <w:r>
-              <w:t>0.785</w:t>
+              <w:t>0.824</w:t>
             </w:r>
           </w:p>
         </w:tc>
@@ -1906,7 +3101,7 @@
           </w:tcPr>
           <w:p>
             <w:r>
-              <w:t>17.000</w:t>
+              <w:t>0.776</w:t>
             </w:r>
           </w:p>
         </w:tc>
@@ -1916,7 +3111,7 @@
           </w:tcPr>
           <w:p>
             <w:r>
-              <w:t>0.000</w:t>
+              <w:t>0.875</w:t>
             </w:r>
           </w:p>
         </w:tc>
@@ -1938,7 +3133,7 @@
           </w:tcPr>
           <w:p>
             <w:r>
-              <w:t>18.638</w:t>
+              <w:t>0.103</w:t>
             </w:r>
           </w:p>
         </w:tc>
@@ -1948,7 +3143,7 @@
           </w:tcPr>
           <w:p>
             <w:r>
-              <w:t>1.576</w:t>
+              <w:t>0.153</w:t>
             </w:r>
           </w:p>
         </w:tc>
@@ -1970,7 +3165,7 @@
           </w:tcPr>
           <w:p>
             <w:r>
-              <w:t>0.000</w:t>
+              <w:t>0.357</w:t>
             </w:r>
           </w:p>
         </w:tc>
@@ -2002,7 +3197,7 @@
           </w:tcPr>
           <w:p>
             <w:r>
-              <w:t>122.000</w:t>
+              <w:t>0.938</w:t>
             </w:r>
           </w:p>
         </w:tc>
@@ -2012,7 +3207,7 @@
           </w:tcPr>
           <w:p>
             <w:r>
-              <w:t>40.000</w:t>
+              <w:t>0.938</w:t>
             </w:r>
           </w:p>
         </w:tc>
@@ -2075,7 +3270,7 @@
           </w:tcPr>
           <w:p>
             <w:r>
-              <w:t>797037.5000</w:t>
+              <w:t>8745068.5000</w:t>
             </w:r>
           </w:p>
         </w:tc>
@@ -2097,7 +3292,7 @@
           </w:tcPr>
           <w:p>
             <w:r>
-              <w:t>1.8570e-191</w:t>
+              <w:t>3.1366e-48</w:t>
             </w:r>
           </w:p>
         </w:tc>
@@ -2105,9 +3300,393 @@
     </w:tbl>
     <w:p/>
     <w:p>
+      <w:pPr/>
+      <w:r>
+        <w:t>TBD - Interpretation of distance per tick differences.</w:t>
+      </w:r>
+    </w:p>
+    <w:p>
       <w:pPr>
         <w:pStyle w:val="Heading3"/>
       </w:pPr>
+      <w:r>
+        <w:t>3.5. Food Consumption</w:t>
+      </w:r>
+    </w:p>
+    <w:p>
+      <w:r>
+        <w:t>Food consumption is the ultimate solution of the task. The more food consumed, the longer the survival. Normalized per tick food consumption may be the metric most directly linked to survival fitness.</w:t>
+      </w:r>
+    </w:p>
+    <w:p>
+      <w:pPr>
+        <w:pStyle w:val="Heading4"/>
+      </w:pPr>
+      <w:r>
+        <w:t>3.5.1. Food Consumption (Absolute)</w:t>
+      </w:r>
+    </w:p>
+    <w:p>
+      <w:r>
+        <w:drawing>
+          <wp:inline xmlns:a="http://schemas.openxmlformats.org/drawingml/2006/main" xmlns:pic="http://schemas.openxmlformats.org/drawingml/2006/picture">
+            <wp:extent cx="5486400" cy="3610547"/>
+            <wp:docPr id="7" name="Picture 7"/>
+            <wp:cNvGraphicFramePr>
+              <a:graphicFrameLocks noChangeAspect="1"/>
+            </wp:cNvGraphicFramePr>
+            <a:graphic>
+              <a:graphicData uri="http://schemas.openxmlformats.org/drawingml/2006/picture">
+                <pic:pic>
+                  <pic:nvPicPr>
+                    <pic:cNvPr id="0" name="comp_foods_median_survival.png"/>
+                    <pic:cNvPicPr/>
+                  </pic:nvPicPr>
+                  <pic:blipFill>
+                    <a:blip r:embed="rId15"/>
+                    <a:stretch>
+                      <a:fillRect/>
+                    </a:stretch>
+                  </pic:blipFill>
+                  <pic:spPr>
+                    <a:xfrm>
+                      <a:off x="0" y="0"/>
+                      <a:ext cx="5486400" cy="3610547"/>
+                    </a:xfrm>
+                    <a:prstGeom prst="rect"/>
+                  </pic:spPr>
+                </pic:pic>
+              </a:graphicData>
+            </a:graphic>
+          </wp:inline>
+        </w:drawing>
+      </w:r>
+    </w:p>
+    <w:p/>
+    <w:tbl>
+      <w:tblPr>
+        <w:tblStyle w:val="LightGrid-Accent1"/>
+        <w:tblW w:type="auto" w:w="0"/>
+        <w:tblLook w:firstColumn="1" w:firstRow="1" w:lastColumn="0" w:lastRow="0" w:noHBand="0" w:noVBand="1" w:val="04A0"/>
+      </w:tblPr>
+      <w:tblGrid>
+        <w:gridCol w:w="2880"/>
+        <w:gridCol w:w="2880"/>
+        <w:gridCol w:w="2880"/>
+      </w:tblGrid>
+      <w:tr>
+        <w:tc>
+          <w:tcPr>
+            <w:tcW w:type="dxa" w:w="2880"/>
+          </w:tcPr>
+          <w:p>
+            <w:r>
+              <w:t>Metric</w:t>
+            </w:r>
+          </w:p>
+        </w:tc>
+        <w:tc>
+          <w:tcPr>
+            <w:tcW w:type="dxa" w:w="2880"/>
+          </w:tcPr>
+          <w:p>
+            <w:r>
+              <w:t>Successful (Top 10%)</w:t>
+            </w:r>
+          </w:p>
+        </w:tc>
+        <w:tc>
+          <w:tcPr>
+            <w:tcW w:type="dxa" w:w="2880"/>
+          </w:tcPr>
+          <w:p>
+            <w:r>
+              <w:t>Unsuccessful (Bottom 10%)</w:t>
+            </w:r>
+          </w:p>
+        </w:tc>
+      </w:tr>
+      <w:tr>
+        <w:tc>
+          <w:tcPr>
+            <w:tcW w:type="dxa" w:w="2880"/>
+          </w:tcPr>
+          <w:p>
+            <w:r>
+              <w:t>Number of runs</w:t>
+            </w:r>
+          </w:p>
+        </w:tc>
+        <w:tc>
+          <w:tcPr>
+            <w:tcW w:type="dxa" w:w="2880"/>
+          </w:tcPr>
+          <w:p>
+            <w:r>
+              <w:t>300</w:t>
+            </w:r>
+          </w:p>
+        </w:tc>
+        <w:tc>
+          <w:tcPr>
+            <w:tcW w:type="dxa" w:w="2880"/>
+          </w:tcPr>
+          <w:p>
+            <w:r>
+              <w:t>39400</w:t>
+            </w:r>
+          </w:p>
+        </w:tc>
+      </w:tr>
+      <w:tr>
+        <w:tc>
+          <w:tcPr>
+            <w:tcW w:type="dxa" w:w="2880"/>
+          </w:tcPr>
+          <w:p>
+            <w:r>
+              <w:t>Mean</w:t>
+            </w:r>
+          </w:p>
+        </w:tc>
+        <w:tc>
+          <w:tcPr>
+            <w:tcW w:type="dxa" w:w="2880"/>
+          </w:tcPr>
+          <w:p>
+            <w:r>
+              <w:t>20.110</w:t>
+            </w:r>
+          </w:p>
+        </w:tc>
+        <w:tc>
+          <w:tcPr>
+            <w:tcW w:type="dxa" w:w="2880"/>
+          </w:tcPr>
+          <w:p>
+            <w:r>
+              <w:t>0.785</w:t>
+            </w:r>
+          </w:p>
+        </w:tc>
+      </w:tr>
+      <w:tr>
+        <w:tc>
+          <w:tcPr>
+            <w:tcW w:type="dxa" w:w="2880"/>
+          </w:tcPr>
+          <w:p>
+            <w:r>
+              <w:t>Median</w:t>
+            </w:r>
+          </w:p>
+        </w:tc>
+        <w:tc>
+          <w:tcPr>
+            <w:tcW w:type="dxa" w:w="2880"/>
+          </w:tcPr>
+          <w:p>
+            <w:r>
+              <w:t>17.000</w:t>
+            </w:r>
+          </w:p>
+        </w:tc>
+        <w:tc>
+          <w:tcPr>
+            <w:tcW w:type="dxa" w:w="2880"/>
+          </w:tcPr>
+          <w:p>
+            <w:r>
+              <w:t>0.000</w:t>
+            </w:r>
+          </w:p>
+        </w:tc>
+      </w:tr>
+      <w:tr>
+        <w:tc>
+          <w:tcPr>
+            <w:tcW w:type="dxa" w:w="2880"/>
+          </w:tcPr>
+          <w:p>
+            <w:r>
+              <w:t>Std Dev</w:t>
+            </w:r>
+          </w:p>
+        </w:tc>
+        <w:tc>
+          <w:tcPr>
+            <w:tcW w:type="dxa" w:w="2880"/>
+          </w:tcPr>
+          <w:p>
+            <w:r>
+              <w:t>18.638</w:t>
+            </w:r>
+          </w:p>
+        </w:tc>
+        <w:tc>
+          <w:tcPr>
+            <w:tcW w:type="dxa" w:w="2880"/>
+          </w:tcPr>
+          <w:p>
+            <w:r>
+              <w:t>1.576</w:t>
+            </w:r>
+          </w:p>
+        </w:tc>
+      </w:tr>
+      <w:tr>
+        <w:tc>
+          <w:tcPr>
+            <w:tcW w:type="dxa" w:w="2880"/>
+          </w:tcPr>
+          <w:p>
+            <w:r>
+              <w:t>Min</w:t>
+            </w:r>
+          </w:p>
+        </w:tc>
+        <w:tc>
+          <w:tcPr>
+            <w:tcW w:type="dxa" w:w="2880"/>
+          </w:tcPr>
+          <w:p>
+            <w:r>
+              <w:t>0.000</w:t>
+            </w:r>
+          </w:p>
+        </w:tc>
+        <w:tc>
+          <w:tcPr>
+            <w:tcW w:type="dxa" w:w="2880"/>
+          </w:tcPr>
+          <w:p>
+            <w:r>
+              <w:t>0.000</w:t>
+            </w:r>
+          </w:p>
+        </w:tc>
+      </w:tr>
+      <w:tr>
+        <w:tc>
+          <w:tcPr>
+            <w:tcW w:type="dxa" w:w="2880"/>
+          </w:tcPr>
+          <w:p>
+            <w:r>
+              <w:t>Max</w:t>
+            </w:r>
+          </w:p>
+        </w:tc>
+        <w:tc>
+          <w:tcPr>
+            <w:tcW w:type="dxa" w:w="2880"/>
+          </w:tcPr>
+          <w:p>
+            <w:r>
+              <w:t>122.000</w:t>
+            </w:r>
+          </w:p>
+        </w:tc>
+        <w:tc>
+          <w:tcPr>
+            <w:tcW w:type="dxa" w:w="2880"/>
+          </w:tcPr>
+          <w:p>
+            <w:r>
+              <w:t>40.000</w:t>
+            </w:r>
+          </w:p>
+        </w:tc>
+      </w:tr>
+    </w:tbl>
+    <w:p>
+      <w:pPr>
+        <w:pStyle w:val="Heading3"/>
+      </w:pPr>
+      <w:r>
+        <w:t>Differences between successful and unsuccessful random variants (Mann-Whitney U):</w:t>
+      </w:r>
+    </w:p>
+    <w:tbl>
+      <w:tblPr>
+        <w:tblStyle w:val="LightGrid-Accent1"/>
+        <w:tblW w:type="auto" w:w="0"/>
+        <w:tblLook w:firstColumn="1" w:firstRow="1" w:lastColumn="0" w:lastRow="0" w:noHBand="0" w:noVBand="1" w:val="04A0"/>
+      </w:tblPr>
+      <w:tblGrid>
+        <w:gridCol w:w="4320"/>
+        <w:gridCol w:w="4320"/>
+      </w:tblGrid>
+      <w:tr>
+        <w:tc>
+          <w:tcPr>
+            <w:tcW w:type="dxa" w:w="4320"/>
+          </w:tcPr>
+          <w:p>
+            <w:r>
+              <w:t>Test Statistic</w:t>
+            </w:r>
+          </w:p>
+        </w:tc>
+        <w:tc>
+          <w:tcPr>
+            <w:tcW w:type="dxa" w:w="4320"/>
+          </w:tcPr>
+          <w:p>
+            <w:r>
+              <w:t>Value</w:t>
+            </w:r>
+          </w:p>
+        </w:tc>
+      </w:tr>
+      <w:tr>
+        <w:tc>
+          <w:tcPr>
+            <w:tcW w:type="dxa" w:w="4320"/>
+          </w:tcPr>
+          <w:p>
+            <w:r>
+              <w:t>U-statistic</w:t>
+            </w:r>
+          </w:p>
+        </w:tc>
+        <w:tc>
+          <w:tcPr>
+            <w:tcW w:type="dxa" w:w="4320"/>
+          </w:tcPr>
+          <w:p>
+            <w:r>
+              <w:t>797037.5000</w:t>
+            </w:r>
+          </w:p>
+        </w:tc>
+      </w:tr>
+      <w:tr>
+        <w:tc>
+          <w:tcPr>
+            <w:tcW w:type="dxa" w:w="4320"/>
+          </w:tcPr>
+          <w:p>
+            <w:r>
+              <w:t>p-value</w:t>
+            </w:r>
+          </w:p>
+        </w:tc>
+        <w:tc>
+          <w:tcPr>
+            <w:tcW w:type="dxa" w:w="4320"/>
+          </w:tcPr>
+          <w:p>
+            <w:r>
+              <w:t>1.8570e-191</w:t>
+            </w:r>
+          </w:p>
+        </w:tc>
+      </w:tr>
+    </w:tbl>
+    <w:p/>
+    <w:p>
+      <w:pPr/>
       <w:r>
         <w:t>TBD - Interpretation of food consumption differences.</w:t>
       </w:r>
@@ -2118,6 +3697,371 @@
       </w:pPr>
       <w:r>
         <w:t>3.5.2. Food Per Tick (Normalized)</w:t>
+      </w:r>
+    </w:p>
+    <w:p>
+      <w:r>
+        <w:drawing>
+          <wp:inline xmlns:a="http://schemas.openxmlformats.org/drawingml/2006/main" xmlns:pic="http://schemas.openxmlformats.org/drawingml/2006/picture">
+            <wp:extent cx="5486400" cy="3610547"/>
+            <wp:docPr id="8" name="Picture 8"/>
+            <wp:cNvGraphicFramePr>
+              <a:graphicFrameLocks noChangeAspect="1"/>
+            </wp:cNvGraphicFramePr>
+            <a:graphic>
+              <a:graphicData uri="http://schemas.openxmlformats.org/drawingml/2006/picture">
+                <pic:pic>
+                  <pic:nvPicPr>
+                    <pic:cNvPr id="0" name="comp_foods_per_tick_median_survival.png"/>
+                    <pic:cNvPicPr/>
+                  </pic:nvPicPr>
+                  <pic:blipFill>
+                    <a:blip r:embed="rId16"/>
+                    <a:stretch>
+                      <a:fillRect/>
+                    </a:stretch>
+                  </pic:blipFill>
+                  <pic:spPr>
+                    <a:xfrm>
+                      <a:off x="0" y="0"/>
+                      <a:ext cx="5486400" cy="3610547"/>
+                    </a:xfrm>
+                    <a:prstGeom prst="rect"/>
+                  </pic:spPr>
+                </pic:pic>
+              </a:graphicData>
+            </a:graphic>
+          </wp:inline>
+        </w:drawing>
+      </w:r>
+    </w:p>
+    <w:p/>
+    <w:tbl>
+      <w:tblPr>
+        <w:tblStyle w:val="LightGrid-Accent1"/>
+        <w:tblW w:type="auto" w:w="0"/>
+        <w:tblLook w:firstColumn="1" w:firstRow="1" w:lastColumn="0" w:lastRow="0" w:noHBand="0" w:noVBand="1" w:val="04A0"/>
+      </w:tblPr>
+      <w:tblGrid>
+        <w:gridCol w:w="2880"/>
+        <w:gridCol w:w="2880"/>
+        <w:gridCol w:w="2880"/>
+      </w:tblGrid>
+      <w:tr>
+        <w:tc>
+          <w:tcPr>
+            <w:tcW w:type="dxa" w:w="2880"/>
+          </w:tcPr>
+          <w:p>
+            <w:r>
+              <w:t>Metric</w:t>
+            </w:r>
+          </w:p>
+        </w:tc>
+        <w:tc>
+          <w:tcPr>
+            <w:tcW w:type="dxa" w:w="2880"/>
+          </w:tcPr>
+          <w:p>
+            <w:r>
+              <w:t>Successful (Top 10%)</w:t>
+            </w:r>
+          </w:p>
+        </w:tc>
+        <w:tc>
+          <w:tcPr>
+            <w:tcW w:type="dxa" w:w="2880"/>
+          </w:tcPr>
+          <w:p>
+            <w:r>
+              <w:t>Unsuccessful (Bottom 10%)</w:t>
+            </w:r>
+          </w:p>
+        </w:tc>
+      </w:tr>
+      <w:tr>
+        <w:tc>
+          <w:tcPr>
+            <w:tcW w:type="dxa" w:w="2880"/>
+          </w:tcPr>
+          <w:p>
+            <w:r>
+              <w:t>Number of runs</w:t>
+            </w:r>
+          </w:p>
+        </w:tc>
+        <w:tc>
+          <w:tcPr>
+            <w:tcW w:type="dxa" w:w="2880"/>
+          </w:tcPr>
+          <w:p>
+            <w:r>
+              <w:t>300</w:t>
+            </w:r>
+          </w:p>
+        </w:tc>
+        <w:tc>
+          <w:tcPr>
+            <w:tcW w:type="dxa" w:w="2880"/>
+          </w:tcPr>
+          <w:p>
+            <w:r>
+              <w:t>39400</w:t>
+            </w:r>
+          </w:p>
+        </w:tc>
+      </w:tr>
+      <w:tr>
+        <w:tc>
+          <w:tcPr>
+            <w:tcW w:type="dxa" w:w="2880"/>
+          </w:tcPr>
+          <w:p>
+            <w:r>
+              <w:t>Mean</w:t>
+            </w:r>
+          </w:p>
+        </w:tc>
+        <w:tc>
+          <w:tcPr>
+            <w:tcW w:type="dxa" w:w="2880"/>
+          </w:tcPr>
+          <w:p>
+            <w:r>
+              <w:t>0.137</w:t>
+            </w:r>
+          </w:p>
+        </w:tc>
+        <w:tc>
+          <w:tcPr>
+            <w:tcW w:type="dxa" w:w="2880"/>
+          </w:tcPr>
+          <w:p>
+            <w:r>
+              <w:t>0.022</w:t>
+            </w:r>
+          </w:p>
+        </w:tc>
+      </w:tr>
+      <w:tr>
+        <w:tc>
+          <w:tcPr>
+            <w:tcW w:type="dxa" w:w="2880"/>
+          </w:tcPr>
+          <w:p>
+            <w:r>
+              <w:t>Median</w:t>
+            </w:r>
+          </w:p>
+        </w:tc>
+        <w:tc>
+          <w:tcPr>
+            <w:tcW w:type="dxa" w:w="2880"/>
+          </w:tcPr>
+          <w:p>
+            <w:r>
+              <w:t>0.152</w:t>
+            </w:r>
+          </w:p>
+        </w:tc>
+        <w:tc>
+          <w:tcPr>
+            <w:tcW w:type="dxa" w:w="2880"/>
+          </w:tcPr>
+          <w:p>
+            <w:r>
+              <w:t>0.000</w:t>
+            </w:r>
+          </w:p>
+        </w:tc>
+      </w:tr>
+      <w:tr>
+        <w:tc>
+          <w:tcPr>
+            <w:tcW w:type="dxa" w:w="2880"/>
+          </w:tcPr>
+          <w:p>
+            <w:r>
+              <w:t>Std Dev</w:t>
+            </w:r>
+          </w:p>
+        </w:tc>
+        <w:tc>
+          <w:tcPr>
+            <w:tcW w:type="dxa" w:w="2880"/>
+          </w:tcPr>
+          <w:p>
+            <w:r>
+              <w:t>0.054</w:t>
+            </w:r>
+          </w:p>
+        </w:tc>
+        <w:tc>
+          <w:tcPr>
+            <w:tcW w:type="dxa" w:w="2880"/>
+          </w:tcPr>
+          <w:p>
+            <w:r>
+              <w:t>0.031</w:t>
+            </w:r>
+          </w:p>
+        </w:tc>
+      </w:tr>
+      <w:tr>
+        <w:tc>
+          <w:tcPr>
+            <w:tcW w:type="dxa" w:w="2880"/>
+          </w:tcPr>
+          <w:p>
+            <w:r>
+              <w:t>Min</w:t>
+            </w:r>
+          </w:p>
+        </w:tc>
+        <w:tc>
+          <w:tcPr>
+            <w:tcW w:type="dxa" w:w="2880"/>
+          </w:tcPr>
+          <w:p>
+            <w:r>
+              <w:t>0.000</w:t>
+            </w:r>
+          </w:p>
+        </w:tc>
+        <w:tc>
+          <w:tcPr>
+            <w:tcW w:type="dxa" w:w="2880"/>
+          </w:tcPr>
+          <w:p>
+            <w:r>
+              <w:t>0.000</w:t>
+            </w:r>
+          </w:p>
+        </w:tc>
+      </w:tr>
+      <w:tr>
+        <w:tc>
+          <w:tcPr>
+            <w:tcW w:type="dxa" w:w="2880"/>
+          </w:tcPr>
+          <w:p>
+            <w:r>
+              <w:t>Max</w:t>
+            </w:r>
+          </w:p>
+        </w:tc>
+        <w:tc>
+          <w:tcPr>
+            <w:tcW w:type="dxa" w:w="2880"/>
+          </w:tcPr>
+          <w:p>
+            <w:r>
+              <w:t>0.227</w:t>
+            </w:r>
+          </w:p>
+        </w:tc>
+        <w:tc>
+          <w:tcPr>
+            <w:tcW w:type="dxa" w:w="2880"/>
+          </w:tcPr>
+          <w:p>
+            <w:r>
+              <w:t>0.185</w:t>
+            </w:r>
+          </w:p>
+        </w:tc>
+      </w:tr>
+    </w:tbl>
+    <w:p>
+      <w:pPr>
+        <w:pStyle w:val="Heading3"/>
+      </w:pPr>
+      <w:r>
+        <w:t>Differences between successful and unsuccessful random variants (Mann-Whitney U):</w:t>
+      </w:r>
+    </w:p>
+    <w:tbl>
+      <w:tblPr>
+        <w:tblStyle w:val="LightGrid-Accent1"/>
+        <w:tblW w:type="auto" w:w="0"/>
+        <w:tblLook w:firstColumn="1" w:firstRow="1" w:lastColumn="0" w:lastRow="0" w:noHBand="0" w:noVBand="1" w:val="04A0"/>
+      </w:tblPr>
+      <w:tblGrid>
+        <w:gridCol w:w="4320"/>
+        <w:gridCol w:w="4320"/>
+      </w:tblGrid>
+      <w:tr>
+        <w:tc>
+          <w:tcPr>
+            <w:tcW w:type="dxa" w:w="4320"/>
+          </w:tcPr>
+          <w:p>
+            <w:r>
+              <w:t>Test Statistic</w:t>
+            </w:r>
+          </w:p>
+        </w:tc>
+        <w:tc>
+          <w:tcPr>
+            <w:tcW w:type="dxa" w:w="4320"/>
+          </w:tcPr>
+          <w:p>
+            <w:r>
+              <w:t>Value</w:t>
+            </w:r>
+          </w:p>
+        </w:tc>
+      </w:tr>
+      <w:tr>
+        <w:tc>
+          <w:tcPr>
+            <w:tcW w:type="dxa" w:w="4320"/>
+          </w:tcPr>
+          <w:p>
+            <w:r>
+              <w:t>U-statistic</w:t>
+            </w:r>
+          </w:p>
+        </w:tc>
+        <w:tc>
+          <w:tcPr>
+            <w:tcW w:type="dxa" w:w="4320"/>
+          </w:tcPr>
+          <w:p>
+            <w:r>
+              <w:t>764851.5000</w:t>
+            </w:r>
+          </w:p>
+        </w:tc>
+      </w:tr>
+      <w:tr>
+        <w:tc>
+          <w:tcPr>
+            <w:tcW w:type="dxa" w:w="4320"/>
+          </w:tcPr>
+          <w:p>
+            <w:r>
+              <w:t>p-value</w:t>
+            </w:r>
+          </w:p>
+        </w:tc>
+        <w:tc>
+          <w:tcPr>
+            <w:tcW w:type="dxa" w:w="4320"/>
+          </w:tcPr>
+          <w:p>
+            <w:r>
+              <w:t>3.3969e-191</w:t>
+            </w:r>
+          </w:p>
+        </w:tc>
+      </w:tr>
+    </w:tbl>
+    <w:p/>
+    <w:p>
+      <w:pPr/>
+      <w:r>
+        <w:t>TBD - Interpretation of food per tick differences.</w:t>
       </w:r>
     </w:p>
     <w:sectPr>

</xml_diff>

<commit_message>
fixed bug in decision making
</commit_message>
<xml_diff>
--- a/data/random_no_regrow/analysis/median_survival/report_median_survival.docx
+++ b/data/random_no_regrow/analysis/median_survival/report_median_survival.docx
@@ -51,7 +51,20 @@
     </w:p>
     <w:p>
       <w:r>
-        <w:t>Total data points (random): 100000</w:t>
+        <w:t>Total data points (random): 100200</w:t>
+      </w:r>
+    </w:p>
+    <w:p>
+      <w:pPr>
+        <w:pStyle w:val="Heading3"/>
+      </w:pPr>
+      <w:r>
+        <w:t>Benchmark Variants:</w:t>
+      </w:r>
+    </w:p>
+    <w:p>
+      <w:r>
+        <w:t>Hard-wired Lookup: 200 data points (2 variants)</w:t>
       </w:r>
     </w:p>
     <w:p>
@@ -124,7 +137,7 @@
           </w:tcPr>
           <w:p>
             <w:r>
-              <w:t>33.93 ticks</w:t>
+              <w:t>33.92 ticks</w:t>
             </w:r>
           </w:p>
         </w:tc>
@@ -168,7 +181,7 @@
           </w:tcPr>
           <w:p>
             <w:r>
-              <w:t>26.85 ticks</w:t>
+              <w:t>26.83 ticks</w:t>
             </w:r>
           </w:p>
         </w:tc>
@@ -366,7 +379,7 @@
           </w:tcPr>
           <w:p>
             <w:r>
-              <w:t>5.085</w:t>
+              <w:t>5.090</w:t>
             </w:r>
           </w:p>
         </w:tc>
@@ -388,7 +401,7 @@
           </w:tcPr>
           <w:p>
             <w:r>
-              <w:t>54.580</w:t>
+              <w:t>54.692</w:t>
             </w:r>
           </w:p>
         </w:tc>
@@ -410,7 +423,7 @@
           </w:tcPr>
           <w:p>
             <w:r>
-              <w:t>79.14 %</w:t>
+              <w:t>79.08 %</w:t>
             </w:r>
           </w:p>
         </w:tc>
@@ -515,7 +528,7 @@
           </w:tcPr>
           <w:p>
             <w:r>
-              <w:t>33.93 ticks</w:t>
+              <w:t>33.92 ticks</w:t>
             </w:r>
           </w:p>
         </w:tc>
@@ -599,7 +612,7 @@
           </w:tcPr>
           <w:p>
             <w:r>
-              <w:t>16.58 ticks</w:t>
+              <w:t>16.55 ticks</w:t>
             </w:r>
           </w:p>
         </w:tc>
@@ -641,7 +654,7 @@
           </w:tcPr>
           <w:p>
             <w:r>
-              <w:t>17.89 ticks</w:t>
+              <w:t>17.91 ticks</w:t>
             </w:r>
           </w:p>
         </w:tc>
@@ -683,7 +696,7 @@
           </w:tcPr>
           <w:p>
             <w:r>
-              <w:t>103.67 ticks</w:t>
+              <w:t>103.56 ticks</w:t>
             </w:r>
           </w:p>
         </w:tc>
@@ -725,7 +738,7 @@
           </w:tcPr>
           <w:p>
             <w:r>
-              <w:t>85.78 ticks</w:t>
+              <w:t>85.66 ticks</w:t>
             </w:r>
           </w:p>
         </w:tc>
@@ -767,7 +780,7 @@
           </w:tcPr>
           <w:p>
             <w:r>
-              <w:t>17.76 ticks</w:t>
+              <w:t>17.73 ticks</w:t>
             </w:r>
           </w:p>
         </w:tc>
@@ -809,7 +822,7 @@
           </w:tcPr>
           <w:p>
             <w:r>
-              <w:t>19.10 ticks</w:t>
+              <w:t>19.12 ticks</w:t>
             </w:r>
           </w:p>
         </w:tc>
@@ -851,7 +864,7 @@
           </w:tcPr>
           <w:p>
             <w:r>
-              <w:t>22.32 ticks</w:t>
+              <w:t>22.34 ticks</w:t>
             </w:r>
           </w:p>
         </w:tc>
@@ -893,7 +906,7 @@
           </w:tcPr>
           <w:p>
             <w:r>
-              <w:t>40.08 ticks</w:t>
+              <w:t>40.07 ticks</w:t>
             </w:r>
           </w:p>
         </w:tc>
@@ -935,7 +948,7 @@
           </w:tcPr>
           <w:p>
             <w:r>
-              <w:t>65.82 ticks</w:t>
+              <w:t>65.76 ticks</w:t>
             </w:r>
           </w:p>
         </w:tc>
@@ -977,7 +990,7 @@
           </w:tcPr>
           <w:p>
             <w:r>
-              <w:t>2.183</w:t>
+              <w:t>2.181</w:t>
             </w:r>
           </w:p>
         </w:tc>
@@ -1019,7 +1032,7 @@
           </w:tcPr>
           <w:p>
             <w:r>
-              <w:t>7.526</w:t>
+              <w:t>7.516</w:t>
             </w:r>
           </w:p>
         </w:tc>
@@ -1061,7 +1074,364 @@
           </w:tcPr>
           <w:p>
             <w:r>
-              <w:t>43.49 %</w:t>
+              <w:t>43.43 %</w:t>
+            </w:r>
+          </w:p>
+        </w:tc>
+      </w:tr>
+    </w:tbl>
+    <w:p>
+      <w:pPr>
+        <w:pStyle w:val="Heading2"/>
+      </w:pPr>
+      <w:r>
+        <w:t>1.2. Summary Statistics - Benchmark Variants</w:t>
+      </w:r>
+    </w:p>
+    <w:p>
+      <w:pPr>
+        <w:pStyle w:val="Heading3"/>
+      </w:pPr>
+      <w:r>
+        <w:t>Hard-wired Lookup</w:t>
+      </w:r>
+    </w:p>
+    <w:tbl>
+      <w:tblPr>
+        <w:tblStyle w:val="LightGrid-Accent1"/>
+        <w:tblW w:type="auto" w:w="0"/>
+        <w:tblLook w:firstColumn="1" w:firstRow="1" w:lastColumn="0" w:lastRow="0" w:noHBand="0" w:noVBand="1" w:val="04A0"/>
+      </w:tblPr>
+      <w:tblGrid>
+        <w:gridCol w:w="4320"/>
+        <w:gridCol w:w="4320"/>
+      </w:tblGrid>
+      <w:tr>
+        <w:tc>
+          <w:tcPr>
+            <w:tcW w:type="dxa" w:w="4320"/>
+          </w:tcPr>
+          <w:p>
+            <w:r>
+              <w:t>Statistic</w:t>
+            </w:r>
+          </w:p>
+        </w:tc>
+        <w:tc>
+          <w:tcPr>
+            <w:tcW w:type="dxa" w:w="4320"/>
+          </w:tcPr>
+          <w:p>
+            <w:r>
+              <w:t>Value</w:t>
+            </w:r>
+          </w:p>
+        </w:tc>
+      </w:tr>
+      <w:tr>
+        <w:tc>
+          <w:tcPr>
+            <w:tcW w:type="dxa" w:w="4320"/>
+          </w:tcPr>
+          <w:p>
+            <w:r>
+              <w:t>Mean</w:t>
+            </w:r>
+          </w:p>
+        </w:tc>
+        <w:tc>
+          <w:tcPr>
+            <w:tcW w:type="dxa" w:w="4320"/>
+          </w:tcPr>
+          <w:p>
+            <w:r>
+              <w:t>31.47 ticks</w:t>
+            </w:r>
+          </w:p>
+        </w:tc>
+      </w:tr>
+      <w:tr>
+        <w:tc>
+          <w:tcPr>
+            <w:tcW w:type="dxa" w:w="4320"/>
+          </w:tcPr>
+          <w:p>
+            <w:r>
+              <w:t>Median</w:t>
+            </w:r>
+          </w:p>
+        </w:tc>
+        <w:tc>
+          <w:tcPr>
+            <w:tcW w:type="dxa" w:w="4320"/>
+          </w:tcPr>
+          <w:p>
+            <w:r>
+              <w:t>30.00 ticks</w:t>
+            </w:r>
+          </w:p>
+        </w:tc>
+      </w:tr>
+      <w:tr>
+        <w:tc>
+          <w:tcPr>
+            <w:tcW w:type="dxa" w:w="4320"/>
+          </w:tcPr>
+          <w:p>
+            <w:r>
+              <w:t>Std Dev</w:t>
+            </w:r>
+          </w:p>
+        </w:tc>
+        <w:tc>
+          <w:tcPr>
+            <w:tcW w:type="dxa" w:w="4320"/>
+          </w:tcPr>
+          <w:p>
+            <w:r>
+              <w:t>4.02 ticks</w:t>
+            </w:r>
+          </w:p>
+        </w:tc>
+      </w:tr>
+      <w:tr>
+        <w:tc>
+          <w:tcPr>
+            <w:tcW w:type="dxa" w:w="4320"/>
+          </w:tcPr>
+          <w:p>
+            <w:r>
+              <w:t>Min</w:t>
+            </w:r>
+          </w:p>
+        </w:tc>
+        <w:tc>
+          <w:tcPr>
+            <w:tcW w:type="dxa" w:w="4320"/>
+          </w:tcPr>
+          <w:p>
+            <w:r>
+              <w:t>24.00 ticks</w:t>
+            </w:r>
+          </w:p>
+        </w:tc>
+      </w:tr>
+      <w:tr>
+        <w:tc>
+          <w:tcPr>
+            <w:tcW w:type="dxa" w:w="4320"/>
+          </w:tcPr>
+          <w:p>
+            <w:r>
+              <w:t>Max</w:t>
+            </w:r>
+          </w:p>
+        </w:tc>
+        <w:tc>
+          <w:tcPr>
+            <w:tcW w:type="dxa" w:w="4320"/>
+          </w:tcPr>
+          <w:p>
+            <w:r>
+              <w:t>48.00 ticks</w:t>
+            </w:r>
+          </w:p>
+        </w:tc>
+      </w:tr>
+      <w:tr>
+        <w:tc>
+          <w:tcPr>
+            <w:tcW w:type="dxa" w:w="4320"/>
+          </w:tcPr>
+          <w:p>
+            <w:r>
+              <w:t>Range</w:t>
+            </w:r>
+          </w:p>
+        </w:tc>
+        <w:tc>
+          <w:tcPr>
+            <w:tcW w:type="dxa" w:w="4320"/>
+          </w:tcPr>
+          <w:p>
+            <w:r>
+              <w:t>24.00 ticks</w:t>
+            </w:r>
+          </w:p>
+        </w:tc>
+      </w:tr>
+      <w:tr>
+        <w:tc>
+          <w:tcPr>
+            <w:tcW w:type="dxa" w:w="4320"/>
+          </w:tcPr>
+          <w:p>
+            <w:r>
+              <w:t>IQR (25th-75th percentile)</w:t>
+            </w:r>
+          </w:p>
+        </w:tc>
+        <w:tc>
+          <w:tcPr>
+            <w:tcW w:type="dxa" w:w="4320"/>
+          </w:tcPr>
+          <w:p>
+            <w:r>
+              <w:t>3.00 ticks</w:t>
+            </w:r>
+          </w:p>
+        </w:tc>
+      </w:tr>
+      <w:tr>
+        <w:tc>
+          <w:tcPr>
+            <w:tcW w:type="dxa" w:w="4320"/>
+          </w:tcPr>
+          <w:p>
+            <w:r>
+              <w:t>5th Percentile</w:t>
+            </w:r>
+          </w:p>
+        </w:tc>
+        <w:tc>
+          <w:tcPr>
+            <w:tcW w:type="dxa" w:w="4320"/>
+          </w:tcPr>
+          <w:p>
+            <w:r>
+              <w:t>26.95 ticks</w:t>
+            </w:r>
+          </w:p>
+        </w:tc>
+      </w:tr>
+      <w:tr>
+        <w:tc>
+          <w:tcPr>
+            <w:tcW w:type="dxa" w:w="4320"/>
+          </w:tcPr>
+          <w:p>
+            <w:r>
+              <w:t>25th Percentile</w:t>
+            </w:r>
+          </w:p>
+        </w:tc>
+        <w:tc>
+          <w:tcPr>
+            <w:tcW w:type="dxa" w:w="4320"/>
+          </w:tcPr>
+          <w:p>
+            <w:r>
+              <w:t>29.00 ticks</w:t>
+            </w:r>
+          </w:p>
+        </w:tc>
+      </w:tr>
+      <w:tr>
+        <w:tc>
+          <w:tcPr>
+            <w:tcW w:type="dxa" w:w="4320"/>
+          </w:tcPr>
+          <w:p>
+            <w:r>
+              <w:t>75th Percentile</w:t>
+            </w:r>
+          </w:p>
+        </w:tc>
+        <w:tc>
+          <w:tcPr>
+            <w:tcW w:type="dxa" w:w="4320"/>
+          </w:tcPr>
+          <w:p>
+            <w:r>
+              <w:t>32.00 ticks</w:t>
+            </w:r>
+          </w:p>
+        </w:tc>
+      </w:tr>
+      <w:tr>
+        <w:tc>
+          <w:tcPr>
+            <w:tcW w:type="dxa" w:w="4320"/>
+          </w:tcPr>
+          <w:p>
+            <w:r>
+              <w:t>95th Percentile</w:t>
+            </w:r>
+          </w:p>
+        </w:tc>
+        <w:tc>
+          <w:tcPr>
+            <w:tcW w:type="dxa" w:w="4320"/>
+          </w:tcPr>
+          <w:p>
+            <w:r>
+              <w:t>39.05 ticks</w:t>
+            </w:r>
+          </w:p>
+        </w:tc>
+      </w:tr>
+      <w:tr>
+        <w:tc>
+          <w:tcPr>
+            <w:tcW w:type="dxa" w:w="4320"/>
+          </w:tcPr>
+          <w:p>
+            <w:r>
+              <w:t>Skewness</w:t>
+            </w:r>
+          </w:p>
+        </w:tc>
+        <w:tc>
+          <w:tcPr>
+            <w:tcW w:type="dxa" w:w="4320"/>
+          </w:tcPr>
+          <w:p>
+            <w:r>
+              <w:t>1.320</w:t>
+            </w:r>
+          </w:p>
+        </w:tc>
+      </w:tr>
+      <w:tr>
+        <w:tc>
+          <w:tcPr>
+            <w:tcW w:type="dxa" w:w="4320"/>
+          </w:tcPr>
+          <w:p>
+            <w:r>
+              <w:t>Kurtosis (excess)</w:t>
+            </w:r>
+          </w:p>
+        </w:tc>
+        <w:tc>
+          <w:tcPr>
+            <w:tcW w:type="dxa" w:w="4320"/>
+          </w:tcPr>
+          <w:p>
+            <w:r>
+              <w:t>2.338</w:t>
+            </w:r>
+          </w:p>
+        </w:tc>
+      </w:tr>
+      <w:tr>
+        <w:tc>
+          <w:tcPr>
+            <w:tcW w:type="dxa" w:w="4320"/>
+          </w:tcPr>
+          <w:p>
+            <w:r>
+              <w:t>Coefficient of Variation</w:t>
+            </w:r>
+          </w:p>
+        </w:tc>
+        <w:tc>
+          <w:tcPr>
+            <w:tcW w:type="dxa" w:w="4320"/>
+          </w:tcPr>
+          <w:p>
+            <w:r>
+              <w:t>12.77 %</w:t>
             </w:r>
           </w:p>
         </w:tc>
@@ -1258,6 +1628,11 @@
     <w:p>
       <w:r>
         <w:t xml:space="preserve">  • Gray: Middle range (other variants)</w:t>
+      </w:r>
+    </w:p>
+    <w:p>
+      <w:r>
+        <w:t xml:space="preserve">  • Colored lines: Benchmark variants</w:t>
       </w:r>
     </w:p>
     <w:p>
@@ -1842,7 +2217,7 @@
         <w:pStyle w:val="Heading3"/>
       </w:pPr>
       <w:r>
-        <w:t>Differences between successful and unsuccessful random variants (Mann-Whitney U):</w:t>
+        <w:t>Differences between successful, unsuccessful, and benchmark variants (Kruskal-Wallis):</w:t>
       </w:r>
     </w:p>
     <w:tbl>
@@ -1884,7 +2259,7 @@
           </w:tcPr>
           <w:p>
             <w:r>
-              <w:t>U-statistic</w:t>
+              <w:t>H-statistic</w:t>
             </w:r>
           </w:p>
         </w:tc>
@@ -1894,7 +2269,7 @@
           </w:tcPr>
           <w:p>
             <w:r>
-              <w:t>896630.5000</w:t>
+              <w:t>1005.0974</w:t>
             </w:r>
           </w:p>
         </w:tc>
@@ -1916,13 +2291,202 @@
           </w:tcPr>
           <w:p>
             <w:r>
-              <w:t>9.7296e-155</w:t>
+              <w:t>5.5703e-219</w:t>
             </w:r>
           </w:p>
         </w:tc>
       </w:tr>
     </w:tbl>
     <w:p/>
+    <w:p>
+      <w:pPr>
+        <w:pStyle w:val="Heading3"/>
+      </w:pPr>
+      <w:r>
+        <w:t>Dunn's Post-hoc Test Results (pairwise comparisons, Bonferroni-adjusted):</w:t>
+      </w:r>
+    </w:p>
+    <w:tbl>
+      <w:tblPr>
+        <w:tblStyle w:val="LightGrid-Accent1"/>
+        <w:tblW w:type="auto" w:w="0"/>
+        <w:tblLook w:firstColumn="1" w:firstRow="1" w:lastColumn="0" w:lastRow="0" w:noHBand="0" w:noVBand="1" w:val="04A0"/>
+      </w:tblPr>
+      <w:tblGrid>
+        <w:gridCol w:w="2160"/>
+        <w:gridCol w:w="2160"/>
+        <w:gridCol w:w="2160"/>
+        <w:gridCol w:w="2160"/>
+      </w:tblGrid>
+      <w:tr>
+        <w:tc>
+          <w:tcPr>
+            <w:tcW w:type="dxa" w:w="2160"/>
+          </w:tcPr>
+          <w:p>
+            <w:r>
+              <w:t>Comparison</w:t>
+            </w:r>
+          </w:p>
+        </w:tc>
+        <w:tc>
+          <w:tcPr>
+            <w:tcW w:type="dxa" w:w="2160"/>
+          </w:tcPr>
+          <w:p>
+            <w:r>
+              <w:t>Hard-wired Lookup</w:t>
+            </w:r>
+          </w:p>
+        </w:tc>
+        <w:tc>
+          <w:tcPr>
+            <w:tcW w:type="dxa" w:w="2160"/>
+          </w:tcPr>
+          <w:p>
+            <w:r>
+              <w:t>Successful</w:t>
+            </w:r>
+          </w:p>
+        </w:tc>
+        <w:tc>
+          <w:tcPr>
+            <w:tcW w:type="dxa" w:w="2160"/>
+          </w:tcPr>
+          <w:p>
+            <w:r>
+              <w:t>Unsuccessful</w:t>
+            </w:r>
+          </w:p>
+        </w:tc>
+      </w:tr>
+      <w:tr>
+        <w:tc>
+          <w:tcPr>
+            <w:tcW w:type="dxa" w:w="2160"/>
+          </w:tcPr>
+          <w:p>
+            <w:r>
+              <w:t>Hard-wired Lookup</w:t>
+            </w:r>
+          </w:p>
+        </w:tc>
+        <w:tc>
+          <w:tcPr>
+            <w:tcW w:type="dxa" w:w="2160"/>
+          </w:tcPr>
+          <w:p>
+            <w:r>
+              <w:t>1.0000</w:t>
+            </w:r>
+          </w:p>
+        </w:tc>
+        <w:tc>
+          <w:tcPr>
+            <w:tcW w:type="dxa" w:w="2160"/>
+          </w:tcPr>
+          <w:p>
+            <w:r>
+              <w:t>0.0029</w:t>
+            </w:r>
+          </w:p>
+        </w:tc>
+        <w:tc>
+          <w:tcPr>
+            <w:tcW w:type="dxa" w:w="2160"/>
+          </w:tcPr>
+          <w:p>
+            <w:r>
+              <w:t>0.0000</w:t>
+            </w:r>
+          </w:p>
+        </w:tc>
+      </w:tr>
+      <w:tr>
+        <w:tc>
+          <w:tcPr>
+            <w:tcW w:type="dxa" w:w="2160"/>
+          </w:tcPr>
+          <w:p>
+            <w:r>
+              <w:t>Successful</w:t>
+            </w:r>
+          </w:p>
+        </w:tc>
+        <w:tc>
+          <w:tcPr>
+            <w:tcW w:type="dxa" w:w="2160"/>
+          </w:tcPr>
+          <w:p>
+            <w:r>
+              <w:t>0.0029</w:t>
+            </w:r>
+          </w:p>
+        </w:tc>
+        <w:tc>
+          <w:tcPr>
+            <w:tcW w:type="dxa" w:w="2160"/>
+          </w:tcPr>
+          <w:p>
+            <w:r>
+              <w:t>1.0000</w:t>
+            </w:r>
+          </w:p>
+        </w:tc>
+        <w:tc>
+          <w:tcPr>
+            <w:tcW w:type="dxa" w:w="2160"/>
+          </w:tcPr>
+          <w:p>
+            <w:r>
+              <w:t>0.0000</w:t>
+            </w:r>
+          </w:p>
+        </w:tc>
+      </w:tr>
+      <w:tr>
+        <w:tc>
+          <w:tcPr>
+            <w:tcW w:type="dxa" w:w="2160"/>
+          </w:tcPr>
+          <w:p>
+            <w:r>
+              <w:t>Unsuccessful</w:t>
+            </w:r>
+          </w:p>
+        </w:tc>
+        <w:tc>
+          <w:tcPr>
+            <w:tcW w:type="dxa" w:w="2160"/>
+          </w:tcPr>
+          <w:p>
+            <w:r>
+              <w:t>0.0000</w:t>
+            </w:r>
+          </w:p>
+        </w:tc>
+        <w:tc>
+          <w:tcPr>
+            <w:tcW w:type="dxa" w:w="2160"/>
+          </w:tcPr>
+          <w:p>
+            <w:r>
+              <w:t>0.0000</w:t>
+            </w:r>
+          </w:p>
+        </w:tc>
+        <w:tc>
+          <w:tcPr>
+            <w:tcW w:type="dxa" w:w="2160"/>
+          </w:tcPr>
+          <w:p>
+            <w:r>
+              <w:t>1.0000</w:t>
+            </w:r>
+          </w:p>
+        </w:tc>
+      </w:tr>
+    </w:tbl>
     <w:p>
       <w:pPr/>
       <w:r>
@@ -2124,7 +2688,7 @@
       <w:r>
         <w:drawing>
           <wp:inline xmlns:a="http://schemas.openxmlformats.org/drawingml/2006/main" xmlns:pic="http://schemas.openxmlformats.org/drawingml/2006/picture">
-            <wp:extent cx="5486400" cy="2743200"/>
+            <wp:extent cx="5486400" cy="1807167"/>
             <wp:docPr id="3" name="Picture 3"/>
             <wp:cNvGraphicFramePr>
               <a:graphicFrameLocks noChangeAspect="1"/>
@@ -2145,7 +2709,7 @@
                   <pic:spPr>
                     <a:xfrm>
                       <a:off x="0" y="0"/>
-                      <a:ext cx="5486400" cy="2743200"/>
+                      <a:ext cx="5486400" cy="1807167"/>
                     </a:xfrm>
                     <a:prstGeom prst="rect"/>
                   </pic:spPr>
@@ -2459,7 +3023,7 @@
         <w:pStyle w:val="Heading3"/>
       </w:pPr>
       <w:r>
-        <w:t>Differences between successful and unsuccessful random variants (Mann-Whitney U):</w:t>
+        <w:t>Differences between successful, unsuccessful, and benchmark variants (Kruskal-Wallis):</w:t>
       </w:r>
     </w:p>
     <w:tbl>
@@ -2501,7 +3065,7 @@
           </w:tcPr>
           <w:p>
             <w:r>
-              <w:t>U-statistic</w:t>
+              <w:t>H-statistic</w:t>
             </w:r>
           </w:p>
         </w:tc>
@@ -2511,7 +3075,7 @@
           </w:tcPr>
           <w:p>
             <w:r>
-              <w:t>6913970.5000</w:t>
+              <w:t>280.9229</w:t>
             </w:r>
           </w:p>
         </w:tc>
@@ -2533,13 +3097,202 @@
           </w:tcPr>
           <w:p>
             <w:r>
-              <w:t>3.7645e-07</w:t>
+              <w:t>9.9626e-62</w:t>
             </w:r>
           </w:p>
         </w:tc>
       </w:tr>
     </w:tbl>
     <w:p/>
+    <w:p>
+      <w:pPr>
+        <w:pStyle w:val="Heading3"/>
+      </w:pPr>
+      <w:r>
+        <w:t>Dunn's Post-hoc Test Results (pairwise comparisons, Bonferroni-adjusted):</w:t>
+      </w:r>
+    </w:p>
+    <w:tbl>
+      <w:tblPr>
+        <w:tblStyle w:val="LightGrid-Accent1"/>
+        <w:tblW w:type="auto" w:w="0"/>
+        <w:tblLook w:firstColumn="1" w:firstRow="1" w:lastColumn="0" w:lastRow="0" w:noHBand="0" w:noVBand="1" w:val="04A0"/>
+      </w:tblPr>
+      <w:tblGrid>
+        <w:gridCol w:w="2160"/>
+        <w:gridCol w:w="2160"/>
+        <w:gridCol w:w="2160"/>
+        <w:gridCol w:w="2160"/>
+      </w:tblGrid>
+      <w:tr>
+        <w:tc>
+          <w:tcPr>
+            <w:tcW w:type="dxa" w:w="2160"/>
+          </w:tcPr>
+          <w:p>
+            <w:r>
+              <w:t>Comparison</w:t>
+            </w:r>
+          </w:p>
+        </w:tc>
+        <w:tc>
+          <w:tcPr>
+            <w:tcW w:type="dxa" w:w="2160"/>
+          </w:tcPr>
+          <w:p>
+            <w:r>
+              <w:t>Hard-wired Lookup</w:t>
+            </w:r>
+          </w:p>
+        </w:tc>
+        <w:tc>
+          <w:tcPr>
+            <w:tcW w:type="dxa" w:w="2160"/>
+          </w:tcPr>
+          <w:p>
+            <w:r>
+              <w:t>Successful</w:t>
+            </w:r>
+          </w:p>
+        </w:tc>
+        <w:tc>
+          <w:tcPr>
+            <w:tcW w:type="dxa" w:w="2160"/>
+          </w:tcPr>
+          <w:p>
+            <w:r>
+              <w:t>Unsuccessful</w:t>
+            </w:r>
+          </w:p>
+        </w:tc>
+      </w:tr>
+      <w:tr>
+        <w:tc>
+          <w:tcPr>
+            <w:tcW w:type="dxa" w:w="2160"/>
+          </w:tcPr>
+          <w:p>
+            <w:r>
+              <w:t>Hard-wired Lookup</w:t>
+            </w:r>
+          </w:p>
+        </w:tc>
+        <w:tc>
+          <w:tcPr>
+            <w:tcW w:type="dxa" w:w="2160"/>
+          </w:tcPr>
+          <w:p>
+            <w:r>
+              <w:t>1.0000</w:t>
+            </w:r>
+          </w:p>
+        </w:tc>
+        <w:tc>
+          <w:tcPr>
+            <w:tcW w:type="dxa" w:w="2160"/>
+          </w:tcPr>
+          <w:p>
+            <w:r>
+              <w:t>0.0000</w:t>
+            </w:r>
+          </w:p>
+        </w:tc>
+        <w:tc>
+          <w:tcPr>
+            <w:tcW w:type="dxa" w:w="2160"/>
+          </w:tcPr>
+          <w:p>
+            <w:r>
+              <w:t>0.0000</w:t>
+            </w:r>
+          </w:p>
+        </w:tc>
+      </w:tr>
+      <w:tr>
+        <w:tc>
+          <w:tcPr>
+            <w:tcW w:type="dxa" w:w="2160"/>
+          </w:tcPr>
+          <w:p>
+            <w:r>
+              <w:t>Successful</w:t>
+            </w:r>
+          </w:p>
+        </w:tc>
+        <w:tc>
+          <w:tcPr>
+            <w:tcW w:type="dxa" w:w="2160"/>
+          </w:tcPr>
+          <w:p>
+            <w:r>
+              <w:t>0.0000</w:t>
+            </w:r>
+          </w:p>
+        </w:tc>
+        <w:tc>
+          <w:tcPr>
+            <w:tcW w:type="dxa" w:w="2160"/>
+          </w:tcPr>
+          <w:p>
+            <w:r>
+              <w:t>1.0000</w:t>
+            </w:r>
+          </w:p>
+        </w:tc>
+        <w:tc>
+          <w:tcPr>
+            <w:tcW w:type="dxa" w:w="2160"/>
+          </w:tcPr>
+          <w:p>
+            <w:r>
+              <w:t>0.0000</w:t>
+            </w:r>
+          </w:p>
+        </w:tc>
+      </w:tr>
+      <w:tr>
+        <w:tc>
+          <w:tcPr>
+            <w:tcW w:type="dxa" w:w="2160"/>
+          </w:tcPr>
+          <w:p>
+            <w:r>
+              <w:t>Unsuccessful</w:t>
+            </w:r>
+          </w:p>
+        </w:tc>
+        <w:tc>
+          <w:tcPr>
+            <w:tcW w:type="dxa" w:w="2160"/>
+          </w:tcPr>
+          <w:p>
+            <w:r>
+              <w:t>0.0000</w:t>
+            </w:r>
+          </w:p>
+        </w:tc>
+        <w:tc>
+          <w:tcPr>
+            <w:tcW w:type="dxa" w:w="2160"/>
+          </w:tcPr>
+          <w:p>
+            <w:r>
+              <w:t>0.0000</w:t>
+            </w:r>
+          </w:p>
+        </w:tc>
+        <w:tc>
+          <w:tcPr>
+            <w:tcW w:type="dxa" w:w="2160"/>
+          </w:tcPr>
+          <w:p>
+            <w:r>
+              <w:t>1.0000</w:t>
+            </w:r>
+          </w:p>
+        </w:tc>
+      </w:tr>
+    </w:tbl>
     <w:p>
       <w:pPr/>
       <w:r>
@@ -2845,7 +3598,7 @@
         <w:pStyle w:val="Heading3"/>
       </w:pPr>
       <w:r>
-        <w:t>Differences between successful and unsuccessful random variants (Mann-Whitney U):</w:t>
+        <w:t>Differences between successful, unsuccessful, and benchmark variants (Kruskal-Wallis):</w:t>
       </w:r>
     </w:p>
     <w:tbl>
@@ -2887,7 +3640,7 @@
           </w:tcPr>
           <w:p>
             <w:r>
-              <w:t>U-statistic</w:t>
+              <w:t>H-statistic</w:t>
             </w:r>
           </w:p>
         </w:tc>
@@ -2897,7 +3650,7 @@
           </w:tcPr>
           <w:p>
             <w:r>
-              <w:t>1062892.0000</w:t>
+              <w:t>1233.8830</w:t>
             </w:r>
           </w:p>
         </w:tc>
@@ -2919,13 +3672,202 @@
           </w:tcPr>
           <w:p>
             <w:r>
-              <w:t>3.7925e-139</w:t>
+              <w:t>1.1633e-268</w:t>
             </w:r>
           </w:p>
         </w:tc>
       </w:tr>
     </w:tbl>
     <w:p/>
+    <w:p>
+      <w:pPr>
+        <w:pStyle w:val="Heading3"/>
+      </w:pPr>
+      <w:r>
+        <w:t>Dunn's Post-hoc Test Results (pairwise comparisons, Bonferroni-adjusted):</w:t>
+      </w:r>
+    </w:p>
+    <w:tbl>
+      <w:tblPr>
+        <w:tblStyle w:val="LightGrid-Accent1"/>
+        <w:tblW w:type="auto" w:w="0"/>
+        <w:tblLook w:firstColumn="1" w:firstRow="1" w:lastColumn="0" w:lastRow="0" w:noHBand="0" w:noVBand="1" w:val="04A0"/>
+      </w:tblPr>
+      <w:tblGrid>
+        <w:gridCol w:w="2160"/>
+        <w:gridCol w:w="2160"/>
+        <w:gridCol w:w="2160"/>
+        <w:gridCol w:w="2160"/>
+      </w:tblGrid>
+      <w:tr>
+        <w:tc>
+          <w:tcPr>
+            <w:tcW w:type="dxa" w:w="2160"/>
+          </w:tcPr>
+          <w:p>
+            <w:r>
+              <w:t>Comparison</w:t>
+            </w:r>
+          </w:p>
+        </w:tc>
+        <w:tc>
+          <w:tcPr>
+            <w:tcW w:type="dxa" w:w="2160"/>
+          </w:tcPr>
+          <w:p>
+            <w:r>
+              <w:t>Hard-wired Lookup</w:t>
+            </w:r>
+          </w:p>
+        </w:tc>
+        <w:tc>
+          <w:tcPr>
+            <w:tcW w:type="dxa" w:w="2160"/>
+          </w:tcPr>
+          <w:p>
+            <w:r>
+              <w:t>Successful</w:t>
+            </w:r>
+          </w:p>
+        </w:tc>
+        <w:tc>
+          <w:tcPr>
+            <w:tcW w:type="dxa" w:w="2160"/>
+          </w:tcPr>
+          <w:p>
+            <w:r>
+              <w:t>Unsuccessful</w:t>
+            </w:r>
+          </w:p>
+        </w:tc>
+      </w:tr>
+      <w:tr>
+        <w:tc>
+          <w:tcPr>
+            <w:tcW w:type="dxa" w:w="2160"/>
+          </w:tcPr>
+          <w:p>
+            <w:r>
+              <w:t>Hard-wired Lookup</w:t>
+            </w:r>
+          </w:p>
+        </w:tc>
+        <w:tc>
+          <w:tcPr>
+            <w:tcW w:type="dxa" w:w="2160"/>
+          </w:tcPr>
+          <w:p>
+            <w:r>
+              <w:t>1.0000</w:t>
+            </w:r>
+          </w:p>
+        </w:tc>
+        <w:tc>
+          <w:tcPr>
+            <w:tcW w:type="dxa" w:w="2160"/>
+          </w:tcPr>
+          <w:p>
+            <w:r>
+              <w:t>0.0000</w:t>
+            </w:r>
+          </w:p>
+        </w:tc>
+        <w:tc>
+          <w:tcPr>
+            <w:tcW w:type="dxa" w:w="2160"/>
+          </w:tcPr>
+          <w:p>
+            <w:r>
+              <w:t>0.0000</w:t>
+            </w:r>
+          </w:p>
+        </w:tc>
+      </w:tr>
+      <w:tr>
+        <w:tc>
+          <w:tcPr>
+            <w:tcW w:type="dxa" w:w="2160"/>
+          </w:tcPr>
+          <w:p>
+            <w:r>
+              <w:t>Successful</w:t>
+            </w:r>
+          </w:p>
+        </w:tc>
+        <w:tc>
+          <w:tcPr>
+            <w:tcW w:type="dxa" w:w="2160"/>
+          </w:tcPr>
+          <w:p>
+            <w:r>
+              <w:t>0.0000</w:t>
+            </w:r>
+          </w:p>
+        </w:tc>
+        <w:tc>
+          <w:tcPr>
+            <w:tcW w:type="dxa" w:w="2160"/>
+          </w:tcPr>
+          <w:p>
+            <w:r>
+              <w:t>1.0000</w:t>
+            </w:r>
+          </w:p>
+        </w:tc>
+        <w:tc>
+          <w:tcPr>
+            <w:tcW w:type="dxa" w:w="2160"/>
+          </w:tcPr>
+          <w:p>
+            <w:r>
+              <w:t>0.0000</w:t>
+            </w:r>
+          </w:p>
+        </w:tc>
+      </w:tr>
+      <w:tr>
+        <w:tc>
+          <w:tcPr>
+            <w:tcW w:type="dxa" w:w="2160"/>
+          </w:tcPr>
+          <w:p>
+            <w:r>
+              <w:t>Unsuccessful</w:t>
+            </w:r>
+          </w:p>
+        </w:tc>
+        <w:tc>
+          <w:tcPr>
+            <w:tcW w:type="dxa" w:w="2160"/>
+          </w:tcPr>
+          <w:p>
+            <w:r>
+              <w:t>0.0000</w:t>
+            </w:r>
+          </w:p>
+        </w:tc>
+        <w:tc>
+          <w:tcPr>
+            <w:tcW w:type="dxa" w:w="2160"/>
+          </w:tcPr>
+          <w:p>
+            <w:r>
+              <w:t>0.0000</w:t>
+            </w:r>
+          </w:p>
+        </w:tc>
+        <w:tc>
+          <w:tcPr>
+            <w:tcW w:type="dxa" w:w="2160"/>
+          </w:tcPr>
+          <w:p>
+            <w:r>
+              <w:t>1.0000</w:t>
+            </w:r>
+          </w:p>
+        </w:tc>
+      </w:tr>
+    </w:tbl>
     <w:p>
       <w:pPr/>
       <w:r>
@@ -3218,7 +4160,7 @@
         <w:pStyle w:val="Heading3"/>
       </w:pPr>
       <w:r>
-        <w:t>Differences between successful and unsuccessful random variants (Mann-Whitney U):</w:t>
+        <w:t>Differences between successful, unsuccessful, and benchmark variants (Kruskal-Wallis):</w:t>
       </w:r>
     </w:p>
     <w:tbl>
@@ -3260,7 +4202,7 @@
           </w:tcPr>
           <w:p>
             <w:r>
-              <w:t>U-statistic</w:t>
+              <w:t>H-statistic</w:t>
             </w:r>
           </w:p>
         </w:tc>
@@ -3270,7 +4212,7 @@
           </w:tcPr>
           <w:p>
             <w:r>
-              <w:t>8745068.5000</w:t>
+              <w:t>821.1863</w:t>
             </w:r>
           </w:p>
         </w:tc>
@@ -3292,13 +4234,202 @@
           </w:tcPr>
           <w:p>
             <w:r>
-              <w:t>3.1366e-48</w:t>
+              <w:t>4.8045e-179</w:t>
             </w:r>
           </w:p>
         </w:tc>
       </w:tr>
     </w:tbl>
     <w:p/>
+    <w:p>
+      <w:pPr>
+        <w:pStyle w:val="Heading3"/>
+      </w:pPr>
+      <w:r>
+        <w:t>Dunn's Post-hoc Test Results (pairwise comparisons, Bonferroni-adjusted):</w:t>
+      </w:r>
+    </w:p>
+    <w:tbl>
+      <w:tblPr>
+        <w:tblStyle w:val="LightGrid-Accent1"/>
+        <w:tblW w:type="auto" w:w="0"/>
+        <w:tblLook w:firstColumn="1" w:firstRow="1" w:lastColumn="0" w:lastRow="0" w:noHBand="0" w:noVBand="1" w:val="04A0"/>
+      </w:tblPr>
+      <w:tblGrid>
+        <w:gridCol w:w="2160"/>
+        <w:gridCol w:w="2160"/>
+        <w:gridCol w:w="2160"/>
+        <w:gridCol w:w="2160"/>
+      </w:tblGrid>
+      <w:tr>
+        <w:tc>
+          <w:tcPr>
+            <w:tcW w:type="dxa" w:w="2160"/>
+          </w:tcPr>
+          <w:p>
+            <w:r>
+              <w:t>Comparison</w:t>
+            </w:r>
+          </w:p>
+        </w:tc>
+        <w:tc>
+          <w:tcPr>
+            <w:tcW w:type="dxa" w:w="2160"/>
+          </w:tcPr>
+          <w:p>
+            <w:r>
+              <w:t>Hard-wired Lookup</w:t>
+            </w:r>
+          </w:p>
+        </w:tc>
+        <w:tc>
+          <w:tcPr>
+            <w:tcW w:type="dxa" w:w="2160"/>
+          </w:tcPr>
+          <w:p>
+            <w:r>
+              <w:t>Successful</w:t>
+            </w:r>
+          </w:p>
+        </w:tc>
+        <w:tc>
+          <w:tcPr>
+            <w:tcW w:type="dxa" w:w="2160"/>
+          </w:tcPr>
+          <w:p>
+            <w:r>
+              <w:t>Unsuccessful</w:t>
+            </w:r>
+          </w:p>
+        </w:tc>
+      </w:tr>
+      <w:tr>
+        <w:tc>
+          <w:tcPr>
+            <w:tcW w:type="dxa" w:w="2160"/>
+          </w:tcPr>
+          <w:p>
+            <w:r>
+              <w:t>Hard-wired Lookup</w:t>
+            </w:r>
+          </w:p>
+        </w:tc>
+        <w:tc>
+          <w:tcPr>
+            <w:tcW w:type="dxa" w:w="2160"/>
+          </w:tcPr>
+          <w:p>
+            <w:r>
+              <w:t>1.0000</w:t>
+            </w:r>
+          </w:p>
+        </w:tc>
+        <w:tc>
+          <w:tcPr>
+            <w:tcW w:type="dxa" w:w="2160"/>
+          </w:tcPr>
+          <w:p>
+            <w:r>
+              <w:t>0.0000</w:t>
+            </w:r>
+          </w:p>
+        </w:tc>
+        <w:tc>
+          <w:tcPr>
+            <w:tcW w:type="dxa" w:w="2160"/>
+          </w:tcPr>
+          <w:p>
+            <w:r>
+              <w:t>0.0000</w:t>
+            </w:r>
+          </w:p>
+        </w:tc>
+      </w:tr>
+      <w:tr>
+        <w:tc>
+          <w:tcPr>
+            <w:tcW w:type="dxa" w:w="2160"/>
+          </w:tcPr>
+          <w:p>
+            <w:r>
+              <w:t>Successful</w:t>
+            </w:r>
+          </w:p>
+        </w:tc>
+        <w:tc>
+          <w:tcPr>
+            <w:tcW w:type="dxa" w:w="2160"/>
+          </w:tcPr>
+          <w:p>
+            <w:r>
+              <w:t>0.0000</w:t>
+            </w:r>
+          </w:p>
+        </w:tc>
+        <w:tc>
+          <w:tcPr>
+            <w:tcW w:type="dxa" w:w="2160"/>
+          </w:tcPr>
+          <w:p>
+            <w:r>
+              <w:t>1.0000</w:t>
+            </w:r>
+          </w:p>
+        </w:tc>
+        <w:tc>
+          <w:tcPr>
+            <w:tcW w:type="dxa" w:w="2160"/>
+          </w:tcPr>
+          <w:p>
+            <w:r>
+              <w:t>0.0000</w:t>
+            </w:r>
+          </w:p>
+        </w:tc>
+      </w:tr>
+      <w:tr>
+        <w:tc>
+          <w:tcPr>
+            <w:tcW w:type="dxa" w:w="2160"/>
+          </w:tcPr>
+          <w:p>
+            <w:r>
+              <w:t>Unsuccessful</w:t>
+            </w:r>
+          </w:p>
+        </w:tc>
+        <w:tc>
+          <w:tcPr>
+            <w:tcW w:type="dxa" w:w="2160"/>
+          </w:tcPr>
+          <w:p>
+            <w:r>
+              <w:t>0.0000</w:t>
+            </w:r>
+          </w:p>
+        </w:tc>
+        <w:tc>
+          <w:tcPr>
+            <w:tcW w:type="dxa" w:w="2160"/>
+          </w:tcPr>
+          <w:p>
+            <w:r>
+              <w:t>0.0000</w:t>
+            </w:r>
+          </w:p>
+        </w:tc>
+        <w:tc>
+          <w:tcPr>
+            <w:tcW w:type="dxa" w:w="2160"/>
+          </w:tcPr>
+          <w:p>
+            <w:r>
+              <w:t>1.0000</w:t>
+            </w:r>
+          </w:p>
+        </w:tc>
+      </w:tr>
+    </w:tbl>
     <w:p>
       <w:pPr/>
       <w:r>
@@ -3604,7 +4735,7 @@
         <w:pStyle w:val="Heading3"/>
       </w:pPr>
       <w:r>
-        <w:t>Differences between successful and unsuccessful random variants (Mann-Whitney U):</w:t>
+        <w:t>Differences between successful, unsuccessful, and benchmark variants (Kruskal-Wallis):</w:t>
       </w:r>
     </w:p>
     <w:tbl>
@@ -3646,7 +4777,7 @@
           </w:tcPr>
           <w:p>
             <w:r>
-              <w:t>U-statistic</w:t>
+              <w:t>H-statistic</w:t>
             </w:r>
           </w:p>
         </w:tc>
@@ -3656,7 +4787,7 @@
           </w:tcPr>
           <w:p>
             <w:r>
-              <w:t>797037.5000</w:t>
+              <w:t>883.1064</w:t>
             </w:r>
           </w:p>
         </w:tc>
@@ -3678,13 +4809,202 @@
           </w:tcPr>
           <w:p>
             <w:r>
-              <w:t>1.8570e-191</w:t>
+              <w:t>1.7214e-192</w:t>
             </w:r>
           </w:p>
         </w:tc>
       </w:tr>
     </w:tbl>
     <w:p/>
+    <w:p>
+      <w:pPr>
+        <w:pStyle w:val="Heading3"/>
+      </w:pPr>
+      <w:r>
+        <w:t>Dunn's Post-hoc Test Results (pairwise comparisons, Bonferroni-adjusted):</w:t>
+      </w:r>
+    </w:p>
+    <w:tbl>
+      <w:tblPr>
+        <w:tblStyle w:val="LightGrid-Accent1"/>
+        <w:tblW w:type="auto" w:w="0"/>
+        <w:tblLook w:firstColumn="1" w:firstRow="1" w:lastColumn="0" w:lastRow="0" w:noHBand="0" w:noVBand="1" w:val="04A0"/>
+      </w:tblPr>
+      <w:tblGrid>
+        <w:gridCol w:w="2160"/>
+        <w:gridCol w:w="2160"/>
+        <w:gridCol w:w="2160"/>
+        <w:gridCol w:w="2160"/>
+      </w:tblGrid>
+      <w:tr>
+        <w:tc>
+          <w:tcPr>
+            <w:tcW w:type="dxa" w:w="2160"/>
+          </w:tcPr>
+          <w:p>
+            <w:r>
+              <w:t>Comparison</w:t>
+            </w:r>
+          </w:p>
+        </w:tc>
+        <w:tc>
+          <w:tcPr>
+            <w:tcW w:type="dxa" w:w="2160"/>
+          </w:tcPr>
+          <w:p>
+            <w:r>
+              <w:t>Hard-wired Lookup</w:t>
+            </w:r>
+          </w:p>
+        </w:tc>
+        <w:tc>
+          <w:tcPr>
+            <w:tcW w:type="dxa" w:w="2160"/>
+          </w:tcPr>
+          <w:p>
+            <w:r>
+              <w:t>Successful</w:t>
+            </w:r>
+          </w:p>
+        </w:tc>
+        <w:tc>
+          <w:tcPr>
+            <w:tcW w:type="dxa" w:w="2160"/>
+          </w:tcPr>
+          <w:p>
+            <w:r>
+              <w:t>Unsuccessful</w:t>
+            </w:r>
+          </w:p>
+        </w:tc>
+      </w:tr>
+      <w:tr>
+        <w:tc>
+          <w:tcPr>
+            <w:tcW w:type="dxa" w:w="2160"/>
+          </w:tcPr>
+          <w:p>
+            <w:r>
+              <w:t>Hard-wired Lookup</w:t>
+            </w:r>
+          </w:p>
+        </w:tc>
+        <w:tc>
+          <w:tcPr>
+            <w:tcW w:type="dxa" w:w="2160"/>
+          </w:tcPr>
+          <w:p>
+            <w:r>
+              <w:t>1.0000</w:t>
+            </w:r>
+          </w:p>
+        </w:tc>
+        <w:tc>
+          <w:tcPr>
+            <w:tcW w:type="dxa" w:w="2160"/>
+          </w:tcPr>
+          <w:p>
+            <w:r>
+              <w:t>0.0000</w:t>
+            </w:r>
+          </w:p>
+        </w:tc>
+        <w:tc>
+          <w:tcPr>
+            <w:tcW w:type="dxa" w:w="2160"/>
+          </w:tcPr>
+          <w:p>
+            <w:r>
+              <w:t>0.0010</w:t>
+            </w:r>
+          </w:p>
+        </w:tc>
+      </w:tr>
+      <w:tr>
+        <w:tc>
+          <w:tcPr>
+            <w:tcW w:type="dxa" w:w="2160"/>
+          </w:tcPr>
+          <w:p>
+            <w:r>
+              <w:t>Successful</w:t>
+            </w:r>
+          </w:p>
+        </w:tc>
+        <w:tc>
+          <w:tcPr>
+            <w:tcW w:type="dxa" w:w="2160"/>
+          </w:tcPr>
+          <w:p>
+            <w:r>
+              <w:t>0.0000</w:t>
+            </w:r>
+          </w:p>
+        </w:tc>
+        <w:tc>
+          <w:tcPr>
+            <w:tcW w:type="dxa" w:w="2160"/>
+          </w:tcPr>
+          <w:p>
+            <w:r>
+              <w:t>1.0000</w:t>
+            </w:r>
+          </w:p>
+        </w:tc>
+        <w:tc>
+          <w:tcPr>
+            <w:tcW w:type="dxa" w:w="2160"/>
+          </w:tcPr>
+          <w:p>
+            <w:r>
+              <w:t>0.0000</w:t>
+            </w:r>
+          </w:p>
+        </w:tc>
+      </w:tr>
+      <w:tr>
+        <w:tc>
+          <w:tcPr>
+            <w:tcW w:type="dxa" w:w="2160"/>
+          </w:tcPr>
+          <w:p>
+            <w:r>
+              <w:t>Unsuccessful</w:t>
+            </w:r>
+          </w:p>
+        </w:tc>
+        <w:tc>
+          <w:tcPr>
+            <w:tcW w:type="dxa" w:w="2160"/>
+          </w:tcPr>
+          <w:p>
+            <w:r>
+              <w:t>0.0010</w:t>
+            </w:r>
+          </w:p>
+        </w:tc>
+        <w:tc>
+          <w:tcPr>
+            <w:tcW w:type="dxa" w:w="2160"/>
+          </w:tcPr>
+          <w:p>
+            <w:r>
+              <w:t>0.0000</w:t>
+            </w:r>
+          </w:p>
+        </w:tc>
+        <w:tc>
+          <w:tcPr>
+            <w:tcW w:type="dxa" w:w="2160"/>
+          </w:tcPr>
+          <w:p>
+            <w:r>
+              <w:t>1.0000</w:t>
+            </w:r>
+          </w:p>
+        </w:tc>
+      </w:tr>
+    </w:tbl>
     <w:p>
       <w:pPr/>
       <w:r>
@@ -3977,7 +5297,7 @@
         <w:pStyle w:val="Heading3"/>
       </w:pPr>
       <w:r>
-        <w:t>Differences between successful and unsuccessful random variants (Mann-Whitney U):</w:t>
+        <w:t>Differences between successful, unsuccessful, and benchmark variants (Kruskal-Wallis):</w:t>
       </w:r>
     </w:p>
     <w:tbl>
@@ -4019,7 +5339,7 @@
           </w:tcPr>
           <w:p>
             <w:r>
-              <w:t>U-statistic</w:t>
+              <w:t>H-statistic</w:t>
             </w:r>
           </w:p>
         </w:tc>
@@ -4029,7 +5349,7 @@
           </w:tcPr>
           <w:p>
             <w:r>
-              <w:t>764851.5000</w:t>
+              <w:t>871.4791</w:t>
             </w:r>
           </w:p>
         </w:tc>
@@ -4051,13 +5371,202 @@
           </w:tcPr>
           <w:p>
             <w:r>
-              <w:t>3.3969e-191</w:t>
+              <w:t>5.7638e-190</w:t>
             </w:r>
           </w:p>
         </w:tc>
       </w:tr>
     </w:tbl>
     <w:p/>
+    <w:p>
+      <w:pPr>
+        <w:pStyle w:val="Heading3"/>
+      </w:pPr>
+      <w:r>
+        <w:t>Dunn's Post-hoc Test Results (pairwise comparisons, Bonferroni-adjusted):</w:t>
+      </w:r>
+    </w:p>
+    <w:tbl>
+      <w:tblPr>
+        <w:tblStyle w:val="LightGrid-Accent1"/>
+        <w:tblW w:type="auto" w:w="0"/>
+        <w:tblLook w:firstColumn="1" w:firstRow="1" w:lastColumn="0" w:lastRow="0" w:noHBand="0" w:noVBand="1" w:val="04A0"/>
+      </w:tblPr>
+      <w:tblGrid>
+        <w:gridCol w:w="2160"/>
+        <w:gridCol w:w="2160"/>
+        <w:gridCol w:w="2160"/>
+        <w:gridCol w:w="2160"/>
+      </w:tblGrid>
+      <w:tr>
+        <w:tc>
+          <w:tcPr>
+            <w:tcW w:type="dxa" w:w="2160"/>
+          </w:tcPr>
+          <w:p>
+            <w:r>
+              <w:t>Comparison</w:t>
+            </w:r>
+          </w:p>
+        </w:tc>
+        <w:tc>
+          <w:tcPr>
+            <w:tcW w:type="dxa" w:w="2160"/>
+          </w:tcPr>
+          <w:p>
+            <w:r>
+              <w:t>Hard-wired Lookup</w:t>
+            </w:r>
+          </w:p>
+        </w:tc>
+        <w:tc>
+          <w:tcPr>
+            <w:tcW w:type="dxa" w:w="2160"/>
+          </w:tcPr>
+          <w:p>
+            <w:r>
+              <w:t>Successful</w:t>
+            </w:r>
+          </w:p>
+        </w:tc>
+        <w:tc>
+          <w:tcPr>
+            <w:tcW w:type="dxa" w:w="2160"/>
+          </w:tcPr>
+          <w:p>
+            <w:r>
+              <w:t>Unsuccessful</w:t>
+            </w:r>
+          </w:p>
+        </w:tc>
+      </w:tr>
+      <w:tr>
+        <w:tc>
+          <w:tcPr>
+            <w:tcW w:type="dxa" w:w="2160"/>
+          </w:tcPr>
+          <w:p>
+            <w:r>
+              <w:t>Hard-wired Lookup</w:t>
+            </w:r>
+          </w:p>
+        </w:tc>
+        <w:tc>
+          <w:tcPr>
+            <w:tcW w:type="dxa" w:w="2160"/>
+          </w:tcPr>
+          <w:p>
+            <w:r>
+              <w:t>1.0000</w:t>
+            </w:r>
+          </w:p>
+        </w:tc>
+        <w:tc>
+          <w:tcPr>
+            <w:tcW w:type="dxa" w:w="2160"/>
+          </w:tcPr>
+          <w:p>
+            <w:r>
+              <w:t>0.0000</w:t>
+            </w:r>
+          </w:p>
+        </w:tc>
+        <w:tc>
+          <w:tcPr>
+            <w:tcW w:type="dxa" w:w="2160"/>
+          </w:tcPr>
+          <w:p>
+            <w:r>
+              <w:t>0.3675</w:t>
+            </w:r>
+          </w:p>
+        </w:tc>
+      </w:tr>
+      <w:tr>
+        <w:tc>
+          <w:tcPr>
+            <w:tcW w:type="dxa" w:w="2160"/>
+          </w:tcPr>
+          <w:p>
+            <w:r>
+              <w:t>Successful</w:t>
+            </w:r>
+          </w:p>
+        </w:tc>
+        <w:tc>
+          <w:tcPr>
+            <w:tcW w:type="dxa" w:w="2160"/>
+          </w:tcPr>
+          <w:p>
+            <w:r>
+              <w:t>0.0000</w:t>
+            </w:r>
+          </w:p>
+        </w:tc>
+        <w:tc>
+          <w:tcPr>
+            <w:tcW w:type="dxa" w:w="2160"/>
+          </w:tcPr>
+          <w:p>
+            <w:r>
+              <w:t>1.0000</w:t>
+            </w:r>
+          </w:p>
+        </w:tc>
+        <w:tc>
+          <w:tcPr>
+            <w:tcW w:type="dxa" w:w="2160"/>
+          </w:tcPr>
+          <w:p>
+            <w:r>
+              <w:t>0.0000</w:t>
+            </w:r>
+          </w:p>
+        </w:tc>
+      </w:tr>
+      <w:tr>
+        <w:tc>
+          <w:tcPr>
+            <w:tcW w:type="dxa" w:w="2160"/>
+          </w:tcPr>
+          <w:p>
+            <w:r>
+              <w:t>Unsuccessful</w:t>
+            </w:r>
+          </w:p>
+        </w:tc>
+        <w:tc>
+          <w:tcPr>
+            <w:tcW w:type="dxa" w:w="2160"/>
+          </w:tcPr>
+          <w:p>
+            <w:r>
+              <w:t>0.3675</w:t>
+            </w:r>
+          </w:p>
+        </w:tc>
+        <w:tc>
+          <w:tcPr>
+            <w:tcW w:type="dxa" w:w="2160"/>
+          </w:tcPr>
+          <w:p>
+            <w:r>
+              <w:t>0.0000</w:t>
+            </w:r>
+          </w:p>
+        </w:tc>
+        <w:tc>
+          <w:tcPr>
+            <w:tcW w:type="dxa" w:w="2160"/>
+          </w:tcPr>
+          <w:p>
+            <w:r>
+              <w:t>1.0000</w:t>
+            </w:r>
+          </w:p>
+        </w:tc>
+      </w:tr>
+    </w:tbl>
     <w:p>
       <w:pPr/>
       <w:r>

</xml_diff>